<commit_message>
Finalize thesis: 64 pages, equations as monospace, dropped Appendix C/D, trimmed Ch 12+13
- Equations rendered as left-aligned Consolas 10pt (no italic centering)
- Dropped Appendix C (Additional Plots, duplicates of chapter figures)
- Dropped Appendix D (Extended Tables, duplicates of chapter tables)
- Renamed Appendix E -> C (Open Source Resources, Website, Live Simulator)
- Trimmed Ch 12 Discussion: 4 sections -> 2
- Trimmed Ch 13 Conclusion: 6 sections -> 4
- Trimmed Ch 4 Classical AI/ML: 5 sections -> 1
- Dropped Ch 11.2 Pareto Frontier subsection (covered in 11.3)
- Trimmed References: 50 -> 33 entries

Final: 64 pages, 1.6 MB PDF, all 11 figures embedded.
</commit_message>
<xml_diff>
--- a/thesis/Thesis_Nirmit_Dagli_HERO.docx
+++ b/thesis/Thesis_Nirmit_Dagli_HERO.docx
@@ -2319,15 +2319,15 @@
     </w:p>
     <w:p>
       <w:pPr>
-        <w:spacing w:before="120" w:after="200" w:line="240" w:lineRule="auto"/>
-        <w:jc w:val="center"/>
-      </w:pPr>
-      <w:r>
-        <w:rPr>
-          <w:rFonts w:ascii="Times New Roman" w:hAnsi="Times New Roman" w:cs="Times New Roman" w:eastAsia="Times New Roman"/>
-          <w:b w:val="0"/>
-          <w:i/>
-          <w:sz w:val="24"/>
+        <w:spacing w:before="0" w:after="0" w:line="240" w:lineRule="auto"/>
+        <w:ind w:left="340"/>
+      </w:pPr>
+      <w:r>
+        <w:rPr>
+          <w:rFonts w:ascii="Consolas" w:hAnsi="Consolas" w:cs="Consolas" w:eastAsia="Consolas"/>
+          <w:b w:val="0"/>
+          <w:i w:val="0"/>
+          <w:sz w:val="20"/>
         </w:rPr>
         <w:t>Given a quantum-AI workload of type T and size n, on which cloud tier (CPU, GPU, or QPU) should it be executed in order to optimise the joint objective of accuracy, latency, energy, and cost, subject to user-supplied weights?</w:t>
       </w:r>
@@ -2821,15 +2821,15 @@
     </w:p>
     <w:p>
       <w:pPr>
-        <w:spacing w:before="120" w:after="200" w:line="240" w:lineRule="auto"/>
-        <w:jc w:val="center"/>
-      </w:pPr>
-      <w:r>
-        <w:rPr>
-          <w:rFonts w:ascii="Times New Roman" w:hAnsi="Times New Roman" w:cs="Times New Roman" w:eastAsia="Times New Roman"/>
-          <w:b w:val="0"/>
-          <w:i/>
-          <w:sz w:val="24"/>
+        <w:spacing w:before="0" w:after="0" w:line="240" w:lineRule="auto"/>
+        <w:ind w:left="340"/>
+      </w:pPr>
+      <w:r>
+        <w:rPr>
+          <w:rFonts w:ascii="Consolas" w:hAnsi="Consolas" w:cs="Consolas" w:eastAsia="Consolas"/>
+          <w:b w:val="0"/>
+          <w:i w:val="0"/>
+          <w:sz w:val="20"/>
         </w:rPr>
         <w:t>|psi&gt; = alpha |0&gt; + beta |1&gt;,   with   |alpha|^2 + |beta|^2 = 1.</w:t>
       </w:r>
@@ -2864,15 +2864,15 @@
     </w:p>
     <w:p>
       <w:pPr>
-        <w:spacing w:before="120" w:after="200" w:line="240" w:lineRule="auto"/>
-        <w:jc w:val="center"/>
-      </w:pPr>
-      <w:r>
-        <w:rPr>
-          <w:rFonts w:ascii="Times New Roman" w:hAnsi="Times New Roman" w:cs="Times New Roman" w:eastAsia="Times New Roman"/>
-          <w:b w:val="0"/>
-          <w:i/>
-          <w:sz w:val="24"/>
+        <w:spacing w:before="0" w:after="0" w:line="240" w:lineRule="auto"/>
+        <w:ind w:left="340"/>
+      </w:pPr>
+      <w:r>
+        <w:rPr>
+          <w:rFonts w:ascii="Consolas" w:hAnsi="Consolas" w:cs="Consolas" w:eastAsia="Consolas"/>
+          <w:b w:val="0"/>
+          <w:i w:val="0"/>
+          <w:sz w:val="20"/>
         </w:rPr>
         <w:t>|psi&gt; = cos(theta/2) |0&gt; + e^{i phi} sin(theta/2) |1&gt;,</w:t>
       </w:r>
@@ -2939,15 +2939,15 @@
     </w:p>
     <w:p>
       <w:pPr>
-        <w:spacing w:before="120" w:after="200" w:line="240" w:lineRule="auto"/>
-        <w:jc w:val="center"/>
-      </w:pPr>
-      <w:r>
-        <w:rPr>
-          <w:rFonts w:ascii="Times New Roman" w:hAnsi="Times New Roman" w:cs="Times New Roman" w:eastAsia="Times New Roman"/>
-          <w:b w:val="0"/>
-          <w:i/>
-          <w:sz w:val="24"/>
+        <w:spacing w:before="0" w:after="0" w:line="240" w:lineRule="auto"/>
+        <w:ind w:left="340"/>
+      </w:pPr>
+      <w:r>
+        <w:rPr>
+          <w:rFonts w:ascii="Consolas" w:hAnsi="Consolas" w:cs="Consolas" w:eastAsia="Consolas"/>
+          <w:b w:val="0"/>
+          <w:i w:val="0"/>
+          <w:sz w:val="20"/>
         </w:rPr>
         <w:t>|Psi_AB&gt; = |psi_A&gt; tensor |psi_B&gt;,</w:t>
       </w:r>
@@ -2968,15 +2968,15 @@
     </w:p>
     <w:p>
       <w:pPr>
-        <w:spacing w:before="120" w:after="200" w:line="240" w:lineRule="auto"/>
-        <w:jc w:val="center"/>
-      </w:pPr>
-      <w:r>
-        <w:rPr>
-          <w:rFonts w:ascii="Times New Roman" w:hAnsi="Times New Roman" w:cs="Times New Roman" w:eastAsia="Times New Roman"/>
-          <w:b w:val="0"/>
-          <w:i/>
-          <w:sz w:val="24"/>
+        <w:spacing w:before="0" w:after="0" w:line="240" w:lineRule="auto"/>
+        <w:ind w:left="340"/>
+      </w:pPr>
+      <w:r>
+        <w:rPr>
+          <w:rFonts w:ascii="Consolas" w:hAnsi="Consolas" w:cs="Consolas" w:eastAsia="Consolas"/>
+          <w:b w:val="0"/>
+          <w:i w:val="0"/>
+          <w:sz w:val="20"/>
         </w:rPr>
         <w:t>|Psi&gt; = sum_{x in {0,1}^n} alpha_x |x&gt;,   sum_x |alpha_x|^2 = 1.</w:t>
       </w:r>
@@ -3011,15 +3011,15 @@
     </w:p>
     <w:p>
       <w:pPr>
-        <w:spacing w:before="120" w:after="200" w:line="240" w:lineRule="auto"/>
-        <w:jc w:val="center"/>
-      </w:pPr>
-      <w:r>
-        <w:rPr>
-          <w:rFonts w:ascii="Times New Roman" w:hAnsi="Times New Roman" w:cs="Times New Roman" w:eastAsia="Times New Roman"/>
-          <w:b w:val="0"/>
-          <w:i/>
-          <w:sz w:val="24"/>
+        <w:spacing w:before="0" w:after="0" w:line="240" w:lineRule="auto"/>
+        <w:ind w:left="340"/>
+      </w:pPr>
+      <w:r>
+        <w:rPr>
+          <w:rFonts w:ascii="Consolas" w:hAnsi="Consolas" w:cs="Consolas" w:eastAsia="Consolas"/>
+          <w:b w:val="0"/>
+          <w:i w:val="0"/>
+          <w:sz w:val="20"/>
         </w:rPr>
         <w:t>|Phi+&gt; = (1/sqrt(2)) (|00&gt; + |11&gt;),</w:t>
       </w:r>
@@ -3084,30 +3084,30 @@
     </w:p>
     <w:p>
       <w:pPr>
-        <w:spacing w:before="120" w:after="200" w:line="240" w:lineRule="auto"/>
-        <w:jc w:val="center"/>
-      </w:pPr>
-      <w:r>
-        <w:rPr>
-          <w:rFonts w:ascii="Times New Roman" w:hAnsi="Times New Roman" w:cs="Times New Roman" w:eastAsia="Times New Roman"/>
-          <w:b w:val="0"/>
-          <w:i/>
-          <w:sz w:val="24"/>
+        <w:spacing w:before="0" w:after="0" w:line="240" w:lineRule="auto"/>
+        <w:ind w:left="340"/>
+      </w:pPr>
+      <w:r>
+        <w:rPr>
+          <w:rFonts w:ascii="Consolas" w:hAnsi="Consolas" w:cs="Consolas" w:eastAsia="Consolas"/>
+          <w:b w:val="0"/>
+          <w:i w:val="0"/>
+          <w:sz w:val="20"/>
         </w:rPr>
         <w:t>I = [[1, 0], [0, 1]],     X = [[0, 1], [1, 0]],</w:t>
       </w:r>
     </w:p>
     <w:p>
       <w:pPr>
-        <w:spacing w:before="120" w:after="200" w:line="240" w:lineRule="auto"/>
-        <w:jc w:val="center"/>
-      </w:pPr>
-      <w:r>
-        <w:rPr>
-          <w:rFonts w:ascii="Times New Roman" w:hAnsi="Times New Roman" w:cs="Times New Roman" w:eastAsia="Times New Roman"/>
-          <w:b w:val="0"/>
-          <w:i/>
-          <w:sz w:val="24"/>
+        <w:spacing w:before="0" w:after="0" w:line="240" w:lineRule="auto"/>
+        <w:ind w:left="340"/>
+      </w:pPr>
+      <w:r>
+        <w:rPr>
+          <w:rFonts w:ascii="Consolas" w:hAnsi="Consolas" w:cs="Consolas" w:eastAsia="Consolas"/>
+          <w:b w:val="0"/>
+          <w:i w:val="0"/>
+          <w:sz w:val="20"/>
         </w:rPr>
         <w:t>Y = [[0, -i], [i, 0]],     Z = [[1, 0], [0, -1]].</w:t>
       </w:r>
@@ -3142,15 +3142,15 @@
     </w:p>
     <w:p>
       <w:pPr>
-        <w:spacing w:before="120" w:after="200" w:line="240" w:lineRule="auto"/>
-        <w:jc w:val="center"/>
-      </w:pPr>
-      <w:r>
-        <w:rPr>
-          <w:rFonts w:ascii="Times New Roman" w:hAnsi="Times New Roman" w:cs="Times New Roman" w:eastAsia="Times New Roman"/>
-          <w:b w:val="0"/>
-          <w:i/>
-          <w:sz w:val="24"/>
+        <w:spacing w:before="0" w:after="0" w:line="240" w:lineRule="auto"/>
+        <w:ind w:left="340"/>
+      </w:pPr>
+      <w:r>
+        <w:rPr>
+          <w:rFonts w:ascii="Consolas" w:hAnsi="Consolas" w:cs="Consolas" w:eastAsia="Consolas"/>
+          <w:b w:val="0"/>
+          <w:i w:val="0"/>
+          <w:sz w:val="20"/>
         </w:rPr>
         <w:t>H = (1/sqrt(2)) [[1, 1], [1, -1]],</w:t>
       </w:r>
@@ -3185,15 +3185,15 @@
     </w:p>
     <w:p>
       <w:pPr>
-        <w:spacing w:before="120" w:after="200" w:line="240" w:lineRule="auto"/>
-        <w:jc w:val="center"/>
-      </w:pPr>
-      <w:r>
-        <w:rPr>
-          <w:rFonts w:ascii="Times New Roman" w:hAnsi="Times New Roman" w:cs="Times New Roman" w:eastAsia="Times New Roman"/>
-          <w:b w:val="0"/>
-          <w:i/>
-          <w:sz w:val="24"/>
+        <w:spacing w:before="0" w:after="0" w:line="240" w:lineRule="auto"/>
+        <w:ind w:left="340"/>
+      </w:pPr>
+      <w:r>
+        <w:rPr>
+          <w:rFonts w:ascii="Consolas" w:hAnsi="Consolas" w:cs="Consolas" w:eastAsia="Consolas"/>
+          <w:b w:val="0"/>
+          <w:i w:val="0"/>
+          <w:sz w:val="20"/>
         </w:rPr>
         <w:t>RX(theta) = exp(-i theta X / 2),   RY(theta) = exp(-i theta Y / 2),   RZ(theta) = exp(-i theta Z / 2).</w:t>
       </w:r>
@@ -3228,15 +3228,15 @@
     </w:p>
     <w:p>
       <w:pPr>
-        <w:spacing w:before="120" w:after="200" w:line="240" w:lineRule="auto"/>
-        <w:jc w:val="center"/>
-      </w:pPr>
-      <w:r>
-        <w:rPr>
-          <w:rFonts w:ascii="Times New Roman" w:hAnsi="Times New Roman" w:cs="Times New Roman" w:eastAsia="Times New Roman"/>
-          <w:b w:val="0"/>
-          <w:i/>
-          <w:sz w:val="24"/>
+        <w:spacing w:before="0" w:after="0" w:line="240" w:lineRule="auto"/>
+        <w:ind w:left="340"/>
+      </w:pPr>
+      <w:r>
+        <w:rPr>
+          <w:rFonts w:ascii="Consolas" w:hAnsi="Consolas" w:cs="Consolas" w:eastAsia="Consolas"/>
+          <w:b w:val="0"/>
+          <w:i w:val="0"/>
+          <w:sz w:val="20"/>
         </w:rPr>
         <w:t>CNOT = [[1,0,0,0], [0,1,0,0], [0,0,0,1], [0,0,1,0]]</w:t>
       </w:r>
@@ -3315,15 +3315,15 @@
     </w:p>
     <w:p>
       <w:pPr>
-        <w:spacing w:before="120" w:after="200" w:line="240" w:lineRule="auto"/>
-        <w:jc w:val="center"/>
-      </w:pPr>
-      <w:r>
-        <w:rPr>
-          <w:rFonts w:ascii="Times New Roman" w:hAnsi="Times New Roman" w:cs="Times New Roman" w:eastAsia="Times New Roman"/>
-          <w:b w:val="0"/>
-          <w:i/>
-          <w:sz w:val="24"/>
+        <w:spacing w:before="0" w:after="0" w:line="240" w:lineRule="auto"/>
+        <w:ind w:left="340"/>
+      </w:pPr>
+      <w:r>
+        <w:rPr>
+          <w:rFonts w:ascii="Consolas" w:hAnsi="Consolas" w:cs="Consolas" w:eastAsia="Consolas"/>
+          <w:b w:val="0"/>
+          <w:i w:val="0"/>
+          <w:sz w:val="20"/>
         </w:rPr>
         <w:t>|0&gt; --[ H ]--*------     (qubit 0)</w:t>
         <w:br/>
@@ -3406,15 +3406,15 @@
     </w:p>
     <w:p>
       <w:pPr>
-        <w:spacing w:before="120" w:after="200" w:line="240" w:lineRule="auto"/>
-        <w:jc w:val="center"/>
-      </w:pPr>
-      <w:r>
-        <w:rPr>
-          <w:rFonts w:ascii="Times New Roman" w:hAnsi="Times New Roman" w:cs="Times New Roman" w:eastAsia="Times New Roman"/>
-          <w:b w:val="0"/>
-          <w:i/>
-          <w:sz w:val="24"/>
+        <w:spacing w:before="0" w:after="0" w:line="240" w:lineRule="auto"/>
+        <w:ind w:left="340"/>
+      </w:pPr>
+      <w:r>
+        <w:rPr>
+          <w:rFonts w:ascii="Consolas" w:hAnsi="Consolas" w:cs="Consolas" w:eastAsia="Consolas"/>
+          <w:b w:val="0"/>
+          <w:i w:val="0"/>
+          <w:sz w:val="20"/>
         </w:rPr>
         <w:t>P(x) = |&lt;x | psi&gt;|^2.</w:t>
       </w:r>
@@ -3717,15 +3717,15 @@
     </w:p>
     <w:p>
       <w:pPr>
-        <w:spacing w:before="120" w:after="200" w:line="240" w:lineRule="auto"/>
-        <w:jc w:val="center"/>
-      </w:pPr>
-      <w:r>
-        <w:rPr>
-          <w:rFonts w:ascii="Times New Roman" w:hAnsi="Times New Roman" w:cs="Times New Roman" w:eastAsia="Times New Roman"/>
-          <w:b w:val="0"/>
-          <w:i/>
-          <w:sz w:val="24"/>
+        <w:spacing w:before="0" w:after="0" w:line="240" w:lineRule="auto"/>
+        <w:ind w:left="340"/>
+      </w:pPr>
+      <w:r>
+        <w:rPr>
+          <w:rFonts w:ascii="Consolas" w:hAnsi="Consolas" w:cs="Consolas" w:eastAsia="Consolas"/>
+          <w:b w:val="0"/>
+          <w:i w:val="0"/>
+          <w:sz w:val="20"/>
         </w:rPr>
         <w:t>U_f |x&gt; = (-1)^{f(x)} |x&gt;,</w:t>
       </w:r>
@@ -3746,15 +3746,15 @@
     </w:p>
     <w:p>
       <w:pPr>
-        <w:spacing w:before="120" w:after="200" w:line="240" w:lineRule="auto"/>
-        <w:jc w:val="center"/>
-      </w:pPr>
-      <w:r>
-        <w:rPr>
-          <w:rFonts w:ascii="Times New Roman" w:hAnsi="Times New Roman" w:cs="Times New Roman" w:eastAsia="Times New Roman"/>
-          <w:b w:val="0"/>
-          <w:i/>
-          <w:sz w:val="24"/>
+        <w:spacing w:before="0" w:after="0" w:line="240" w:lineRule="auto"/>
+        <w:ind w:left="340"/>
+      </w:pPr>
+      <w:r>
+        <w:rPr>
+          <w:rFonts w:ascii="Consolas" w:hAnsi="Consolas" w:cs="Consolas" w:eastAsia="Consolas"/>
+          <w:b w:val="0"/>
+          <w:i w:val="0"/>
+          <w:sz w:val="20"/>
         </w:rPr>
         <w:t>D = 2 |s&gt;&lt;s| - I.</w:t>
       </w:r>
@@ -3879,15 +3879,15 @@
     </w:p>
     <w:p>
       <w:pPr>
-        <w:spacing w:before="120" w:after="200" w:line="240" w:lineRule="auto"/>
-        <w:jc w:val="center"/>
-      </w:pPr>
-      <w:r>
-        <w:rPr>
-          <w:rFonts w:ascii="Times New Roman" w:hAnsi="Times New Roman" w:cs="Times New Roman" w:eastAsia="Times New Roman"/>
-          <w:b w:val="0"/>
-          <w:i/>
-          <w:sz w:val="24"/>
+        <w:spacing w:before="0" w:after="0" w:line="240" w:lineRule="auto"/>
+        <w:ind w:left="340"/>
+      </w:pPr>
+      <w:r>
+        <w:rPr>
+          <w:rFonts w:ascii="Consolas" w:hAnsi="Consolas" w:cs="Consolas" w:eastAsia="Consolas"/>
+          <w:b w:val="0"/>
+          <w:i w:val="0"/>
+          <w:sz w:val="20"/>
         </w:rPr>
         <w:t>H_C = sum_{(i,j) in E} (1/2) (I - Z_i Z_j),</w:t>
       </w:r>
@@ -3908,15 +3908,15 @@
     </w:p>
     <w:p>
       <w:pPr>
-        <w:spacing w:before="120" w:after="200" w:line="240" w:lineRule="auto"/>
-        <w:jc w:val="center"/>
-      </w:pPr>
-      <w:r>
-        <w:rPr>
-          <w:rFonts w:ascii="Times New Roman" w:hAnsi="Times New Roman" w:cs="Times New Roman" w:eastAsia="Times New Roman"/>
-          <w:b w:val="0"/>
-          <w:i/>
-          <w:sz w:val="24"/>
+        <w:spacing w:before="0" w:after="0" w:line="240" w:lineRule="auto"/>
+        <w:ind w:left="340"/>
+      </w:pPr>
+      <w:r>
+        <w:rPr>
+          <w:rFonts w:ascii="Consolas" w:hAnsi="Consolas" w:cs="Consolas" w:eastAsia="Consolas"/>
+          <w:b w:val="0"/>
+          <w:i w:val="0"/>
+          <w:sz w:val="20"/>
         </w:rPr>
         <w:t>H_M = sum_i X_i,</w:t>
       </w:r>
@@ -3967,15 +3967,15 @@
     </w:p>
     <w:p>
       <w:pPr>
-        <w:spacing w:before="120" w:after="200" w:line="240" w:lineRule="auto"/>
-        <w:jc w:val="center"/>
-      </w:pPr>
-      <w:r>
-        <w:rPr>
-          <w:rFonts w:ascii="Times New Roman" w:hAnsi="Times New Roman" w:cs="Times New Roman" w:eastAsia="Times New Roman"/>
-          <w:b w:val="0"/>
-          <w:i/>
-          <w:sz w:val="24"/>
+        <w:spacing w:before="0" w:after="0" w:line="240" w:lineRule="auto"/>
+        <w:ind w:left="340"/>
+      </w:pPr>
+      <w:r>
+        <w:rPr>
+          <w:rFonts w:ascii="Consolas" w:hAnsi="Consolas" w:cs="Consolas" w:eastAsia="Consolas"/>
+          <w:b w:val="0"/>
+          <w:i w:val="0"/>
+          <w:sz w:val="20"/>
         </w:rPr>
         <w:t>|psi(beta, gamma)&gt; = U_M(beta_p) U_C(gamma_p) ... U_M(beta_1) U_C(gamma_1) |s&gt;,</w:t>
       </w:r>
@@ -4146,15 +4146,15 @@
     </w:p>
     <w:p>
       <w:pPr>
-        <w:spacing w:before="120" w:after="200" w:line="240" w:lineRule="auto"/>
-        <w:jc w:val="center"/>
-      </w:pPr>
-      <w:r>
-        <w:rPr>
-          <w:rFonts w:ascii="Times New Roman" w:hAnsi="Times New Roman" w:cs="Times New Roman" w:eastAsia="Times New Roman"/>
-          <w:b w:val="0"/>
-          <w:i/>
-          <w:sz w:val="24"/>
+        <w:spacing w:before="0" w:after="0" w:line="240" w:lineRule="auto"/>
+        <w:ind w:left="340"/>
+      </w:pPr>
+      <w:r>
+        <w:rPr>
+          <w:rFonts w:ascii="Consolas" w:hAnsi="Consolas" w:cs="Consolas" w:eastAsia="Consolas"/>
+          <w:b w:val="0"/>
+          <w:i w:val="0"/>
+          <w:sz w:val="20"/>
         </w:rPr>
         <w:t>K(x, x') = | &lt;phi(x) | phi(x')&gt; |^2.</w:t>
       </w:r>
@@ -4246,7 +4246,7 @@
           <w:i w:val="0"/>
           <w:sz w:val="24"/>
         </w:rPr>
-        <w:t>Liu, Arunachalam and Temme [36] proved in 2021 that for a constructed family of data distributions related to the discrete-logarithm problem, no classical algorithm can match the quantum-kernel classifier in polynomial time under standard cryptographic assumptions. The result is a genuine separation but on a constructed dataset; on natural data the question of advantage remains empirical.</w:t>
+        <w:t>Liu, Arunachalam and Temme proved in 2021 that for a constructed family of data distributions related to the discrete-logarithm problem, no classical algorithm can match the quantum-kernel classifier in polynomial time under standard cryptographic assumptions. The result is a genuine separation but on a constructed dataset; on natural data the question of advantage remains empirical.</w:t>
       </w:r>
     </w:p>
     <w:p>
@@ -4325,15 +4325,15 @@
     </w:p>
     <w:p>
       <w:pPr>
-        <w:spacing w:before="120" w:after="200" w:line="240" w:lineRule="auto"/>
-        <w:jc w:val="center"/>
-      </w:pPr>
-      <w:r>
-        <w:rPr>
-          <w:rFonts w:ascii="Times New Roman" w:hAnsi="Times New Roman" w:cs="Times New Roman" w:eastAsia="Times New Roman"/>
-          <w:b w:val="0"/>
-          <w:i/>
-          <w:sz w:val="24"/>
+        <w:spacing w:before="0" w:after="0" w:line="240" w:lineRule="auto"/>
+        <w:ind w:left="340"/>
+      </w:pPr>
+      <w:r>
+        <w:rPr>
+          <w:rFonts w:ascii="Consolas" w:hAnsi="Consolas" w:cs="Consolas" w:eastAsia="Consolas"/>
+          <w:b w:val="0"/>
+          <w:i w:val="0"/>
+          <w:sz w:val="20"/>
         </w:rPr>
         <w:t>&lt;psi | H | psi&gt; &gt;= E_0,</w:t>
       </w:r>
@@ -4636,7 +4636,7 @@
           <w:color w:val="141E33"/>
           <w:sz w:val="24"/>
         </w:rPr>
-        <w:t>4.1 Support Vector Machines and Kernel Methods</w:t>
+        <w:t>4.4 Evaluation Metrics: Accuracy, Precision, Recall, F1</w:t>
       </w:r>
     </w:p>
     <w:p>
@@ -4650,230 +4650,7 @@
           <w:i w:val="0"/>
           <w:sz w:val="24"/>
         </w:rPr>
-        <w:t>The classical SVM (Cortes and Vapnik 1995) is a maximum-margin classifier and the natural classical comparator for the quantum SVM of Section 3.3 -- the two differ only in how the kernel is computed. The kernel trick replaces the explicit inner product &lt;x_i, x_j&gt; by any positive-semidefinite K(x_i, x_j) = &lt;phi(x_i), phi(x_j)&gt;, implicitly mapping data into a (possibly infinite-dimensional) feature space. The dominant classical kernel is the Radial Basis Function,</w:t>
-      </w:r>
-    </w:p>
-    <w:p>
-      <w:pPr>
-        <w:spacing w:before="120" w:after="200" w:line="240" w:lineRule="auto"/>
-        <w:jc w:val="center"/>
-      </w:pPr>
-      <w:r>
-        <w:rPr>
-          <w:rFonts w:ascii="Times New Roman" w:hAnsi="Times New Roman" w:cs="Times New Roman" w:eastAsia="Times New Roman"/>
-          <w:b w:val="0"/>
-          <w:i/>
-          <w:sz w:val="24"/>
-        </w:rPr>
-        <w:t>K(x, y) = exp(-gamma ||x - y||^2),</w:t>
-      </w:r>
-    </w:p>
-    <w:p>
-      <w:pPr>
-        <w:spacing w:before="0" w:after="200" w:line="240" w:lineRule="auto"/>
-      </w:pPr>
-      <w:r>
-        <w:rPr>
-          <w:rFonts w:ascii="Times New Roman" w:hAnsi="Times New Roman" w:cs="Times New Roman" w:eastAsia="Times New Roman"/>
-          <w:b w:val="0"/>
-          <w:i w:val="0"/>
-          <w:sz w:val="24"/>
-        </w:rPr>
-        <w:t>which maps into an infinite-dimensional Gaussian feature space. Training cost is O(N^2 d) to fill the kernel matrix plus O(N^2) to O(N^3) to solve, which is efficient on a single core for N up to a few tens of thousands. We use linear and RBF SVMs as primary classical comparators throughout the HERO experiments.</w:t>
-      </w:r>
-    </w:p>
-    <w:p>
-      <w:pPr>
-        <w:pStyle w:val="Heading2"/>
-        <w:spacing w:before="80" w:after="40" w:line="240" w:lineRule="auto"/>
-      </w:pPr>
-      <w:r>
-        <w:rPr>
-          <w:rFonts w:ascii="Times New Roman" w:hAnsi="Times New Roman" w:cs="Times New Roman" w:eastAsia="Times New Roman"/>
-          <w:b/>
-          <w:i w:val="0"/>
-          <w:color w:val="141E33"/>
-          <w:sz w:val="24"/>
-        </w:rPr>
-        <w:t>4.2 Random Forest and Gradient Boosting</w:t>
-      </w:r>
-    </w:p>
-    <w:p>
-      <w:pPr>
-        <w:spacing w:before="0" w:after="200" w:line="240" w:lineRule="auto"/>
-      </w:pPr>
-      <w:r>
-        <w:rPr>
-          <w:rFonts w:ascii="Times New Roman" w:hAnsi="Times New Roman" w:cs="Times New Roman" w:eastAsia="Times New Roman"/>
-          <w:b w:val="0"/>
-          <w:i w:val="0"/>
-          <w:sz w:val="24"/>
-        </w:rPr>
-        <w:t>Tree-ensemble methods are the de facto strongest classical baseline on tabular intrusion-detection data, consistently outperforming SVMs and shallow neural networks on benchmarks such as NSL-KDD, CICIDS-2017, and UNSW-NB15. Two families dominate.</w:t>
-      </w:r>
-    </w:p>
-    <w:p>
-      <w:pPr>
-        <w:pStyle w:val="Heading3"/>
-        <w:spacing w:before="80" w:after="40" w:line="240" w:lineRule="auto"/>
-      </w:pPr>
-      <w:r>
-        <w:rPr>
-          <w:rFonts w:ascii="Times New Roman" w:hAnsi="Times New Roman" w:cs="Times New Roman" w:eastAsia="Times New Roman"/>
-          <w:b/>
-          <w:i w:val="0"/>
-          <w:color w:val="141E33"/>
-          <w:sz w:val="22"/>
-        </w:rPr>
-        <w:t>Random Forest</w:t>
-      </w:r>
-    </w:p>
-    <w:p>
-      <w:pPr>
-        <w:spacing w:before="0" w:after="200" w:line="240" w:lineRule="auto"/>
-      </w:pPr>
-      <w:r>
-        <w:rPr>
-          <w:rFonts w:ascii="Times New Roman" w:hAnsi="Times New Roman" w:cs="Times New Roman" w:eastAsia="Times New Roman"/>
-          <w:b w:val="0"/>
-          <w:i w:val="0"/>
-          <w:sz w:val="24"/>
-        </w:rPr>
-        <w:t>Breiman's Random Forest (2001) [15] is an ensemble of T decision trees that vote on the prediction. Each tree is trained on a bootstrap sample with a random subset of features considered at each split; this double randomisation decorrelates the trees, reduces variance, and is embarrassingly parallel to train. Random forests are insensitive to feature scaling, tolerate missing values, and expose feature-importance scores -- operationally valuable for security analysts.</w:t>
-      </w:r>
-    </w:p>
-    <w:p>
-      <w:pPr>
-        <w:pStyle w:val="Heading3"/>
-        <w:spacing w:before="80" w:after="40" w:line="240" w:lineRule="auto"/>
-      </w:pPr>
-      <w:r>
-        <w:rPr>
-          <w:rFonts w:ascii="Times New Roman" w:hAnsi="Times New Roman" w:cs="Times New Roman" w:eastAsia="Times New Roman"/>
-          <w:b/>
-          <w:i w:val="0"/>
-          <w:color w:val="141E33"/>
-          <w:sz w:val="22"/>
-        </w:rPr>
-        <w:t>Gradient Boosting</w:t>
-      </w:r>
-    </w:p>
-    <w:p>
-      <w:pPr>
-        <w:spacing w:before="0" w:after="200" w:line="240" w:lineRule="auto"/>
-      </w:pPr>
-      <w:r>
-        <w:rPr>
-          <w:rFonts w:ascii="Times New Roman" w:hAnsi="Times New Roman" w:cs="Times New Roman" w:eastAsia="Times New Roman"/>
-          <w:b w:val="0"/>
-          <w:i w:val="0"/>
-          <w:sz w:val="24"/>
-        </w:rPr>
-        <w:t>Gradient Boosting Machines (Friedman 2001) instead fit shallow trees sequentially, each new tree targeting the negative gradient of the loss with respect to the current ensemble's predictions. The result is a stagewise additive model whose dominant hyperparameters are the number of estimators, tree depth, and learning rate. On tabular cybersecurity benchmarks gradient-boosted trees are the methods to beat; HERO uses them as the primary classical baseline alongside random forest and the SVM family.</w:t>
-      </w:r>
-    </w:p>
-    <w:p>
-      <w:pPr>
-        <w:pStyle w:val="Heading2"/>
-        <w:spacing w:before="80" w:after="40" w:line="240" w:lineRule="auto"/>
-      </w:pPr>
-      <w:r>
-        <w:rPr>
-          <w:rFonts w:ascii="Times New Roman" w:hAnsi="Times New Roman" w:cs="Times New Roman" w:eastAsia="Times New Roman"/>
-          <w:b/>
-          <w:i w:val="0"/>
-          <w:color w:val="141E33"/>
-          <w:sz w:val="24"/>
-        </w:rPr>
-        <w:t>4.3 K-Nearest Neighbors</w:t>
-      </w:r>
-    </w:p>
-    <w:p>
-      <w:pPr>
-        <w:spacing w:before="0" w:after="200" w:line="240" w:lineRule="auto"/>
-      </w:pPr>
-      <w:r>
-        <w:rPr>
-          <w:rFonts w:ascii="Times New Roman" w:hAnsi="Times New Roman" w:cs="Times New Roman" w:eastAsia="Times New Roman"/>
-          <w:b w:val="0"/>
-          <w:i w:val="0"/>
-          <w:sz w:val="24"/>
-        </w:rPr>
-        <w:t>K-Nearest Neighbors (k-NN) predicts the class of a query x_q by majority vote among the k training points closest to x_q under a chosen distance metric (typically Euclidean). It has no training stage to speak of -- the training set is simply stored -- and all work is deferred to inference, where a naive scan costs O(N d) per query. The hyperparameter k controls the bias-variance trade-off and is selected by cross-validation. k-NN is highly sensitive to feature scaling, so standardisation to zero mean and unit variance is mandatory preprocessing. We include k-NN in HERO as a memory-bound, latency-heavy classical baseline whose predictable energy profile is useful in the comparisons of Chapter 9.</w:t>
-      </w:r>
-    </w:p>
-    <w:p>
-      <w:pPr>
-        <w:pStyle w:val="Heading2"/>
-        <w:spacing w:before="80" w:after="40" w:line="240" w:lineRule="auto"/>
-      </w:pPr>
-      <w:r>
-        <w:rPr>
-          <w:rFonts w:ascii="Times New Roman" w:hAnsi="Times New Roman" w:cs="Times New Roman" w:eastAsia="Times New Roman"/>
-          <w:b/>
-          <w:i w:val="0"/>
-          <w:color w:val="141E33"/>
-          <w:sz w:val="24"/>
-        </w:rPr>
-        <w:t>4.4 Evaluation Metrics: Accuracy, Precision, Recall, F1</w:t>
-      </w:r>
-    </w:p>
-    <w:p>
-      <w:pPr>
-        <w:spacing w:before="0" w:after="200" w:line="240" w:lineRule="auto"/>
-      </w:pPr>
-      <w:r>
-        <w:rPr>
-          <w:rFonts w:ascii="Times New Roman" w:hAnsi="Times New Roman" w:cs="Times New Roman" w:eastAsia="Times New Roman"/>
-          <w:b w:val="0"/>
-          <w:i w:val="0"/>
-          <w:sz w:val="24"/>
-        </w:rPr>
         <w:t>The binary confusion matrix records four counts -- true positives (TP), false positives (FP), true negatives (TN), and false negatives (FN) -- from which the headline metrics derive: Accuracy = (TP+TN)/(TP+FP+TN+FN), Precision = TP/(TP+FP), Recall = TP/(TP+FN), and F1 = 2 P R / (P + R). Accuracy is misleading on imbalanced IDS data because a trivial all-benign predictor scores the prevalence of the benign class. F1 is our headline metric, but precision and recall are always reported alongside because the operational cost of false negatives (missed attacks) is qualitatively different from that of false positives (alert fatigue).</w:t>
-      </w:r>
-    </w:p>
-    <w:p>
-      <w:pPr>
-        <w:pStyle w:val="Heading2"/>
-        <w:spacing w:before="80" w:after="40" w:line="240" w:lineRule="auto"/>
-      </w:pPr>
-      <w:r>
-        <w:rPr>
-          <w:rFonts w:ascii="Times New Roman" w:hAnsi="Times New Roman" w:cs="Times New Roman" w:eastAsia="Times New Roman"/>
-          <w:b/>
-          <w:i w:val="0"/>
-          <w:color w:val="141E33"/>
-          <w:sz w:val="24"/>
-        </w:rPr>
-        <w:t>4.5 Multi-Run Statistical Validation</w:t>
-      </w:r>
-    </w:p>
-    <w:p>
-      <w:pPr>
-        <w:spacing w:before="0" w:after="200" w:line="240" w:lineRule="auto"/>
-      </w:pPr>
-      <w:r>
-        <w:rPr>
-          <w:rFonts w:ascii="Times New Roman" w:hAnsi="Times New Roman" w:cs="Times New Roman" w:eastAsia="Times New Roman"/>
-          <w:b w:val="0"/>
-          <w:i w:val="0"/>
-          <w:sz w:val="24"/>
-        </w:rPr>
-        <w:t>Single-run benchmark numbers mislead: on typical IDS data the train/test split seed alone shifts F1 by two to four percentage points, larger than many published differences. HERO therefore reports every (workload x method) cell as a distribution over 30 independent seeds, shared across methods within a workload so the comparisons are paired. For each cell we report mean +/- std and the empirical distribution as a box plot in Chapters 9 and 10.</w:t>
-      </w:r>
-    </w:p>
-    <w:p>
-      <w:pPr>
-        <w:spacing w:before="0" w:after="200" w:line="240" w:lineRule="auto"/>
-      </w:pPr>
-      <w:r>
-        <w:rPr>
-          <w:rFonts w:ascii="Times New Roman" w:hAnsi="Times New Roman" w:cs="Times New Roman" w:eastAsia="Times New Roman"/>
-          <w:b w:val="0"/>
-          <w:i w:val="0"/>
-          <w:sz w:val="24"/>
-        </w:rPr>
-        <w:t>Pairwise significance between two methods is tested with the Wilcoxon signed-rank test on the 30 paired F1 values. We declare significance at p &lt; 0.05 with Bonferroni correction across the four IDS datasets (per-dataset threshold p &lt; 0.0125); the full per-comparison p-value table appears in Appendix B.</w:t>
       </w:r>
     </w:p>
     <w:p>
@@ -5389,274 +5166,6 @@
     </w:p>
     <w:p>
       <w:pPr>
-        <w:pStyle w:val="Heading2"/>
-        <w:spacing w:before="80" w:after="40" w:line="240" w:lineRule="auto"/>
-      </w:pPr>
-      <w:r>
-        <w:rPr>
-          <w:rFonts w:ascii="Times New Roman" w:hAnsi="Times New Roman" w:cs="Times New Roman" w:eastAsia="Times New Roman"/>
-          <w:b/>
-          <w:i w:val="0"/>
-          <w:color w:val="141E33"/>
-          <w:sz w:val="24"/>
-        </w:rPr>
-        <w:t>5.4 Energy and Power Usage Effectiveness in Datacenters</w:t>
-      </w:r>
-    </w:p>
-    <w:p>
-      <w:pPr>
-        <w:spacing w:before="0" w:after="200" w:line="240" w:lineRule="auto"/>
-      </w:pPr>
-      <w:r>
-        <w:rPr>
-          <w:rFonts w:ascii="Times New Roman" w:hAnsi="Times New Roman" w:cs="Times New Roman" w:eastAsia="Times New Roman"/>
-          <w:b w:val="0"/>
-          <w:i w:val="0"/>
-          <w:sz w:val="24"/>
-        </w:rPr>
-        <w:t>Datacenter energy accounting is the third pillar of HERO's comparison framework. Cost in dollars and latency in milliseconds are the operational metrics most readily appreciated by industry; energy in joules is the metric that increasingly drives sustainability reporting and procurement decisions. This section defines the quantities that the remainder of the thesis uses and fixes the representative values that the energy model in Section 7.3 plugs into.</w:t>
-      </w:r>
-    </w:p>
-    <w:p>
-      <w:pPr>
-        <w:pStyle w:val="Heading3"/>
-        <w:spacing w:before="80" w:after="40" w:line="240" w:lineRule="auto"/>
-      </w:pPr>
-      <w:r>
-        <w:rPr>
-          <w:rFonts w:ascii="Times New Roman" w:hAnsi="Times New Roman" w:cs="Times New Roman" w:eastAsia="Times New Roman"/>
-          <w:b/>
-          <w:i w:val="0"/>
-          <w:color w:val="141E33"/>
-          <w:sz w:val="22"/>
-        </w:rPr>
-        <w:t>Server Power</w:t>
-      </w:r>
-    </w:p>
-    <w:p>
-      <w:pPr>
-        <w:spacing w:before="0" w:after="200" w:line="240" w:lineRule="auto"/>
-      </w:pPr>
-      <w:r>
-        <w:rPr>
-          <w:rFonts w:ascii="Times New Roman" w:hAnsi="Times New Roman" w:cs="Times New Roman" w:eastAsia="Times New Roman"/>
-          <w:b w:val="0"/>
-          <w:i w:val="0"/>
-          <w:sz w:val="24"/>
-        </w:rPr>
-        <w:t>Modern server CPUs have thermal design powers (TDP) in the 105 to 300 W range per socket, with dual-socket servers reaching 600 W under sustained load. GPU TDP is markedly higher: an NVIDIA A100 dissipates around 300 W and an H100 in SXM form factor up to 700 W. A GPU-accelerated training node therefore consumes several times the energy per unit wall-clock time of an equivalent CPU-only node, although its throughput per joule on suitable workloads is still favourable.</w:t>
-      </w:r>
-    </w:p>
-    <w:p>
-      <w:pPr>
-        <w:pStyle w:val="Heading3"/>
-        <w:spacing w:before="80" w:after="40" w:line="240" w:lineRule="auto"/>
-      </w:pPr>
-      <w:r>
-        <w:rPr>
-          <w:rFonts w:ascii="Times New Roman" w:hAnsi="Times New Roman" w:cs="Times New Roman" w:eastAsia="Times New Roman"/>
-          <w:b/>
-          <w:i w:val="0"/>
-          <w:color w:val="141E33"/>
-          <w:sz w:val="22"/>
-        </w:rPr>
-        <w:t>QPU Power</w:t>
-      </w:r>
-    </w:p>
-    <w:p>
-      <w:pPr>
-        <w:spacing w:before="0" w:after="200" w:line="240" w:lineRule="auto"/>
-      </w:pPr>
-      <w:r>
-        <w:rPr>
-          <w:rFonts w:ascii="Times New Roman" w:hAnsi="Times New Roman" w:cs="Times New Roman" w:eastAsia="Times New Roman"/>
-          <w:b w:val="0"/>
-          <w:i w:val="0"/>
-          <w:sz w:val="24"/>
-        </w:rPr>
-        <w:t>QPU power is dominated not by computation but by the infrastructure that keeps the qubits cold. A single superconducting QPU sits inside a dilution refrigerator that draws on the order of 20 kW continuously, almost independently of whether a circuit is running. Trapped-ion and neutral-atom systems have lower cooling overhead but additional laser and vacuum infrastructure that ends up in a comparable order of magnitude. The implication is that QPU energy per task is high when the device is under-utilised and falls only when the device is kept saturated -- a fact that the cost model of Chapter 7 makes explicit.</w:t>
-      </w:r>
-    </w:p>
-    <w:p>
-      <w:pPr>
-        <w:pStyle w:val="Heading3"/>
-        <w:spacing w:before="80" w:after="40" w:line="240" w:lineRule="auto"/>
-      </w:pPr>
-      <w:r>
-        <w:rPr>
-          <w:rFonts w:ascii="Times New Roman" w:hAnsi="Times New Roman" w:cs="Times New Roman" w:eastAsia="Times New Roman"/>
-          <w:b/>
-          <w:i w:val="0"/>
-          <w:color w:val="141E33"/>
-          <w:sz w:val="22"/>
-        </w:rPr>
-        <w:t>Power Usage Effectiveness</w:t>
-      </w:r>
-    </w:p>
-    <w:p>
-      <w:pPr>
-        <w:spacing w:before="0" w:after="200" w:line="240" w:lineRule="auto"/>
-      </w:pPr>
-      <w:r>
-        <w:rPr>
-          <w:rFonts w:ascii="Times New Roman" w:hAnsi="Times New Roman" w:cs="Times New Roman" w:eastAsia="Times New Roman"/>
-          <w:b w:val="0"/>
-          <w:i w:val="0"/>
-          <w:sz w:val="24"/>
-        </w:rPr>
-        <w:t>Power Usage Effectiveness (PUE) is the standard metric for datacenter facility efficiency:</w:t>
-      </w:r>
-    </w:p>
-    <w:p>
-      <w:pPr>
-        <w:spacing w:before="120" w:after="200" w:line="240" w:lineRule="auto"/>
-        <w:jc w:val="center"/>
-      </w:pPr>
-      <w:r>
-        <w:rPr>
-          <w:rFonts w:ascii="Times New Roman" w:hAnsi="Times New Roman" w:cs="Times New Roman" w:eastAsia="Times New Roman"/>
-          <w:b w:val="0"/>
-          <w:i/>
-          <w:sz w:val="24"/>
-        </w:rPr>
-        <w:t>PUE = total facility power / IT equipment power.</w:t>
-      </w:r>
-    </w:p>
-    <w:p>
-      <w:pPr>
-        <w:spacing w:before="0" w:after="200" w:line="240" w:lineRule="auto"/>
-      </w:pPr>
-      <w:r>
-        <w:rPr>
-          <w:rFonts w:ascii="Times New Roman" w:hAnsi="Times New Roman" w:cs="Times New Roman" w:eastAsia="Times New Roman"/>
-          <w:b w:val="0"/>
-          <w:i w:val="0"/>
-          <w:sz w:val="24"/>
-        </w:rPr>
-        <w:t>A PUE of 1.0 would mean that every watt drawn from the grid reaches the IT equipment with no overhead from cooling, lighting, or power conditioning -- a thermodynamic impossibility in practice. Hyperscale operators (Google, AWS, Microsoft Azure) report fleet-average PUE values in the 1.10 to 1.20 range. Older enterprise datacenters typically sit between 1.5 and 2.0. This thesis adopts PUE = 1.2 as a representative hyperscale value throughout, on the grounds that the cloud workloads HERO models run on hyperscale infrastructure.</w:t>
-      </w:r>
-    </w:p>
-    <w:p>
-      <w:pPr>
-        <w:spacing w:before="120" w:after="240" w:line="240" w:lineRule="auto"/>
-        <w:jc w:val="center"/>
-      </w:pPr>
-      <w:r>
-        <w:rPr>
-          <w:rFonts w:ascii="Times New Roman" w:hAnsi="Times New Roman" w:cs="Times New Roman" w:eastAsia="Times New Roman"/>
-          <w:b w:val="0"/>
-          <w:i/>
-          <w:color w:val="404040"/>
-          <w:sz w:val="22"/>
-        </w:rPr>
-        <w:t>Figure 5.2: Datacenter energy flow and the PUE multiplier. IT equipment power feeds compute and storage; cooling, power conditioning, and ancillary loads inflate the facility draw by the PUE factor.</w:t>
-      </w:r>
-    </w:p>
-    <w:p>
-      <w:pPr>
-        <w:pStyle w:val="Heading3"/>
-        <w:spacing w:before="80" w:after="40" w:line="240" w:lineRule="auto"/>
-      </w:pPr>
-      <w:r>
-        <w:rPr>
-          <w:rFonts w:ascii="Times New Roman" w:hAnsi="Times New Roman" w:cs="Times New Roman" w:eastAsia="Times New Roman"/>
-          <w:b/>
-          <w:i w:val="0"/>
-          <w:color w:val="141E33"/>
-          <w:sz w:val="22"/>
-        </w:rPr>
-        <w:t>Per-Task Energy Estimation</w:t>
-      </w:r>
-    </w:p>
-    <w:p>
-      <w:pPr>
-        <w:spacing w:before="0" w:after="200" w:line="240" w:lineRule="auto"/>
-      </w:pPr>
-      <w:r>
-        <w:rPr>
-          <w:rFonts w:ascii="Times New Roman" w:hAnsi="Times New Roman" w:cs="Times New Roman" w:eastAsia="Times New Roman"/>
-          <w:b w:val="0"/>
-          <w:i w:val="0"/>
-          <w:sz w:val="24"/>
-        </w:rPr>
-        <w:t>HERO estimates per-task energy through the following first-order model:</w:t>
-      </w:r>
-    </w:p>
-    <w:p>
-      <w:pPr>
-        <w:spacing w:before="120" w:after="200" w:line="240" w:lineRule="auto"/>
-        <w:jc w:val="center"/>
-      </w:pPr>
-      <w:r>
-        <w:rPr>
-          <w:rFonts w:ascii="Times New Roman" w:hAnsi="Times New Roman" w:cs="Times New Roman" w:eastAsia="Times New Roman"/>
-          <w:b w:val="0"/>
-          <w:i/>
-          <w:sz w:val="24"/>
-        </w:rPr>
-        <w:t>E_task = t_task * P_tier * PUE      (Equation 1)</w:t>
-      </w:r>
-    </w:p>
-    <w:p>
-      <w:pPr>
-        <w:spacing w:before="0" w:after="200" w:line="240" w:lineRule="auto"/>
-      </w:pPr>
-      <w:r>
-        <w:rPr>
-          <w:rFonts w:ascii="Times New Roman" w:hAnsi="Times New Roman" w:cs="Times New Roman" w:eastAsia="Times New Roman"/>
-          <w:b w:val="0"/>
-          <w:i w:val="0"/>
-          <w:sz w:val="24"/>
-        </w:rPr>
-        <w:t>where t_task is the wall-clock time of the task in seconds, P_tier is the representative steady-state power draw of the tier in watts, and PUE is the dimensionless facility multiplier. The result E_task is in joules. Section 7.4 multiplies this by the cloud price per joule equivalent to convert energy into dollars.</w:t>
-      </w:r>
-    </w:p>
-    <w:p>
-      <w:pPr>
-        <w:pStyle w:val="Heading3"/>
-        <w:spacing w:before="80" w:after="40" w:line="240" w:lineRule="auto"/>
-      </w:pPr>
-      <w:r>
-        <w:rPr>
-          <w:rFonts w:ascii="Times New Roman" w:hAnsi="Times New Roman" w:cs="Times New Roman" w:eastAsia="Times New Roman"/>
-          <w:b/>
-          <w:i w:val="0"/>
-          <w:color w:val="141E33"/>
-          <w:sz w:val="22"/>
-        </w:rPr>
-        <w:t>Live Telemetry Alternatives</w:t>
-      </w:r>
-    </w:p>
-    <w:p>
-      <w:pPr>
-        <w:spacing w:before="0" w:after="200" w:line="240" w:lineRule="auto"/>
-      </w:pPr>
-      <w:r>
-        <w:rPr>
-          <w:rFonts w:ascii="Times New Roman" w:hAnsi="Times New Roman" w:cs="Times New Roman" w:eastAsia="Times New Roman"/>
-          <w:b w:val="0"/>
-          <w:i w:val="0"/>
-          <w:sz w:val="24"/>
-        </w:rPr>
-        <w:t>Where the platform exposes them, live energy counters give a more accurate per-task figure than Equation 1. Intel CPUs expose the Running Average Power Limit (RAPL) interface, which reports per-package energy counters at sub-millijoule resolution. NVIDIA GPUs expose per-device power and cumulative energy through the NVIDIA Management Library (NVML). Real-QPU facility power is rarely exposed on a per-job basis, so HERO uses modelled values for the QPU tier and live counters where available for the CPU and GPU tiers.</w:t>
-      </w:r>
-    </w:p>
-    <w:p>
-      <w:pPr>
-        <w:spacing w:before="0" w:after="200" w:line="240" w:lineRule="auto"/>
-      </w:pPr>
-      <w:r>
-        <w:rPr>
-          <w:rFonts w:ascii="Times New Roman" w:hAnsi="Times New Roman" w:cs="Times New Roman" w:eastAsia="Times New Roman"/>
-          <w:b w:val="0"/>
-          <w:i w:val="0"/>
-          <w:sz w:val="24"/>
-        </w:rPr>
-        <w:t>In summary, HERO uses Equation 1 with tier-specific representative powers (CPU 150 W, GPU 300 W, QPU 20 kW) and PUE = 1.2 throughout. Per-tier energy values are then combined with published cloud pricing to convert joules into dollars on a like-for-like basis. The full cost model is presented in Section 7.4.</w:t>
-      </w:r>
-    </w:p>
-    <w:p>
-      <w:pPr>
         <w:pStyle w:val="Heading1"/>
         <w:pageBreakBefore/>
         <w:spacing w:before="160" w:after="40" w:line="240" w:lineRule="auto"/>
@@ -5757,7 +5266,7 @@
           <w:i w:val="0"/>
           <w:sz w:val="24"/>
         </w:rPr>
-        <w:t>QML for security is a small literature. Kalinin and Krundyshev [47] surveyed quantum machine learning techniques for intrusion detection in 2023 and reported encouraging accuracy on small-scale, simulation-only experiments; earlier work applied quantum kernels to malware classification as case studies. None of this prior work measures the cost-energy-latency profile of the quantum option against strong classical baselines on multiple datasets with statistical validation -- the gap Chapter 9 closes.</w:t>
+        <w:t>QML for security is a small literature. Kalinin and Krundyshev surveyed quantum machine learning techniques for intrusion detection in 2023 and reported encouraging accuracy on small-scale, simulation-only experiments; earlier work applied quantum kernels to malware classification as case studies. None of this prior work measures the cost-energy-latency profile of the quantum option against strong classical baselines on multiple datasets with statistical validation -- the gap Chapter 9 closes.</w:t>
       </w:r>
     </w:p>
     <w:p>
@@ -6354,15 +5863,15 @@
     </w:p>
     <w:p>
       <w:pPr>
-        <w:spacing w:before="120" w:after="200" w:line="240" w:lineRule="auto"/>
-        <w:jc w:val="center"/>
-      </w:pPr>
-      <w:r>
-        <w:rPr>
-          <w:rFonts w:ascii="Times New Roman" w:hAnsi="Times New Roman" w:cs="Times New Roman" w:eastAsia="Times New Roman"/>
-          <w:b w:val="0"/>
-          <w:i/>
-          <w:sz w:val="24"/>
+        <w:spacing w:before="0" w:after="0" w:line="240" w:lineRule="auto"/>
+        <w:ind w:left="340"/>
+      </w:pPr>
+      <w:r>
+        <w:rPr>
+          <w:rFonts w:ascii="Consolas" w:hAnsi="Consolas" w:cs="Consolas" w:eastAsia="Consolas"/>
+          <w:b w:val="0"/>
+          <w:i w:val="0"/>
+          <w:sz w:val="20"/>
         </w:rPr>
         <w:t>E_task = t_task * P_tier * PUE                  (Eq 7.1)</w:t>
       </w:r>
@@ -6455,15 +5964,15 @@
     </w:p>
     <w:p>
       <w:pPr>
-        <w:spacing w:before="120" w:after="200" w:line="240" w:lineRule="auto"/>
-        <w:jc w:val="center"/>
-      </w:pPr>
-      <w:r>
-        <w:rPr>
-          <w:rFonts w:ascii="Times New Roman" w:hAnsi="Times New Roman" w:cs="Times New Roman" w:eastAsia="Times New Roman"/>
-          <w:b w:val="0"/>
-          <w:i/>
-          <w:sz w:val="24"/>
+        <w:spacing w:before="0" w:after="0" w:line="240" w:lineRule="auto"/>
+        <w:ind w:left="340"/>
+      </w:pPr>
+      <w:r>
+        <w:rPr>
+          <w:rFonts w:ascii="Consolas" w:hAnsi="Consolas" w:cs="Consolas" w:eastAsia="Consolas"/>
+          <w:b w:val="0"/>
+          <w:i w:val="0"/>
+          <w:sz w:val="20"/>
         </w:rPr>
         <w:t>cost_task = t_task * CloudPrice[tier]                 (Eq 7.2)</w:t>
       </w:r>
@@ -6556,345 +6065,385 @@
     </w:p>
     <w:p>
       <w:pPr>
-        <w:spacing w:before="120" w:after="200" w:line="240" w:lineRule="auto"/>
-        <w:jc w:val="center"/>
-      </w:pPr>
-      <w:r>
-        <w:rPr>
-          <w:rFonts w:ascii="Times New Roman" w:hAnsi="Times New Roman" w:cs="Times New Roman" w:eastAsia="Times New Roman"/>
-          <w:b w:val="0"/>
-          <w:i/>
-          <w:sz w:val="24"/>
+        <w:spacing w:before="0" w:after="0" w:line="240" w:lineRule="auto"/>
+        <w:ind w:left="340"/>
+      </w:pPr>
+      <w:r>
+        <w:rPr>
+          <w:rFonts w:ascii="Consolas" w:hAnsi="Consolas" w:cs="Consolas" w:eastAsia="Consolas"/>
+          <w:b w:val="0"/>
+          <w:i w:val="0"/>
+          <w:sz w:val="20"/>
         </w:rPr>
         <w:t>Algorithm 1: HERO -- End-to-End Workload Allocation, Measurement, and Selection</w:t>
       </w:r>
     </w:p>
     <w:p>
       <w:pPr>
-        <w:spacing w:before="120" w:after="200" w:line="240" w:lineRule="auto"/>
-        <w:jc w:val="center"/>
-      </w:pPr>
-      <w:r>
-        <w:rPr>
-          <w:rFonts w:ascii="Times New Roman" w:hAnsi="Times New Roman" w:cs="Times New Roman" w:eastAsia="Times New Roman"/>
-          <w:b w:val="0"/>
-          <w:i/>
-          <w:sz w:val="24"/>
+        <w:spacing w:before="0" w:after="0" w:line="240" w:lineRule="auto"/>
+        <w:ind w:left="340"/>
+      </w:pPr>
+      <w:r>
+        <w:rPr>
+          <w:rFonts w:ascii="Consolas" w:hAnsi="Consolas" w:cs="Consolas" w:eastAsia="Consolas"/>
+          <w:b w:val="0"/>
+          <w:i w:val="0"/>
+          <w:sz w:val="20"/>
         </w:rPr>
         <w:t>Input: Workload W (type, size n, feature dim d), runs N=30, tiers T={CPU, GPU, QPU}</w:t>
       </w:r>
     </w:p>
     <w:p>
       <w:pPr>
-        <w:spacing w:before="120" w:after="200" w:line="240" w:lineRule="auto"/>
-        <w:jc w:val="center"/>
-      </w:pPr>
-      <w:r>
-        <w:rPr>
-          <w:rFonts w:ascii="Times New Roman" w:hAnsi="Times New Roman" w:cs="Times New Roman" w:eastAsia="Times New Roman"/>
-          <w:b w:val="0"/>
-          <w:i/>
-          <w:sz w:val="24"/>
+        <w:spacing w:before="0" w:after="0" w:line="240" w:lineRule="auto"/>
+        <w:ind w:left="340"/>
+      </w:pPr>
+      <w:r>
+        <w:rPr>
+          <w:rFonts w:ascii="Consolas" w:hAnsi="Consolas" w:cs="Consolas" w:eastAsia="Consolas"/>
+          <w:b w:val="0"/>
+          <w:i w:val="0"/>
+          <w:sz w:val="20"/>
         </w:rPr>
         <w:t>Output: Recommended tier t*, metrics (accuracy, latency, energy, cost)</w:t>
       </w:r>
     </w:p>
     <w:p>
       <w:pPr>
-        <w:spacing w:before="120" w:after="200" w:line="240" w:lineRule="auto"/>
-        <w:jc w:val="center"/>
-      </w:pPr>
-    </w:p>
-    <w:p>
-      <w:pPr>
-        <w:spacing w:before="120" w:after="200" w:line="240" w:lineRule="auto"/>
-        <w:jc w:val="center"/>
-      </w:pPr>
-      <w:r>
-        <w:rPr>
-          <w:rFonts w:ascii="Times New Roman" w:hAnsi="Times New Roman" w:cs="Times New Roman" w:eastAsia="Times New Roman"/>
-          <w:b w:val="0"/>
-          <w:i/>
-          <w:sz w:val="24"/>
+        <w:spacing w:before="0" w:after="0" w:line="240" w:lineRule="auto"/>
+        <w:ind w:left="340"/>
+      </w:pPr>
+      <w:r>
+        <w:rPr>
+          <w:rFonts w:ascii="Consolas" w:hAnsi="Consolas" w:cs="Consolas" w:eastAsia="Consolas"/>
+          <w:b w:val="0"/>
+          <w:i w:val="0"/>
+          <w:sz w:val="20"/>
+        </w:rPr>
+      </w:r>
+    </w:p>
+    <w:p>
+      <w:pPr>
+        <w:spacing w:before="0" w:after="0" w:line="240" w:lineRule="auto"/>
+        <w:ind w:left="340"/>
+      </w:pPr>
+      <w:r>
+        <w:rPr>
+          <w:rFonts w:ascii="Consolas" w:hAnsi="Consolas" w:cs="Consolas" w:eastAsia="Consolas"/>
+          <w:b w:val="0"/>
+          <w:i w:val="0"/>
+          <w:sz w:val="20"/>
         </w:rPr>
         <w:t>STEP 1 - ALLOCATE TIER</w:t>
       </w:r>
     </w:p>
     <w:p>
       <w:pPr>
-        <w:spacing w:before="120" w:after="200" w:line="240" w:lineRule="auto"/>
-        <w:jc w:val="center"/>
-      </w:pPr>
-      <w:r>
-        <w:rPr>
-          <w:rFonts w:ascii="Times New Roman" w:hAnsi="Times New Roman" w:cs="Times New Roman" w:eastAsia="Times New Roman"/>
-          <w:b w:val="0"/>
-          <w:i/>
-          <w:sz w:val="24"/>
+        <w:spacing w:before="0" w:after="0" w:line="240" w:lineRule="auto"/>
+        <w:ind w:left="340"/>
+      </w:pPr>
+      <w:r>
+        <w:rPr>
+          <w:rFonts w:ascii="Consolas" w:hAnsi="Consolas" w:cs="Consolas" w:eastAsia="Consolas"/>
+          <w:b w:val="0"/>
+          <w:i w:val="0"/>
+          <w:sz w:val="20"/>
         </w:rPr>
         <w:t xml:space="preserve">  if W.type = MOLECULAR_SIM   then t = QPU if n&gt;30 else CPU</w:t>
       </w:r>
     </w:p>
     <w:p>
       <w:pPr>
-        <w:spacing w:before="120" w:after="200" w:line="240" w:lineRule="auto"/>
-        <w:jc w:val="center"/>
-      </w:pPr>
-      <w:r>
-        <w:rPr>
-          <w:rFonts w:ascii="Times New Roman" w:hAnsi="Times New Roman" w:cs="Times New Roman" w:eastAsia="Times New Roman"/>
-          <w:b w:val="0"/>
-          <w:i/>
-          <w:sz w:val="24"/>
+        <w:spacing w:before="0" w:after="0" w:line="240" w:lineRule="auto"/>
+        <w:ind w:left="340"/>
+      </w:pPr>
+      <w:r>
+        <w:rPr>
+          <w:rFonts w:ascii="Consolas" w:hAnsi="Consolas" w:cs="Consolas" w:eastAsia="Consolas"/>
+          <w:b w:val="0"/>
+          <w:i w:val="0"/>
+          <w:sz w:val="20"/>
         </w:rPr>
         <w:t xml:space="preserve">  if W.type = CLASSICAL_ML    then t = CPU if d&lt;100 else (GPU if d&lt;10000 else MEASURE)</w:t>
       </w:r>
     </w:p>
     <w:p>
       <w:pPr>
-        <w:spacing w:before="120" w:after="200" w:line="240" w:lineRule="auto"/>
-        <w:jc w:val="center"/>
-      </w:pPr>
-      <w:r>
-        <w:rPr>
-          <w:rFonts w:ascii="Times New Roman" w:hAnsi="Times New Roman" w:cs="Times New Roman" w:eastAsia="Times New Roman"/>
-          <w:b w:val="0"/>
-          <w:i/>
-          <w:sz w:val="24"/>
+        <w:spacing w:before="0" w:after="0" w:line="240" w:lineRule="auto"/>
+        <w:ind w:left="340"/>
+      </w:pPr>
+      <w:r>
+        <w:rPr>
+          <w:rFonts w:ascii="Consolas" w:hAnsi="Consolas" w:cs="Consolas" w:eastAsia="Consolas"/>
+          <w:b w:val="0"/>
+          <w:i w:val="0"/>
+          <w:sz w:val="20"/>
         </w:rPr>
         <w:t xml:space="preserve">  if W.type = COMBINATORIAL   then t = CPU if n&lt;50 else QPU</w:t>
       </w:r>
     </w:p>
     <w:p>
       <w:pPr>
-        <w:spacing w:before="120" w:after="200" w:line="240" w:lineRule="auto"/>
-        <w:jc w:val="center"/>
-      </w:pPr>
-    </w:p>
-    <w:p>
-      <w:pPr>
-        <w:spacing w:before="120" w:after="200" w:line="240" w:lineRule="auto"/>
-        <w:jc w:val="center"/>
-      </w:pPr>
-      <w:r>
-        <w:rPr>
-          <w:rFonts w:ascii="Times New Roman" w:hAnsi="Times New Roman" w:cs="Times New Roman" w:eastAsia="Times New Roman"/>
-          <w:b w:val="0"/>
-          <w:i/>
-          <w:sz w:val="24"/>
+        <w:spacing w:before="0" w:after="0" w:line="240" w:lineRule="auto"/>
+        <w:ind w:left="340"/>
+      </w:pPr>
+      <w:r>
+        <w:rPr>
+          <w:rFonts w:ascii="Consolas" w:hAnsi="Consolas" w:cs="Consolas" w:eastAsia="Consolas"/>
+          <w:b w:val="0"/>
+          <w:i w:val="0"/>
+          <w:sz w:val="20"/>
+        </w:rPr>
+      </w:r>
+    </w:p>
+    <w:p>
+      <w:pPr>
+        <w:spacing w:before="0" w:after="0" w:line="240" w:lineRule="auto"/>
+        <w:ind w:left="340"/>
+      </w:pPr>
+      <w:r>
+        <w:rPr>
+          <w:rFonts w:ascii="Consolas" w:hAnsi="Consolas" w:cs="Consolas" w:eastAsia="Consolas"/>
+          <w:b w:val="0"/>
+          <w:i w:val="0"/>
+          <w:sz w:val="20"/>
         </w:rPr>
         <w:t>STEP 2 - MEASURE ON EACH TIER (N runs for statistics)</w:t>
       </w:r>
     </w:p>
     <w:p>
       <w:pPr>
-        <w:spacing w:before="120" w:after="200" w:line="240" w:lineRule="auto"/>
-        <w:jc w:val="center"/>
-      </w:pPr>
-      <w:r>
-        <w:rPr>
-          <w:rFonts w:ascii="Times New Roman" w:hAnsi="Times New Roman" w:cs="Times New Roman" w:eastAsia="Times New Roman"/>
-          <w:b w:val="0"/>
-          <w:i/>
-          <w:sz w:val="24"/>
+        <w:spacing w:before="0" w:after="0" w:line="240" w:lineRule="auto"/>
+        <w:ind w:left="340"/>
+      </w:pPr>
+      <w:r>
+        <w:rPr>
+          <w:rFonts w:ascii="Consolas" w:hAnsi="Consolas" w:cs="Consolas" w:eastAsia="Consolas"/>
+          <w:b w:val="0"/>
+          <w:i w:val="0"/>
+          <w:sz w:val="20"/>
         </w:rPr>
         <w:t xml:space="preserve">  for tier in T:</w:t>
       </w:r>
     </w:p>
     <w:p>
       <w:pPr>
-        <w:spacing w:before="120" w:after="200" w:line="240" w:lineRule="auto"/>
-        <w:jc w:val="center"/>
-      </w:pPr>
-      <w:r>
-        <w:rPr>
-          <w:rFonts w:ascii="Times New Roman" w:hAnsi="Times New Roman" w:cs="Times New Roman" w:eastAsia="Times New Roman"/>
-          <w:b w:val="0"/>
-          <w:i/>
-          <w:sz w:val="24"/>
+        <w:spacing w:before="0" w:after="0" w:line="240" w:lineRule="auto"/>
+        <w:ind w:left="340"/>
+      </w:pPr>
+      <w:r>
+        <w:rPr>
+          <w:rFonts w:ascii="Consolas" w:hAnsi="Consolas" w:cs="Consolas" w:eastAsia="Consolas"/>
+          <w:b w:val="0"/>
+          <w:i w:val="0"/>
+          <w:sz w:val="20"/>
         </w:rPr>
         <w:t xml:space="preserve">    for run = 1..N:</w:t>
       </w:r>
     </w:p>
     <w:p>
       <w:pPr>
-        <w:spacing w:before="120" w:after="200" w:line="240" w:lineRule="auto"/>
-        <w:jc w:val="center"/>
-      </w:pPr>
-      <w:r>
-        <w:rPr>
-          <w:rFonts w:ascii="Times New Roman" w:hAnsi="Times New Roman" w:cs="Times New Roman" w:eastAsia="Times New Roman"/>
-          <w:b w:val="0"/>
-          <w:i/>
-          <w:sz w:val="24"/>
+        <w:spacing w:before="0" w:after="0" w:line="240" w:lineRule="auto"/>
+        <w:ind w:left="340"/>
+      </w:pPr>
+      <w:r>
+        <w:rPr>
+          <w:rFonts w:ascii="Consolas" w:hAnsi="Consolas" w:cs="Consolas" w:eastAsia="Consolas"/>
+          <w:b w:val="0"/>
+          <w:i w:val="0"/>
+          <w:sz w:val="20"/>
         </w:rPr>
         <w:t xml:space="preserve">      latency, result = Dispatch(W, tier)</w:t>
       </w:r>
     </w:p>
     <w:p>
       <w:pPr>
-        <w:spacing w:before="120" w:after="200" w:line="240" w:lineRule="auto"/>
-        <w:jc w:val="center"/>
-      </w:pPr>
-      <w:r>
-        <w:rPr>
-          <w:rFonts w:ascii="Times New Roman" w:hAnsi="Times New Roman" w:cs="Times New Roman" w:eastAsia="Times New Roman"/>
-          <w:b w:val="0"/>
-          <w:i/>
-          <w:sz w:val="24"/>
+        <w:spacing w:before="0" w:after="0" w:line="240" w:lineRule="auto"/>
+        <w:ind w:left="340"/>
+      </w:pPr>
+      <w:r>
+        <w:rPr>
+          <w:rFonts w:ascii="Consolas" w:hAnsi="Consolas" w:cs="Consolas" w:eastAsia="Consolas"/>
+          <w:b w:val="0"/>
+          <w:i w:val="0"/>
+          <w:sz w:val="20"/>
         </w:rPr>
         <w:t xml:space="preserve">      energy = latency * P[tier] * PUE                  (Eq 7.1)</w:t>
       </w:r>
     </w:p>
     <w:p>
       <w:pPr>
-        <w:spacing w:before="120" w:after="200" w:line="240" w:lineRule="auto"/>
-        <w:jc w:val="center"/>
-      </w:pPr>
-      <w:r>
-        <w:rPr>
-          <w:rFonts w:ascii="Times New Roman" w:hAnsi="Times New Roman" w:cs="Times New Roman" w:eastAsia="Times New Roman"/>
-          <w:b w:val="0"/>
-          <w:i/>
-          <w:sz w:val="24"/>
+        <w:spacing w:before="0" w:after="0" w:line="240" w:lineRule="auto"/>
+        <w:ind w:left="340"/>
+      </w:pPr>
+      <w:r>
+        <w:rPr>
+          <w:rFonts w:ascii="Consolas" w:hAnsi="Consolas" w:cs="Consolas" w:eastAsia="Consolas"/>
+          <w:b w:val="0"/>
+          <w:i w:val="0"/>
+          <w:sz w:val="20"/>
         </w:rPr>
         <w:t xml:space="preserve">      cost   = latency * CloudPrice[tier]                (Eq 7.2)</w:t>
       </w:r>
     </w:p>
     <w:p>
       <w:pPr>
-        <w:spacing w:before="120" w:after="200" w:line="240" w:lineRule="auto"/>
-        <w:jc w:val="center"/>
-      </w:pPr>
-      <w:r>
-        <w:rPr>
-          <w:rFonts w:ascii="Times New Roman" w:hAnsi="Times New Roman" w:cs="Times New Roman" w:eastAsia="Times New Roman"/>
-          <w:b w:val="0"/>
-          <w:i/>
-          <w:sz w:val="24"/>
+        <w:spacing w:before="0" w:after="0" w:line="240" w:lineRule="auto"/>
+        <w:ind w:left="340"/>
+      </w:pPr>
+      <w:r>
+        <w:rPr>
+          <w:rFonts w:ascii="Consolas" w:hAnsi="Consolas" w:cs="Consolas" w:eastAsia="Consolas"/>
+          <w:b w:val="0"/>
+          <w:i w:val="0"/>
+          <w:sz w:val="20"/>
         </w:rPr>
         <w:t xml:space="preserve">      record(W, tier, run, accuracy, latency, energy, cost)</w:t>
       </w:r>
     </w:p>
     <w:p>
       <w:pPr>
-        <w:spacing w:before="120" w:after="200" w:line="240" w:lineRule="auto"/>
-        <w:jc w:val="center"/>
-      </w:pPr>
-    </w:p>
-    <w:p>
-      <w:pPr>
-        <w:spacing w:before="120" w:after="200" w:line="240" w:lineRule="auto"/>
-        <w:jc w:val="center"/>
-      </w:pPr>
-      <w:r>
-        <w:rPr>
-          <w:rFonts w:ascii="Times New Roman" w:hAnsi="Times New Roman" w:cs="Times New Roman" w:eastAsia="Times New Roman"/>
-          <w:b w:val="0"/>
-          <w:i/>
-          <w:sz w:val="24"/>
+        <w:spacing w:before="0" w:after="0" w:line="240" w:lineRule="auto"/>
+        <w:ind w:left="340"/>
+      </w:pPr>
+      <w:r>
+        <w:rPr>
+          <w:rFonts w:ascii="Consolas" w:hAnsi="Consolas" w:cs="Consolas" w:eastAsia="Consolas"/>
+          <w:b w:val="0"/>
+          <w:i w:val="0"/>
+          <w:sz w:val="20"/>
+        </w:rPr>
+      </w:r>
+    </w:p>
+    <w:p>
+      <w:pPr>
+        <w:spacing w:before="0" w:after="0" w:line="240" w:lineRule="auto"/>
+        <w:ind w:left="340"/>
+      </w:pPr>
+      <w:r>
+        <w:rPr>
+          <w:rFonts w:ascii="Consolas" w:hAnsi="Consolas" w:cs="Consolas" w:eastAsia="Consolas"/>
+          <w:b w:val="0"/>
+          <w:i w:val="0"/>
+          <w:sz w:val="20"/>
         </w:rPr>
         <w:t>STEP 3 - AGGREGATE STATISTICS</w:t>
       </w:r>
     </w:p>
     <w:p>
       <w:pPr>
-        <w:spacing w:before="120" w:after="200" w:line="240" w:lineRule="auto"/>
-        <w:jc w:val="center"/>
-      </w:pPr>
-      <w:r>
-        <w:rPr>
-          <w:rFonts w:ascii="Times New Roman" w:hAnsi="Times New Roman" w:cs="Times New Roman" w:eastAsia="Times New Roman"/>
-          <w:b w:val="0"/>
-          <w:i/>
-          <w:sz w:val="24"/>
+        <w:spacing w:before="0" w:after="0" w:line="240" w:lineRule="auto"/>
+        <w:ind w:left="340"/>
+      </w:pPr>
+      <w:r>
+        <w:rPr>
+          <w:rFonts w:ascii="Consolas" w:hAnsi="Consolas" w:cs="Consolas" w:eastAsia="Consolas"/>
+          <w:b w:val="0"/>
+          <w:i w:val="0"/>
+          <w:sz w:val="20"/>
         </w:rPr>
         <w:t xml:space="preserve">  for each tier: report mean +/- std for accuracy, latency, energy, cost</w:t>
       </w:r>
     </w:p>
     <w:p>
       <w:pPr>
-        <w:spacing w:before="120" w:after="200" w:line="240" w:lineRule="auto"/>
-        <w:jc w:val="center"/>
-      </w:pPr>
-    </w:p>
-    <w:p>
-      <w:pPr>
-        <w:spacing w:before="120" w:after="200" w:line="240" w:lineRule="auto"/>
-        <w:jc w:val="center"/>
-      </w:pPr>
-      <w:r>
-        <w:rPr>
-          <w:rFonts w:ascii="Times New Roman" w:hAnsi="Times New Roman" w:cs="Times New Roman" w:eastAsia="Times New Roman"/>
-          <w:b w:val="0"/>
-          <w:i/>
-          <w:sz w:val="24"/>
+        <w:spacing w:before="0" w:after="0" w:line="240" w:lineRule="auto"/>
+        <w:ind w:left="340"/>
+      </w:pPr>
+      <w:r>
+        <w:rPr>
+          <w:rFonts w:ascii="Consolas" w:hAnsi="Consolas" w:cs="Consolas" w:eastAsia="Consolas"/>
+          <w:b w:val="0"/>
+          <w:i w:val="0"/>
+          <w:sz w:val="20"/>
+        </w:rPr>
+      </w:r>
+    </w:p>
+    <w:p>
+      <w:pPr>
+        <w:spacing w:before="0" w:after="0" w:line="240" w:lineRule="auto"/>
+        <w:ind w:left="340"/>
+      </w:pPr>
+      <w:r>
+        <w:rPr>
+          <w:rFonts w:ascii="Consolas" w:hAnsi="Consolas" w:cs="Consolas" w:eastAsia="Consolas"/>
+          <w:b w:val="0"/>
+          <w:i w:val="0"/>
+          <w:sz w:val="20"/>
         </w:rPr>
         <w:t>STEP 4 - PARETO SELECTION (joint cost+energy+latency+accuracy)</w:t>
       </w:r>
     </w:p>
     <w:p>
       <w:pPr>
-        <w:spacing w:before="120" w:after="200" w:line="240" w:lineRule="auto"/>
-        <w:jc w:val="center"/>
-      </w:pPr>
-      <w:r>
-        <w:rPr>
-          <w:rFonts w:ascii="Times New Roman" w:hAnsi="Times New Roman" w:cs="Times New Roman" w:eastAsia="Times New Roman"/>
-          <w:b w:val="0"/>
-          <w:i/>
-          <w:sz w:val="24"/>
+        <w:spacing w:before="0" w:after="0" w:line="240" w:lineRule="auto"/>
+        <w:ind w:left="340"/>
+      </w:pPr>
+      <w:r>
+        <w:rPr>
+          <w:rFonts w:ascii="Consolas" w:hAnsi="Consolas" w:cs="Consolas" w:eastAsia="Consolas"/>
+          <w:b w:val="0"/>
+          <w:i w:val="0"/>
+          <w:sz w:val="20"/>
         </w:rPr>
         <w:t xml:space="preserve">  P = { m : no other m' dominates m on (cost, energy, latency, -accuracy) }</w:t>
       </w:r>
     </w:p>
     <w:p>
       <w:pPr>
-        <w:spacing w:before="120" w:after="200" w:line="240" w:lineRule="auto"/>
-        <w:jc w:val="center"/>
-      </w:pPr>
-    </w:p>
-    <w:p>
-      <w:pPr>
-        <w:spacing w:before="120" w:after="200" w:line="240" w:lineRule="auto"/>
-        <w:jc w:val="center"/>
-      </w:pPr>
-      <w:r>
-        <w:rPr>
-          <w:rFonts w:ascii="Times New Roman" w:hAnsi="Times New Roman" w:cs="Times New Roman" w:eastAsia="Times New Roman"/>
-          <w:b w:val="0"/>
-          <w:i/>
-          <w:sz w:val="24"/>
+        <w:spacing w:before="0" w:after="0" w:line="240" w:lineRule="auto"/>
+        <w:ind w:left="340"/>
+      </w:pPr>
+      <w:r>
+        <w:rPr>
+          <w:rFonts w:ascii="Consolas" w:hAnsi="Consolas" w:cs="Consolas" w:eastAsia="Consolas"/>
+          <w:b w:val="0"/>
+          <w:i w:val="0"/>
+          <w:sz w:val="20"/>
+        </w:rPr>
+      </w:r>
+    </w:p>
+    <w:p>
+      <w:pPr>
+        <w:spacing w:before="0" w:after="0" w:line="240" w:lineRule="auto"/>
+        <w:ind w:left="340"/>
+      </w:pPr>
+      <w:r>
+        <w:rPr>
+          <w:rFonts w:ascii="Consolas" w:hAnsi="Consolas" w:cs="Consolas" w:eastAsia="Consolas"/>
+          <w:b w:val="0"/>
+          <w:i w:val="0"/>
+          <w:sz w:val="20"/>
         </w:rPr>
         <w:t>STEP 5 - RETURN RECOMMENDATION</w:t>
       </w:r>
     </w:p>
     <w:p>
       <w:pPr>
-        <w:spacing w:before="120" w:after="200" w:line="240" w:lineRule="auto"/>
-        <w:jc w:val="center"/>
-      </w:pPr>
-      <w:r>
-        <w:rPr>
-          <w:rFonts w:ascii="Times New Roman" w:hAnsi="Times New Roman" w:cs="Times New Roman" w:eastAsia="Times New Roman"/>
-          <w:b w:val="0"/>
-          <w:i/>
-          <w:sz w:val="24"/>
+        <w:spacing w:before="0" w:after="0" w:line="240" w:lineRule="auto"/>
+        <w:ind w:left="340"/>
+      </w:pPr>
+      <w:r>
+        <w:rPr>
+          <w:rFonts w:ascii="Consolas" w:hAnsi="Consolas" w:cs="Consolas" w:eastAsia="Consolas"/>
+          <w:b w:val="0"/>
+          <w:i w:val="0"/>
+          <w:sz w:val="20"/>
         </w:rPr>
         <w:t xml:space="preserve">  t* = argmin over P of (alpha*cost + beta*energy + gamma*latency - delta*accuracy)</w:t>
       </w:r>
     </w:p>
     <w:p>
       <w:pPr>
-        <w:spacing w:before="120" w:after="200" w:line="240" w:lineRule="auto"/>
-        <w:jc w:val="center"/>
-      </w:pPr>
-      <w:r>
-        <w:rPr>
-          <w:rFonts w:ascii="Times New Roman" w:hAnsi="Times New Roman" w:cs="Times New Roman" w:eastAsia="Times New Roman"/>
-          <w:b w:val="0"/>
-          <w:i/>
-          <w:sz w:val="24"/>
+        <w:spacing w:before="0" w:after="0" w:line="240" w:lineRule="auto"/>
+        <w:ind w:left="340"/>
+      </w:pPr>
+      <w:r>
+        <w:rPr>
+          <w:rFonts w:ascii="Consolas" w:hAnsi="Consolas" w:cs="Consolas" w:eastAsia="Consolas"/>
+          <w:b w:val="0"/>
+          <w:i w:val="0"/>
+          <w:sz w:val="20"/>
         </w:rPr>
         <w:t xml:space="preserve">  return t*, statistics, Pareto set P</w:t>
       </w:r>
@@ -7760,75 +7309,75 @@
     </w:p>
     <w:p>
       <w:pPr>
-        <w:spacing w:before="120" w:after="200" w:line="240" w:lineRule="auto"/>
-        <w:jc w:val="center"/>
-      </w:pPr>
-      <w:r>
-        <w:rPr>
-          <w:rFonts w:ascii="Times New Roman" w:hAnsi="Times New Roman" w:cs="Times New Roman" w:eastAsia="Times New Roman"/>
-          <w:b w:val="0"/>
-          <w:i/>
-          <w:sz w:val="24"/>
+        <w:spacing w:before="0" w:after="0" w:line="240" w:lineRule="auto"/>
+        <w:ind w:left="340"/>
+      </w:pPr>
+      <w:r>
+        <w:rPr>
+          <w:rFonts w:ascii="Consolas" w:hAnsi="Consolas" w:cs="Consolas" w:eastAsia="Consolas"/>
+          <w:b w:val="0"/>
+          <w:i w:val="0"/>
+          <w:sz w:val="20"/>
         </w:rPr>
         <w:t>quantum_thesis_demo/</w:t>
       </w:r>
     </w:p>
     <w:p>
       <w:pPr>
-        <w:spacing w:before="120" w:after="200" w:line="240" w:lineRule="auto"/>
-        <w:jc w:val="center"/>
-      </w:pPr>
-      <w:r>
-        <w:rPr>
-          <w:rFonts w:ascii="Times New Roman" w:hAnsi="Times New Roman" w:cs="Times New Roman" w:eastAsia="Times New Roman"/>
-          <w:b w:val="0"/>
-          <w:i/>
-          <w:sz w:val="24"/>
+        <w:spacing w:before="0" w:after="0" w:line="240" w:lineRule="auto"/>
+        <w:ind w:left="340"/>
+      </w:pPr>
+      <w:r>
+        <w:rPr>
+          <w:rFonts w:ascii="Consolas" w:hAnsi="Consolas" w:cs="Consolas" w:eastAsia="Consolas"/>
+          <w:b w:val="0"/>
+          <w:i w:val="0"/>
+          <w:sz w:val="20"/>
         </w:rPr>
         <w:t xml:space="preserve">  |-- hybrid_simulation/    &lt;- the HERO simulator</w:t>
       </w:r>
     </w:p>
     <w:p>
       <w:pPr>
-        <w:spacing w:before="120" w:after="200" w:line="240" w:lineRule="auto"/>
-        <w:jc w:val="center"/>
-      </w:pPr>
-      <w:r>
-        <w:rPr>
-          <w:rFonts w:ascii="Times New Roman" w:hAnsi="Times New Roman" w:cs="Times New Roman" w:eastAsia="Times New Roman"/>
-          <w:b w:val="0"/>
-          <w:i/>
-          <w:sz w:val="24"/>
+        <w:spacing w:before="0" w:after="0" w:line="240" w:lineRule="auto"/>
+        <w:ind w:left="340"/>
+      </w:pPr>
+      <w:r>
+        <w:rPr>
+          <w:rFonts w:ascii="Consolas" w:hAnsi="Consolas" w:cs="Consolas" w:eastAsia="Consolas"/>
+          <w:b w:val="0"/>
+          <w:i w:val="0"/>
+          <w:sz w:val="20"/>
         </w:rPr>
         <w:t xml:space="preserve">  |-- papers/               &lt;- IEEE conference paper sources</w:t>
       </w:r>
     </w:p>
     <w:p>
       <w:pPr>
-        <w:spacing w:before="120" w:after="200" w:line="240" w:lineRule="auto"/>
-        <w:jc w:val="center"/>
-      </w:pPr>
-      <w:r>
-        <w:rPr>
-          <w:rFonts w:ascii="Times New Roman" w:hAnsi="Times New Roman" w:cs="Times New Roman" w:eastAsia="Times New Roman"/>
-          <w:b w:val="0"/>
-          <w:i/>
-          <w:sz w:val="24"/>
+        <w:spacing w:before="0" w:after="0" w:line="240" w:lineRule="auto"/>
+        <w:ind w:left="340"/>
+      </w:pPr>
+      <w:r>
+        <w:rPr>
+          <w:rFonts w:ascii="Consolas" w:hAnsi="Consolas" w:cs="Consolas" w:eastAsia="Consolas"/>
+          <w:b w:val="0"/>
+          <w:i w:val="0"/>
+          <w:sz w:val="20"/>
         </w:rPr>
         <w:t xml:space="preserve">  |-- thesis/               &lt;- this thesis source</w:t>
       </w:r>
     </w:p>
     <w:p>
       <w:pPr>
-        <w:spacing w:before="120" w:after="200" w:line="240" w:lineRule="auto"/>
-        <w:jc w:val="center"/>
-      </w:pPr>
-      <w:r>
-        <w:rPr>
-          <w:rFonts w:ascii="Times New Roman" w:hAnsi="Times New Roman" w:cs="Times New Roman" w:eastAsia="Times New Roman"/>
-          <w:b w:val="0"/>
-          <w:i/>
-          <w:sz w:val="24"/>
+        <w:spacing w:before="0" w:after="0" w:line="240" w:lineRule="auto"/>
+        <w:ind w:left="340"/>
+      </w:pPr>
+      <w:r>
+        <w:rPr>
+          <w:rFonts w:ascii="Consolas" w:hAnsi="Consolas" w:cs="Consolas" w:eastAsia="Consolas"/>
+          <w:b w:val="0"/>
+          <w:i w:val="0"/>
+          <w:sz w:val="20"/>
         </w:rPr>
         <w:t xml:space="preserve">  |-- README.md</w:t>
       </w:r>
@@ -8675,15 +8224,15 @@
     </w:p>
     <w:p>
       <w:pPr>
-        <w:spacing w:before="120" w:after="200" w:line="240" w:lineRule="auto"/>
-        <w:jc w:val="center"/>
-      </w:pPr>
-      <w:r>
-        <w:rPr>
-          <w:rFonts w:ascii="Times New Roman" w:hAnsi="Times New Roman" w:cs="Times New Roman" w:eastAsia="Times New Roman"/>
-          <w:b w:val="0"/>
-          <w:i/>
-          <w:sz w:val="24"/>
+        <w:spacing w:before="0" w:after="0" w:line="240" w:lineRule="auto"/>
+        <w:ind w:left="340"/>
+      </w:pPr>
+      <w:r>
+        <w:rPr>
+          <w:rFonts w:ascii="Consolas" w:hAnsi="Consolas" w:cs="Consolas" w:eastAsia="Consolas"/>
+          <w:b w:val="0"/>
+          <w:i w:val="0"/>
+          <w:sz w:val="20"/>
         </w:rPr>
         <w:t>Table 9.1: Five-method comparison on KDD Cup 99 (single representative seed).</w:t>
       </w:r>
@@ -9114,15 +8663,15 @@
     </w:p>
     <w:p>
       <w:pPr>
-        <w:spacing w:before="120" w:after="200" w:line="240" w:lineRule="auto"/>
-        <w:jc w:val="center"/>
-      </w:pPr>
-      <w:r>
-        <w:rPr>
-          <w:rFonts w:ascii="Times New Roman" w:hAnsi="Times New Roman" w:cs="Times New Roman" w:eastAsia="Times New Roman"/>
-          <w:b w:val="0"/>
-          <w:i/>
-          <w:sz w:val="24"/>
+        <w:spacing w:before="0" w:after="0" w:line="240" w:lineRule="auto"/>
+        <w:ind w:left="340"/>
+      </w:pPr>
+      <w:r>
+        <w:rPr>
+          <w:rFonts w:ascii="Consolas" w:hAnsi="Consolas" w:cs="Consolas" w:eastAsia="Consolas"/>
+          <w:b w:val="0"/>
+          <w:i w:val="0"/>
+          <w:sz w:val="20"/>
         </w:rPr>
         <w:t>Table 9.2: HERO-S dataset selection.</w:t>
       </w:r>
@@ -9234,15 +8783,15 @@
     </w:p>
     <w:p>
       <w:pPr>
-        <w:spacing w:before="120" w:after="200" w:line="240" w:lineRule="auto"/>
-        <w:jc w:val="center"/>
-      </w:pPr>
-      <w:r>
-        <w:rPr>
-          <w:rFonts w:ascii="Times New Roman" w:hAnsi="Times New Roman" w:cs="Times New Roman" w:eastAsia="Times New Roman"/>
-          <w:b w:val="0"/>
-          <w:i/>
-          <w:sz w:val="24"/>
+        <w:spacing w:before="0" w:after="0" w:line="240" w:lineRule="auto"/>
+        <w:ind w:left="340"/>
+      </w:pPr>
+      <w:r>
+        <w:rPr>
+          <w:rFonts w:ascii="Consolas" w:hAnsi="Consolas" w:cs="Consolas" w:eastAsia="Consolas"/>
+          <w:b w:val="0"/>
+          <w:i w:val="0"/>
+          <w:sz w:val="20"/>
         </w:rPr>
         <w:t>score(r,v) = alpha*Q(v,r) + beta*R(v) - gamma*E(v,r) - delta*L(v,r) - eta*W(r) - zeta*S(v,r)</w:t>
       </w:r>
@@ -9279,15 +8828,15 @@
     </w:p>
     <w:p>
       <w:pPr>
-        <w:spacing w:before="120" w:after="200" w:line="240" w:lineRule="auto"/>
-        <w:jc w:val="center"/>
-      </w:pPr>
-      <w:r>
-        <w:rPr>
-          <w:rFonts w:ascii="Times New Roman" w:hAnsi="Times New Roman" w:cs="Times New Roman" w:eastAsia="Times New Roman"/>
-          <w:b w:val="0"/>
-          <w:i/>
-          <w:sz w:val="24"/>
+        <w:spacing w:before="0" w:after="0" w:line="240" w:lineRule="auto"/>
+        <w:ind w:left="340"/>
+      </w:pPr>
+      <w:r>
+        <w:rPr>
+          <w:rFonts w:ascii="Consolas" w:hAnsi="Consolas" w:cs="Consolas" w:eastAsia="Consolas"/>
+          <w:b w:val="0"/>
+          <w:i w:val="0"/>
+          <w:sz w:val="20"/>
         </w:rPr>
         <w:t>Table 9.3: 30-seed scheduler comparison at 250 ms QPU queue.</w:t>
       </w:r>
@@ -9691,90 +9240,90 @@
     </w:p>
     <w:p>
       <w:pPr>
-        <w:spacing w:before="120" w:after="200" w:line="240" w:lineRule="auto"/>
-        <w:jc w:val="center"/>
-      </w:pPr>
-      <w:r>
-        <w:rPr>
-          <w:rFonts w:ascii="Times New Roman" w:hAnsi="Times New Roman" w:cs="Times New Roman" w:eastAsia="Times New Roman"/>
-          <w:b w:val="0"/>
-          <w:i/>
-          <w:sz w:val="24"/>
+        <w:spacing w:before="0" w:after="0" w:line="240" w:lineRule="auto"/>
+        <w:ind w:left="340"/>
+      </w:pPr>
+      <w:r>
+        <w:rPr>
+          <w:rFonts w:ascii="Consolas" w:hAnsi="Consolas" w:cs="Consolas" w:eastAsia="Consolas"/>
+          <w:b w:val="0"/>
+          <w:i w:val="0"/>
+          <w:sz w:val="20"/>
         </w:rPr>
         <w:t>H = c0 II + c1 IZ + c2 ZI + c3 ZZ + c4 XX</w:t>
       </w:r>
     </w:p>
     <w:p>
       <w:pPr>
-        <w:spacing w:before="120" w:after="200" w:line="240" w:lineRule="auto"/>
-        <w:jc w:val="center"/>
-      </w:pPr>
-      <w:r>
-        <w:rPr>
-          <w:rFonts w:ascii="Times New Roman" w:hAnsi="Times New Roman" w:cs="Times New Roman" w:eastAsia="Times New Roman"/>
-          <w:b w:val="0"/>
-          <w:i/>
-          <w:sz w:val="24"/>
+        <w:spacing w:before="0" w:after="0" w:line="240" w:lineRule="auto"/>
+        <w:ind w:left="340"/>
+      </w:pPr>
+      <w:r>
+        <w:rPr>
+          <w:rFonts w:ascii="Consolas" w:hAnsi="Consolas" w:cs="Consolas" w:eastAsia="Consolas"/>
+          <w:b w:val="0"/>
+          <w:i w:val="0"/>
+          <w:sz w:val="20"/>
         </w:rPr>
         <w:t xml:space="preserve">  c0 = -1.0523732</w:t>
       </w:r>
     </w:p>
     <w:p>
       <w:pPr>
-        <w:spacing w:before="120" w:after="200" w:line="240" w:lineRule="auto"/>
-        <w:jc w:val="center"/>
-      </w:pPr>
-      <w:r>
-        <w:rPr>
-          <w:rFonts w:ascii="Times New Roman" w:hAnsi="Times New Roman" w:cs="Times New Roman" w:eastAsia="Times New Roman"/>
-          <w:b w:val="0"/>
-          <w:i/>
-          <w:sz w:val="24"/>
+        <w:spacing w:before="0" w:after="0" w:line="240" w:lineRule="auto"/>
+        <w:ind w:left="340"/>
+      </w:pPr>
+      <w:r>
+        <w:rPr>
+          <w:rFonts w:ascii="Consolas" w:hAnsi="Consolas" w:cs="Consolas" w:eastAsia="Consolas"/>
+          <w:b w:val="0"/>
+          <w:i w:val="0"/>
+          <w:sz w:val="20"/>
         </w:rPr>
         <w:t xml:space="preserve">  c1 =  0.39793742</w:t>
       </w:r>
     </w:p>
     <w:p>
       <w:pPr>
-        <w:spacing w:before="120" w:after="200" w:line="240" w:lineRule="auto"/>
-        <w:jc w:val="center"/>
-      </w:pPr>
-      <w:r>
-        <w:rPr>
-          <w:rFonts w:ascii="Times New Roman" w:hAnsi="Times New Roman" w:cs="Times New Roman" w:eastAsia="Times New Roman"/>
-          <w:b w:val="0"/>
-          <w:i/>
-          <w:sz w:val="24"/>
+        <w:spacing w:before="0" w:after="0" w:line="240" w:lineRule="auto"/>
+        <w:ind w:left="340"/>
+      </w:pPr>
+      <w:r>
+        <w:rPr>
+          <w:rFonts w:ascii="Consolas" w:hAnsi="Consolas" w:cs="Consolas" w:eastAsia="Consolas"/>
+          <w:b w:val="0"/>
+          <w:i w:val="0"/>
+          <w:sz w:val="20"/>
         </w:rPr>
         <w:t xml:space="preserve">  c2 = -0.39793742</w:t>
       </w:r>
     </w:p>
     <w:p>
       <w:pPr>
-        <w:spacing w:before="120" w:after="200" w:line="240" w:lineRule="auto"/>
-        <w:jc w:val="center"/>
-      </w:pPr>
-      <w:r>
-        <w:rPr>
-          <w:rFonts w:ascii="Times New Roman" w:hAnsi="Times New Roman" w:cs="Times New Roman" w:eastAsia="Times New Roman"/>
-          <w:b w:val="0"/>
-          <w:i/>
-          <w:sz w:val="24"/>
+        <w:spacing w:before="0" w:after="0" w:line="240" w:lineRule="auto"/>
+        <w:ind w:left="340"/>
+      </w:pPr>
+      <w:r>
+        <w:rPr>
+          <w:rFonts w:ascii="Consolas" w:hAnsi="Consolas" w:cs="Consolas" w:eastAsia="Consolas"/>
+          <w:b w:val="0"/>
+          <w:i w:val="0"/>
+          <w:sz w:val="20"/>
         </w:rPr>
         <w:t xml:space="preserve">  c3 = -0.0112801</w:t>
       </w:r>
     </w:p>
     <w:p>
       <w:pPr>
-        <w:spacing w:before="120" w:after="200" w:line="240" w:lineRule="auto"/>
-        <w:jc w:val="center"/>
-      </w:pPr>
-      <w:r>
-        <w:rPr>
-          <w:rFonts w:ascii="Times New Roman" w:hAnsi="Times New Roman" w:cs="Times New Roman" w:eastAsia="Times New Roman"/>
-          <w:b w:val="0"/>
-          <w:i/>
-          <w:sz w:val="24"/>
+        <w:spacing w:before="0" w:after="0" w:line="240" w:lineRule="auto"/>
+        <w:ind w:left="340"/>
+      </w:pPr>
+      <w:r>
+        <w:rPr>
+          <w:rFonts w:ascii="Consolas" w:hAnsi="Consolas" w:cs="Consolas" w:eastAsia="Consolas"/>
+          <w:b w:val="0"/>
+          <w:i w:val="0"/>
+          <w:sz w:val="20"/>
         </w:rPr>
         <w:t xml:space="preserve">  c4 =  0.18093119</w:t>
       </w:r>
@@ -9825,75 +9374,75 @@
     </w:p>
     <w:p>
       <w:pPr>
-        <w:spacing w:before="120" w:after="200" w:line="240" w:lineRule="auto"/>
-        <w:jc w:val="center"/>
-      </w:pPr>
-      <w:r>
-        <w:rPr>
-          <w:rFonts w:ascii="Times New Roman" w:hAnsi="Times New Roman" w:cs="Times New Roman" w:eastAsia="Times New Roman"/>
-          <w:b w:val="0"/>
-          <w:i/>
-          <w:sz w:val="24"/>
+        <w:spacing w:before="0" w:after="0" w:line="240" w:lineRule="auto"/>
+        <w:ind w:left="340"/>
+      </w:pPr>
+      <w:r>
+        <w:rPr>
+          <w:rFonts w:ascii="Consolas" w:hAnsi="Consolas" w:cs="Consolas" w:eastAsia="Consolas"/>
+          <w:b w:val="0"/>
+          <w:i w:val="0"/>
+          <w:sz w:val="20"/>
         </w:rPr>
         <w:t>qc.ry(theta_0, 0)</w:t>
       </w:r>
     </w:p>
     <w:p>
       <w:pPr>
-        <w:spacing w:before="120" w:after="200" w:line="240" w:lineRule="auto"/>
-        <w:jc w:val="center"/>
-      </w:pPr>
-      <w:r>
-        <w:rPr>
-          <w:rFonts w:ascii="Times New Roman" w:hAnsi="Times New Roman" w:cs="Times New Roman" w:eastAsia="Times New Roman"/>
-          <w:b w:val="0"/>
-          <w:i/>
-          <w:sz w:val="24"/>
+        <w:spacing w:before="0" w:after="0" w:line="240" w:lineRule="auto"/>
+        <w:ind w:left="340"/>
+      </w:pPr>
+      <w:r>
+        <w:rPr>
+          <w:rFonts w:ascii="Consolas" w:hAnsi="Consolas" w:cs="Consolas" w:eastAsia="Consolas"/>
+          <w:b w:val="0"/>
+          <w:i w:val="0"/>
+          <w:sz w:val="20"/>
         </w:rPr>
         <w:t>qc.ry(theta_1, 1)</w:t>
       </w:r>
     </w:p>
     <w:p>
       <w:pPr>
-        <w:spacing w:before="120" w:after="200" w:line="240" w:lineRule="auto"/>
-        <w:jc w:val="center"/>
-      </w:pPr>
-      <w:r>
-        <w:rPr>
-          <w:rFonts w:ascii="Times New Roman" w:hAnsi="Times New Roman" w:cs="Times New Roman" w:eastAsia="Times New Roman"/>
-          <w:b w:val="0"/>
-          <w:i/>
-          <w:sz w:val="24"/>
+        <w:spacing w:before="0" w:after="0" w:line="240" w:lineRule="auto"/>
+        <w:ind w:left="340"/>
+      </w:pPr>
+      <w:r>
+        <w:rPr>
+          <w:rFonts w:ascii="Consolas" w:hAnsi="Consolas" w:cs="Consolas" w:eastAsia="Consolas"/>
+          <w:b w:val="0"/>
+          <w:i w:val="0"/>
+          <w:sz w:val="20"/>
         </w:rPr>
         <w:t>qc.cx(0, 1)</w:t>
       </w:r>
     </w:p>
     <w:p>
       <w:pPr>
-        <w:spacing w:before="120" w:after="200" w:line="240" w:lineRule="auto"/>
-        <w:jc w:val="center"/>
-      </w:pPr>
-      <w:r>
-        <w:rPr>
-          <w:rFonts w:ascii="Times New Roman" w:hAnsi="Times New Roman" w:cs="Times New Roman" w:eastAsia="Times New Roman"/>
-          <w:b w:val="0"/>
-          <w:i/>
-          <w:sz w:val="24"/>
+        <w:spacing w:before="0" w:after="0" w:line="240" w:lineRule="auto"/>
+        <w:ind w:left="340"/>
+      </w:pPr>
+      <w:r>
+        <w:rPr>
+          <w:rFonts w:ascii="Consolas" w:hAnsi="Consolas" w:cs="Consolas" w:eastAsia="Consolas"/>
+          <w:b w:val="0"/>
+          <w:i w:val="0"/>
+          <w:sz w:val="20"/>
         </w:rPr>
         <w:t>qc.ry(theta_2, 0)</w:t>
       </w:r>
     </w:p>
     <w:p>
       <w:pPr>
-        <w:spacing w:before="120" w:after="200" w:line="240" w:lineRule="auto"/>
-        <w:jc w:val="center"/>
-      </w:pPr>
-      <w:r>
-        <w:rPr>
-          <w:rFonts w:ascii="Times New Roman" w:hAnsi="Times New Roman" w:cs="Times New Roman" w:eastAsia="Times New Roman"/>
-          <w:b w:val="0"/>
-          <w:i/>
-          <w:sz w:val="24"/>
+        <w:spacing w:before="0" w:after="0" w:line="240" w:lineRule="auto"/>
+        <w:ind w:left="340"/>
+      </w:pPr>
+      <w:r>
+        <w:rPr>
+          <w:rFonts w:ascii="Consolas" w:hAnsi="Consolas" w:cs="Consolas" w:eastAsia="Consolas"/>
+          <w:b w:val="0"/>
+          <w:i w:val="0"/>
+          <w:sz w:val="20"/>
         </w:rPr>
         <w:t>qc.ry(theta_3, 1)</w:t>
       </w:r>
@@ -9974,15 +9523,15 @@
     </w:p>
     <w:p>
       <w:pPr>
-        <w:spacing w:before="120" w:after="200" w:line="240" w:lineRule="auto"/>
-        <w:jc w:val="center"/>
-      </w:pPr>
-      <w:r>
-        <w:rPr>
-          <w:rFonts w:ascii="Times New Roman" w:hAnsi="Times New Roman" w:cs="Times New Roman" w:eastAsia="Times New Roman"/>
-          <w:b w:val="0"/>
-          <w:i/>
-          <w:sz w:val="24"/>
+        <w:spacing w:before="0" w:after="0" w:line="240" w:lineRule="auto"/>
+        <w:ind w:left="340"/>
+      </w:pPr>
+      <w:r>
+        <w:rPr>
+          <w:rFonts w:ascii="Consolas" w:hAnsi="Consolas" w:cs="Consolas" w:eastAsia="Consolas"/>
+          <w:b w:val="0"/>
+          <w:i w:val="0"/>
+          <w:sz w:val="20"/>
         </w:rPr>
         <w:t>&lt;H&gt;(theta) = sum_k c_k &lt;P_k&gt;(theta)</w:t>
       </w:r>
@@ -10077,15 +9626,15 @@
     </w:p>
     <w:p>
       <w:pPr>
-        <w:spacing w:before="120" w:after="200" w:line="240" w:lineRule="auto"/>
-        <w:jc w:val="center"/>
-      </w:pPr>
-      <w:r>
-        <w:rPr>
-          <w:rFonts w:ascii="Times New Roman" w:hAnsi="Times New Roman" w:cs="Times New Roman" w:eastAsia="Times New Roman"/>
-          <w:b w:val="0"/>
-          <w:i/>
-          <w:sz w:val="24"/>
+        <w:spacing w:before="0" w:after="0" w:line="240" w:lineRule="auto"/>
+        <w:ind w:left="340"/>
+      </w:pPr>
+      <w:r>
+        <w:rPr>
+          <w:rFonts w:ascii="Consolas" w:hAnsi="Consolas" w:cs="Consolas" w:eastAsia="Consolas"/>
+          <w:b w:val="0"/>
+          <w:i w:val="0"/>
+          <w:sz w:val="20"/>
         </w:rPr>
         <w:t>Table 10.1: VQE versus exact diagonalisation on H2 (30 seeds).</w:t>
       </w:r>
@@ -10619,166 +10168,6 @@
           <w:color w:val="141E33"/>
           <w:sz w:val="24"/>
         </w:rPr>
-        <w:t>11.2 Pareto Frontier</w:t>
-      </w:r>
-    </w:p>
-    <w:p>
-      <w:pPr>
-        <w:spacing w:before="0" w:after="200" w:line="240" w:lineRule="auto"/>
-      </w:pPr>
-      <w:r>
-        <w:rPr>
-          <w:rFonts w:ascii="Times New Roman" w:hAnsi="Times New Roman" w:cs="Times New Roman" w:eastAsia="Times New Roman"/>
-          <w:b w:val="0"/>
-          <w:i w:val="0"/>
-          <w:sz w:val="24"/>
-        </w:rPr>
-        <w:t>The Pareto frontier formalises the verdict comparison from Section 11.1. A method is Pareto-optimal on a workload if no other method beats it on every cost axis simultaneously. Methods that are dominated, that is, beaten on every axis by at least one other method, can be dropped from the deployment menu without loss.</w:t>
-      </w:r>
-    </w:p>
-    <w:p>
-      <w:pPr>
-        <w:pStyle w:val="Heading3"/>
-        <w:spacing w:before="80" w:after="40" w:line="240" w:lineRule="auto"/>
-      </w:pPr>
-      <w:r>
-        <w:rPr>
-          <w:rFonts w:ascii="Times New Roman" w:hAnsi="Times New Roman" w:cs="Times New Roman" w:eastAsia="Times New Roman"/>
-          <w:b/>
-          <w:i w:val="0"/>
-          <w:color w:val="141E33"/>
-          <w:sz w:val="22"/>
-        </w:rPr>
-        <w:t>Cybersecurity Pareto Frontier</w:t>
-      </w:r>
-    </w:p>
-    <w:p>
-      <w:pPr>
-        <w:spacing w:before="0" w:after="200" w:line="240" w:lineRule="auto"/>
-      </w:pPr>
-      <w:r>
-        <w:rPr>
-          <w:rFonts w:ascii="Times New Roman" w:hAnsi="Times New Roman" w:cs="Times New Roman" w:eastAsia="Times New Roman"/>
-          <w:b w:val="0"/>
-          <w:i w:val="0"/>
-          <w:sz w:val="24"/>
-        </w:rPr>
-        <w:t>Projecting the five-method comparison from Section 9.4 onto the four-axis space of (cost, energy, latency, -F1) the Pareto-optimal set is {Classical SVM, Random Forest}. Classical SVM is the cheapest on cost ($1.99 per million tasks at AWS spot CPU pricing), the lowest on energy (0.6445 J), and the lowest on latency (5.1 ms) but trails on F1 at 0.9744. Random Forest is the highest on F1 (0.9981) but more expensive on every other axis ($49 per million tasks, 22.09 J, 175.4 ms). Gradient Boosting and KNN are strictly dominated: GBM is beaten by RF on F1 and on energy; KNN is beaten by RF on F1 and by SVM on every cost axis. The QSVM is dominated by every classical baseline on every axis.</w:t>
-      </w:r>
-    </w:p>
-    <w:p>
-      <w:pPr>
-        <w:spacing w:before="0" w:after="200" w:line="240" w:lineRule="auto"/>
-      </w:pPr>
-      <w:r>
-        <w:rPr>
-          <w:rFonts w:ascii="Times New Roman" w:hAnsi="Times New Roman" w:cs="Times New Roman" w:eastAsia="Times New Roman"/>
-          <w:b w:val="0"/>
-          <w:i w:val="0"/>
-          <w:sz w:val="24"/>
-        </w:rPr>
-        <w:t>Operational use of the Pareto frontier follows immediately. If the latency budget is below 100 ms and an F1 of 0.97 is acceptable, choose the classical SVM. If F1 of 0.998 is required, choose Random Forest. The QSVM is never selected on this workload at this hardware generation.</w:t>
-      </w:r>
-    </w:p>
-    <w:p>
-      <w:pPr>
-        <w:spacing w:before="160" w:after="40"/>
-        <w:jc w:val="center"/>
-      </w:pPr>
-      <w:r>
-        <w:drawing>
-          <wp:inline xmlns:a="http://schemas.openxmlformats.org/drawingml/2006/main" xmlns:pic="http://schemas.openxmlformats.org/drawingml/2006/picture">
-            <wp:extent cx="5202650" cy="3473760"/>
-            <wp:docPr id="9" name="Picture 9"/>
-            <wp:cNvGraphicFramePr>
-              <a:graphicFrameLocks noChangeAspect="1"/>
-            </wp:cNvGraphicFramePr>
-            <a:graphic>
-              <a:graphicData uri="http://schemas.openxmlformats.org/drawingml/2006/picture">
-                <pic:pic>
-                  <pic:nvPicPr>
-                    <pic:cNvPr id="0" name="pareto_frontier.png"/>
-                    <pic:cNvPicPr/>
-                  </pic:nvPicPr>
-                  <pic:blipFill>
-                    <a:blip r:embed="rId10"/>
-                    <a:stretch>
-                      <a:fillRect/>
-                    </a:stretch>
-                  </pic:blipFill>
-                  <pic:spPr>
-                    <a:xfrm>
-                      <a:off x="0" y="0"/>
-                      <a:ext cx="5202650" cy="3473760"/>
-                    </a:xfrm>
-                    <a:prstGeom prst="rect"/>
-                  </pic:spPr>
-                </pic:pic>
-              </a:graphicData>
-            </a:graphic>
-          </wp:inline>
-        </w:drawing>
-      </w:r>
-    </w:p>
-    <w:p>
-      <w:pPr>
-        <w:spacing w:before="40" w:after="240"/>
-        <w:jc w:val="center"/>
-      </w:pPr>
-      <w:r>
-        <w:rPr>
-          <w:rFonts w:ascii="Times New Roman" w:hAnsi="Times New Roman" w:cs="Times New Roman" w:eastAsia="Times New Roman"/>
-          <w:b w:val="0"/>
-          <w:i/>
-          <w:color w:val="404040"/>
-          <w:sz w:val="20"/>
-        </w:rPr>
-        <w:t>Figure 11.1: Pareto frontier on the cybersecurity workload (energy vs F1). Pareto-optimal: SVM (cheapest) and Random Forest (highest accuracy). Dominated: GBM, KNN, QSVM.</w:t>
-      </w:r>
-    </w:p>
-    <w:p>
-      <w:pPr>
-        <w:pStyle w:val="Heading3"/>
-        <w:spacing w:before="80" w:after="40" w:line="240" w:lineRule="auto"/>
-      </w:pPr>
-      <w:r>
-        <w:rPr>
-          <w:rFonts w:ascii="Times New Roman" w:hAnsi="Times New Roman" w:cs="Times New Roman" w:eastAsia="Times New Roman"/>
-          <w:b/>
-          <w:i w:val="0"/>
-          <w:color w:val="141E33"/>
-          <w:sz w:val="22"/>
-        </w:rPr>
-        <w:t>Molecular Pareto Frontier</w:t>
-      </w:r>
-    </w:p>
-    <w:p>
-      <w:pPr>
-        <w:spacing w:before="0" w:after="200" w:line="240" w:lineRule="auto"/>
-      </w:pPr>
-      <w:r>
-        <w:rPr>
-          <w:rFonts w:ascii="Times New Roman" w:hAnsi="Times New Roman" w:cs="Times New Roman" w:eastAsia="Times New Roman"/>
-          <w:b w:val="0"/>
-          <w:i w:val="0"/>
-          <w:sz w:val="24"/>
-        </w:rPr>
-        <w:t>On H2 the Pareto-optimal set is {classical exact diagonalisation, VQE}. Classical wins on every cost axis and ties on accuracy (both reach the exact ground state within chemical accuracy), so VQE is dominated for H2. The frontier collapses to a single point: classical diagonalisation. But the result is misleading at the level of the methodology, because the same Pareto computation on a 50-qubit molecule has the opposite outcome: classical exact diagonalisation is infeasible (16 PB RAM), and VQE is the only Pareto-optimal option. The Pareto analysis is problem-size dependent in a way that the cybersecurity Pareto analysis is not, and that dependence is what makes the molecular workload strategically interesting despite today's H2 result.</w:t>
-      </w:r>
-    </w:p>
-    <w:p>
-      <w:pPr>
-        <w:pStyle w:val="Heading2"/>
-        <w:spacing w:before="80" w:after="40" w:line="240" w:lineRule="auto"/>
-      </w:pPr>
-      <w:r>
-        <w:rPr>
-          <w:rFonts w:ascii="Times New Roman" w:hAnsi="Times New Roman" w:cs="Times New Roman" w:eastAsia="Times New Roman"/>
-          <w:b/>
-          <w:i w:val="0"/>
-          <w:color w:val="141E33"/>
-          <w:sz w:val="24"/>
-        </w:rPr>
         <w:t>11.3 Workload-Aware Allocation Rule</w:t>
       </w:r>
     </w:p>
@@ -10986,7 +10375,7 @@
         <w:drawing>
           <wp:inline xmlns:a="http://schemas.openxmlformats.org/drawingml/2006/main" xmlns:pic="http://schemas.openxmlformats.org/drawingml/2006/picture">
             <wp:extent cx="5202650" cy="3308775"/>
-            <wp:docPr id="10" name="Picture 10"/>
+            <wp:docPr id="9" name="Picture 9"/>
             <wp:cNvGraphicFramePr>
               <a:graphicFrameLocks noChangeAspect="1"/>
             </wp:cNvGraphicFramePr>
@@ -11192,7 +10581,7 @@
         <w:drawing>
           <wp:inline xmlns:a="http://schemas.openxmlformats.org/drawingml/2006/main" xmlns:pic="http://schemas.openxmlformats.org/drawingml/2006/picture">
             <wp:extent cx="5202650" cy="3222096"/>
-            <wp:docPr id="11" name="Picture 11"/>
+            <wp:docPr id="10" name="Picture 10"/>
             <wp:cNvGraphicFramePr>
               <a:graphicFrameLocks noChangeAspect="1"/>
             </wp:cNvGraphicFramePr>
@@ -11248,7 +10637,7 @@
         <w:drawing>
           <wp:inline xmlns:a="http://schemas.openxmlformats.org/drawingml/2006/main" xmlns:pic="http://schemas.openxmlformats.org/drawingml/2006/picture">
             <wp:extent cx="5202650" cy="3038799"/>
-            <wp:docPr id="12" name="Picture 12"/>
+            <wp:docPr id="11" name="Picture 11"/>
             <wp:cNvGraphicFramePr>
               <a:graphicFrameLocks noChangeAspect="1"/>
             </wp:cNvGraphicFramePr>
@@ -11411,164 +10800,6 @@
           <w:color w:val="141E33"/>
           <w:sz w:val="24"/>
         </w:rPr>
-        <w:t>12.2 Implications for Quantum Researchers</w:t>
-      </w:r>
-    </w:p>
-    <w:p>
-      <w:pPr>
-        <w:spacing w:before="0" w:after="200" w:line="240" w:lineRule="auto"/>
-      </w:pPr>
-      <w:r>
-        <w:rPr>
-          <w:rFonts w:ascii="Times New Roman" w:hAnsi="Times New Roman" w:cs="Times New Roman" w:eastAsia="Times New Roman"/>
-          <w:b w:val="0"/>
-          <w:i w:val="0"/>
-          <w:sz w:val="24"/>
-        </w:rPr>
-        <w:t>The cybersecurity QSVM result is, on its face, discouraging: a 12,970x energy disadvantage and a 1.06 million times cost disadvantage against a Random Forest baseline that also achieves higher F1. This verdict is unlikely to flip for low-dimensional tabular data in the next five to ten years, even with substantial improvements in QPU clock speed and queue overhead, because the underlying classical baseline is itself improving and because kernel non-classicality has no theoretical motivation when the feature space is small and dense. Research effort spent on QSVM for KDD-style data is unlikely to produce a publishable advantage.</w:t>
-      </w:r>
-    </w:p>
-    <w:p>
-      <w:pPr>
-        <w:spacing w:before="0" w:after="200" w:line="240" w:lineRule="auto"/>
-      </w:pPr>
-      <w:r>
-        <w:rPr>
-          <w:rFonts w:ascii="Times New Roman" w:hAnsi="Times New Roman" w:cs="Times New Roman" w:eastAsia="Times New Roman"/>
-          <w:b w:val="0"/>
-          <w:i w:val="0"/>
-          <w:sz w:val="24"/>
-        </w:rPr>
-        <w:t>A more productive direction is QSVM on high-dimensional structured data where quantum kernel non-classicality is theoretically motivated -- for example, molecular fingerprints, quantum-state tomography data, and certain graph-structured inputs with exponential classical feature maps. Liu, Arunachalam, and Temme [36] gave the first rigorous quantum speed-up for a learning problem; subsequent work should target instances of similar structure rather than re-run QSVM on whatever tabular benchmark is available.</w:t>
-      </w:r>
-    </w:p>
-    <w:p>
-      <w:pPr>
-        <w:spacing w:before="0" w:after="200" w:line="240" w:lineRule="auto"/>
-      </w:pPr>
-      <w:r>
-        <w:rPr>
-          <w:rFonts w:ascii="Times New Roman" w:hAnsi="Times New Roman" w:cs="Times New Roman" w:eastAsia="Times New Roman"/>
-          <w:b w:val="0"/>
-          <w:i w:val="0"/>
-          <w:sz w:val="24"/>
-        </w:rPr>
-        <w:t>The molecular simulation result is the more concrete near-term opportunity. Classical exact diagonalisation wins for H2 in this thesis, but the cross-over arrives quickly: at roughly fifty qubits the classical state vector exceeds the memory of any single node, and at roughly seventy qubits no datacentre on the planet can hold the state in RAM. VQE, quantum phase estimation, and adiabatic state preparation for chemistry are areas in which quantum hardware has a real polynomial-versus-exponential argument behind it, and where modest hardware improvements can translate into real scientific results.</w:t>
-      </w:r>
-    </w:p>
-    <w:p>
-      <w:pPr>
-        <w:spacing w:before="0" w:after="200" w:line="240" w:lineRule="auto"/>
-      </w:pPr>
-      <w:r>
-        <w:rPr>
-          <w:rFonts w:ascii="Times New Roman" w:hAnsi="Times New Roman" w:cs="Times New Roman" w:eastAsia="Times New Roman"/>
-          <w:b w:val="0"/>
-          <w:i w:val="0"/>
-          <w:sz w:val="24"/>
-        </w:rPr>
-        <w:t>Reproducible measurement matters. The quantum-machine-learning literature has been criticised for hyped accuracy claims, weak or absent classical baselines, and selective reporting of favourable seeds. Frameworks like HERO -- thirty-seed validation, paired Wilcoxon non-parametric tests, an explicit set of strong classical baselines (Random Forest, Gradient Boosting, KNN, SVM, plus an uncertainty-cascade ensemble), and joint reporting of accuracy, energy, latency, and cost -- raise the floor of what a credible empirical claim looks like. Researchers proposing a new quantum method should report at least these axes on at least these baselines.</w:t>
-      </w:r>
-    </w:p>
-    <w:p>
-      <w:pPr>
-        <w:spacing w:before="0" w:after="200" w:line="240" w:lineRule="auto"/>
-      </w:pPr>
-      <w:r>
-        <w:rPr>
-          <w:rFonts w:ascii="Times New Roman" w:hAnsi="Times New Roman" w:cs="Times New Roman" w:eastAsia="Times New Roman"/>
-          <w:b w:val="0"/>
-          <w:i w:val="0"/>
-          <w:sz w:val="24"/>
-        </w:rPr>
-        <w:t>Energy and cost reporting should be standard. Strubell, Ganesh, and McCallum [24] established this norm for natural-language processing in 2019; HERO extends it to quantum-classical hybrid pipelines. The quantum-energy-initiative argument made by Auffeves [23] points the same direction: a quantum result that consumes one hundred times more energy than its classical counterpart and yields a smaller F1 is not a result, it is a research curiosity, and it should be labelled as such.</w:t>
-      </w:r>
-    </w:p>
-    <w:p>
-      <w:pPr>
-        <w:pStyle w:val="Heading2"/>
-        <w:spacing w:before="80" w:after="40" w:line="240" w:lineRule="auto"/>
-      </w:pPr>
-      <w:r>
-        <w:rPr>
-          <w:rFonts w:ascii="Times New Roman" w:hAnsi="Times New Roman" w:cs="Times New Roman" w:eastAsia="Times New Roman"/>
-          <w:b/>
-          <w:i w:val="0"/>
-          <w:color w:val="141E33"/>
-          <w:sz w:val="24"/>
-        </w:rPr>
-        <w:t>12.3 Implications for Cybersecurity Practitioners</w:t>
-      </w:r>
-    </w:p>
-    <w:p>
-      <w:pPr>
-        <w:spacing w:before="0" w:after="200" w:line="240" w:lineRule="auto"/>
-      </w:pPr>
-      <w:r>
-        <w:rPr>
-          <w:rFonts w:ascii="Times New Roman" w:hAnsi="Times New Roman" w:cs="Times New Roman" w:eastAsia="Times New Roman"/>
-          <w:b w:val="0"/>
-          <w:i w:val="0"/>
-          <w:sz w:val="24"/>
-        </w:rPr>
-        <w:t>The practical recommendation for an enterprise security team in 2026 is straightforward: deploy a Random Forest or Gradient Boosting classifier on a CPU or GPU instance for network intrusion detection. F1 scores in the range 0.99 to 0.998 are operationally sufficient for most enterprise environments, latency under 200 milliseconds accommodates real-time alerting in the gateway path, and the entire pipeline fits inside the energy and cost envelope of a standard cloud-managed SIEM.</w:t>
-      </w:r>
-    </w:p>
-    <w:p>
-      <w:pPr>
-        <w:spacing w:before="0" w:after="200" w:line="240" w:lineRule="auto"/>
-      </w:pPr>
-      <w:r>
-        <w:rPr>
-          <w:rFonts w:ascii="Times New Roman" w:hAnsi="Times New Roman" w:cs="Times New Roman" w:eastAsia="Times New Roman"/>
-          <w:b w:val="0"/>
-          <w:i w:val="0"/>
-          <w:sz w:val="24"/>
-        </w:rPr>
-        <w:t>HERO-S routing adds operational value when the deployment has heterogeneous risk profiles -- for example, industrial-control PLCs and edge sensors that warrant different latency and false-negative budgets -- or when the gateway has a strict sub-five-millisecond budget for inline filtering. The security-risk-weighted route contract in Chapter 7 lets a team encode business priorities (a missed attack on a controller is worth far more than a missed attack on a print queue) directly into the routing decision rather than embedding them in tribal knowledge.</w:t>
-      </w:r>
-    </w:p>
-    <w:p>
-      <w:pPr>
-        <w:spacing w:before="0" w:after="200" w:line="240" w:lineRule="auto"/>
-      </w:pPr>
-      <w:r>
-        <w:rPr>
-          <w:rFonts w:ascii="Times New Roman" w:hAnsi="Times New Roman" w:cs="Times New Roman" w:eastAsia="Times New Roman"/>
-          <w:b w:val="0"/>
-          <w:i w:val="0"/>
-          <w:sz w:val="24"/>
-        </w:rPr>
-        <w:t>QSVM should not be deployed in production for intrusion detection today. The roughly fifty-percent recall observed in Chapter 9 means the model misses half the attacks; this is unacceptable for any security-critical deployment. The right use of a QSVM pipeline in 2026 is as an internal R&amp;D testbed -- a way of building team expertise and evaluation tooling so that when QPU hardware does mature, the organisation is ready to re-measure under the same HERO protocol and decide whether the case has changed.</w:t>
-      </w:r>
-    </w:p>
-    <w:p>
-      <w:pPr>
-        <w:spacing w:before="0" w:after="200" w:line="240" w:lineRule="auto"/>
-      </w:pPr>
-      <w:r>
-        <w:rPr>
-          <w:rFonts w:ascii="Times New Roman" w:hAnsi="Times New Roman" w:cs="Times New Roman" w:eastAsia="Times New Roman"/>
-          <w:b w:val="0"/>
-          <w:i w:val="0"/>
-          <w:sz w:val="24"/>
-        </w:rPr>
-        <w:t>Audit trails matter. HERO-S's per-flow routing decision can be traced to a small number of numeric fields (security risk, latency budget, payload size, queue depth), and the eventual classifier output can be linked back to the route taken. Auditable security tooling supports compliance frameworks such as NIST CSF and ISO/IEC 27001 better than black-box models, and is increasingly a procurement requirement for regulated-industry buyers.</w:t>
-      </w:r>
-    </w:p>
-    <w:p>
-      <w:pPr>
-        <w:pStyle w:val="Heading2"/>
-        <w:spacing w:before="80" w:after="40" w:line="240" w:lineRule="auto"/>
-      </w:pPr>
-      <w:r>
-        <w:rPr>
-          <w:rFonts w:ascii="Times New Roman" w:hAnsi="Times New Roman" w:cs="Times New Roman" w:eastAsia="Times New Roman"/>
-          <w:b/>
-          <w:i w:val="0"/>
-          <w:color w:val="141E33"/>
-          <w:sz w:val="24"/>
-        </w:rPr>
         <w:t>12.4 Threats to Validity</w:t>
       </w:r>
     </w:p>
@@ -12097,216 +11328,6 @@
           <w:color w:val="141E33"/>
           <w:sz w:val="24"/>
         </w:rPr>
-        <w:t>13.4 Future Work: Additional Workloads</w:t>
-      </w:r>
-    </w:p>
-    <w:p>
-      <w:pPr>
-        <w:spacing w:before="0" w:after="200" w:line="240" w:lineRule="auto"/>
-      </w:pPr>
-      <w:r>
-        <w:rPr>
-          <w:rFonts w:ascii="Times New Roman" w:hAnsi="Times New Roman" w:cs="Times New Roman" w:eastAsia="Times New Roman"/>
-          <w:b w:val="0"/>
-          <w:i w:val="0"/>
-          <w:sz w:val="24"/>
-        </w:rPr>
-        <w:t>HERO is designed to take new workloads as plug-ins. The following extensions are immediate near-term targets, all of which can re-use the existing measurement and reporting machinery without modification.</w:t>
-      </w:r>
-    </w:p>
-    <w:p>
-      <w:pPr>
-        <w:pStyle w:val="ListBullet"/>
-        <w:spacing w:line="360" w:lineRule="auto" w:after="80"/>
-      </w:pPr>
-      <w:r>
-        <w:rPr>
-          <w:rFonts w:ascii="Times New Roman" w:hAnsi="Times New Roman" w:cs="Times New Roman" w:eastAsia="Times New Roman"/>
-          <w:b w:val="0"/>
-          <w:i w:val="0"/>
-          <w:sz w:val="24"/>
-        </w:rPr>
-        <w:t>Quantum chemistry. Run VQE on LiH (12 qubits), BeH2 (15 qubits), and N2 (20 qubits) to map the polynomial-versus-exponential cross-over empirically rather than via the analytical projection in Section 11.4.</w:t>
-      </w:r>
-    </w:p>
-    <w:p>
-      <w:pPr>
-        <w:pStyle w:val="ListBullet"/>
-        <w:spacing w:line="360" w:lineRule="auto" w:after="80"/>
-      </w:pPr>
-      <w:r>
-        <w:rPr>
-          <w:rFonts w:ascii="Times New Roman" w:hAnsi="Times New Roman" w:cs="Times New Roman" w:eastAsia="Times New Roman"/>
-          <w:b w:val="0"/>
-          <w:i w:val="0"/>
-          <w:sz w:val="24"/>
-        </w:rPr>
-        <w:t>Quantum optimisation. Apply QAOA to graph colouring, Max-3-SAT, and traffic-routing instances at n equals 20, 30, and 40 nodes, with strong classical baselines (greedy, simulated annealing, ILP) reported under the same protocol.</w:t>
-      </w:r>
-    </w:p>
-    <w:p>
-      <w:pPr>
-        <w:pStyle w:val="ListBullet"/>
-        <w:spacing w:line="360" w:lineRule="auto" w:after="80"/>
-      </w:pPr>
-      <w:r>
-        <w:rPr>
-          <w:rFonts w:ascii="Times New Roman" w:hAnsi="Times New Roman" w:cs="Times New Roman" w:eastAsia="Times New Roman"/>
-          <w:b w:val="0"/>
-          <w:i w:val="0"/>
-          <w:sz w:val="24"/>
-        </w:rPr>
-        <w:t>Quantum machine learning beyond QSVM. Variational quantum classifiers, quantum neural networks, and quantum reinforcement-learning agents are all candidate workloads.</w:t>
-      </w:r>
-    </w:p>
-    <w:p>
-      <w:pPr>
-        <w:pStyle w:val="ListBullet"/>
-        <w:spacing w:line="360" w:lineRule="auto" w:after="80"/>
-      </w:pPr>
-      <w:r>
-        <w:rPr>
-          <w:rFonts w:ascii="Times New Roman" w:hAnsi="Times New Roman" w:cs="Times New Roman" w:eastAsia="Times New Roman"/>
-          <w:b w:val="0"/>
-          <w:i w:val="0"/>
-          <w:sz w:val="24"/>
-        </w:rPr>
-        <w:t>Cybersecurity beyond intrusion detection. Quantum-aided malware classification, quantum-enhanced vulnerability scanning, and quantum-accelerated cryptanalysis (informational only -- not for offensive use) are within scope.</w:t>
-      </w:r>
-    </w:p>
-    <w:p>
-      <w:pPr>
-        <w:pStyle w:val="ListBullet"/>
-        <w:spacing w:line="360" w:lineRule="auto" w:after="80"/>
-      </w:pPr>
-      <w:r>
-        <w:rPr>
-          <w:rFonts w:ascii="Times New Roman" w:hAnsi="Times New Roman" w:cs="Times New Roman" w:eastAsia="Times New Roman"/>
-          <w:b w:val="0"/>
-          <w:i w:val="0"/>
-          <w:sz w:val="24"/>
-        </w:rPr>
-        <w:t>IoT-specific datasets. Extend HERO-S to N-BaIoT, BoT-IoT, and 5G-NIDD to validate routing generalisation across device classes and protocol families.</w:t>
-      </w:r>
-    </w:p>
-    <w:p>
-      <w:pPr>
-        <w:pStyle w:val="Heading2"/>
-        <w:spacing w:before="80" w:after="40" w:line="240" w:lineRule="auto"/>
-      </w:pPr>
-      <w:r>
-        <w:rPr>
-          <w:rFonts w:ascii="Times New Roman" w:hAnsi="Times New Roman" w:cs="Times New Roman" w:eastAsia="Times New Roman"/>
-          <w:b/>
-          <w:i w:val="0"/>
-          <w:color w:val="141E33"/>
-          <w:sz w:val="24"/>
-        </w:rPr>
-        <w:t>13.5 Future Work: Production Deployment</w:t>
-      </w:r>
-    </w:p>
-    <w:p>
-      <w:pPr>
-        <w:spacing w:before="0" w:after="200" w:line="240" w:lineRule="auto"/>
-      </w:pPr>
-      <w:r>
-        <w:rPr>
-          <w:rFonts w:ascii="Times New Roman" w:hAnsi="Times New Roman" w:cs="Times New Roman" w:eastAsia="Times New Roman"/>
-          <w:b w:val="0"/>
-          <w:i w:val="0"/>
-          <w:sz w:val="24"/>
-        </w:rPr>
-        <w:t>Moving HERO from a research artefact to a production orchestrator requires engineering work in five well-scoped areas.</w:t>
-      </w:r>
-    </w:p>
-    <w:p>
-      <w:pPr>
-        <w:pStyle w:val="ListBullet"/>
-        <w:spacing w:line="360" w:lineRule="auto" w:after="80"/>
-      </w:pPr>
-      <w:r>
-        <w:rPr>
-          <w:rFonts w:ascii="Times New Roman" w:hAnsi="Times New Roman" w:cs="Times New Roman" w:eastAsia="Times New Roman"/>
-          <w:b w:val="0"/>
-          <w:i w:val="0"/>
-          <w:sz w:val="24"/>
-        </w:rPr>
-        <w:t>Containerise HERO as a Kubernetes operator that exposes the route contract as a Custom Resource Definition. Each routing decision becomes a Kubernetes object that can be inspected, audited, and rolled back.</w:t>
-      </w:r>
-    </w:p>
-    <w:p>
-      <w:pPr>
-        <w:pStyle w:val="ListBullet"/>
-        <w:spacing w:line="360" w:lineRule="auto" w:after="80"/>
-      </w:pPr>
-      <w:r>
-        <w:rPr>
-          <w:rFonts w:ascii="Times New Roman" w:hAnsi="Times New Roman" w:cs="Times New Roman" w:eastAsia="Times New Roman"/>
-          <w:b w:val="0"/>
-          <w:i w:val="0"/>
-          <w:sz w:val="24"/>
-        </w:rPr>
-        <w:t>Integrate with cloud orchestration: Apache Airflow, Prefect, or AWS Step Functions for production workflow management.</w:t>
-      </w:r>
-    </w:p>
-    <w:p>
-      <w:pPr>
-        <w:pStyle w:val="ListBullet"/>
-        <w:spacing w:line="360" w:lineRule="auto" w:after="80"/>
-      </w:pPr>
-      <w:r>
-        <w:rPr>
-          <w:rFonts w:ascii="Times New Roman" w:hAnsi="Times New Roman" w:cs="Times New Roman" w:eastAsia="Times New Roman"/>
-          <w:b w:val="0"/>
-          <w:i w:val="0"/>
-          <w:sz w:val="24"/>
-        </w:rPr>
-        <w:t>RAPL and NVML live energy telemetry. Replace the modelled per-tier energy averages with real per-task power readings from Intel RAPL on the CPU side and NVIDIA NVML on the GPU side.</w:t>
-      </w:r>
-    </w:p>
-    <w:p>
-      <w:pPr>
-        <w:pStyle w:val="ListBullet"/>
-        <w:spacing w:line="360" w:lineRule="auto" w:after="80"/>
-      </w:pPr>
-      <w:r>
-        <w:rPr>
-          <w:rFonts w:ascii="Times New Roman" w:hAnsi="Times New Roman" w:cs="Times New Roman" w:eastAsia="Times New Roman"/>
-          <w:b w:val="0"/>
-          <w:i w:val="0"/>
-          <w:sz w:val="24"/>
-        </w:rPr>
-        <w:t>Cloud billing API integration. Pull real-time pricing from the AWS, IBM, and Azure SDKs instead of the static dictionary in cloud_costs.py, so that the cost model tracks vendor pricing without manual updates.</w:t>
-      </w:r>
-    </w:p>
-    <w:p>
-      <w:pPr>
-        <w:pStyle w:val="ListBullet"/>
-        <w:spacing w:line="360" w:lineRule="auto" w:after="80"/>
-      </w:pPr>
-      <w:r>
-        <w:rPr>
-          <w:rFonts w:ascii="Times New Roman" w:hAnsi="Times New Roman" w:cs="Times New Roman" w:eastAsia="Times New Roman"/>
-          <w:b w:val="0"/>
-          <w:i w:val="0"/>
-          <w:sz w:val="24"/>
-        </w:rPr>
-        <w:t>Multi-tenancy and SLA. Extend Algorithm 1 to handle multi-tenant scheduling under per-tenant cost budgets, fair-share queueing across tenants, and per-tenant audit reports.</w:t>
-      </w:r>
-    </w:p>
-    <w:p>
-      <w:pPr>
-        <w:pStyle w:val="Heading2"/>
-        <w:spacing w:before="80" w:after="40" w:line="240" w:lineRule="auto"/>
-      </w:pPr>
-      <w:r>
-        <w:rPr>
-          <w:rFonts w:ascii="Times New Roman" w:hAnsi="Times New Roman" w:cs="Times New Roman" w:eastAsia="Times New Roman"/>
-          <w:b/>
-          <w:i w:val="0"/>
-          <w:color w:val="141E33"/>
-          <w:sz w:val="24"/>
-        </w:rPr>
         <w:t>13.6 Closing Remarks</w:t>
       </w:r>
     </w:p>
@@ -12866,261 +11887,6 @@
     </w:p>
     <w:p>
       <w:pPr>
-        <w:spacing w:before="0" w:after="80" w:line="240" w:lineRule="auto"/>
-        <w:ind w:left="480" w:hanging="480"/>
-      </w:pPr>
-      <w:r>
-        <w:rPr>
-          <w:rFonts w:ascii="Times New Roman" w:hAnsi="Times New Roman" w:cs="Times New Roman" w:eastAsia="Times New Roman"/>
-          <w:b w:val="0"/>
-          <w:i w:val="0"/>
-          <w:sz w:val="20"/>
-        </w:rPr>
-        <w:t>[34] Microsoft, "Azure Quantum pricing," Microsoft Azure, 2026. [Online]. Available: https://azure.microsoft.com/en-us/pricing/details/azure-quantum/</w:t>
-      </w:r>
-    </w:p>
-    <w:p>
-      <w:pPr>
-        <w:spacing w:before="0" w:after="80" w:line="240" w:lineRule="auto"/>
-        <w:ind w:left="480" w:hanging="480"/>
-      </w:pPr>
-      <w:r>
-        <w:rPr>
-          <w:rFonts w:ascii="Times New Roman" w:hAnsi="Times New Roman" w:cs="Times New Roman" w:eastAsia="Times New Roman"/>
-          <w:b w:val="0"/>
-          <w:i w:val="0"/>
-          <w:sz w:val="20"/>
-        </w:rPr>
-        <w:t>[35] M. Cerezo et al., "Variational quantum algorithms," Nat. Rev. Phys., vol. 3, no. 9, pp. 625-644, Sep. 2021, doi: 10.1038/s42254-021-00348-9.</w:t>
-      </w:r>
-    </w:p>
-    <w:p>
-      <w:pPr>
-        <w:spacing w:before="0" w:after="80" w:line="240" w:lineRule="auto"/>
-        <w:ind w:left="480" w:hanging="480"/>
-      </w:pPr>
-      <w:r>
-        <w:rPr>
-          <w:rFonts w:ascii="Times New Roman" w:hAnsi="Times New Roman" w:cs="Times New Roman" w:eastAsia="Times New Roman"/>
-          <w:b w:val="0"/>
-          <w:i w:val="0"/>
-          <w:sz w:val="20"/>
-        </w:rPr>
-        <w:t>[36] J. Liu, A. Arunachalam, and K. Temme, "A rigorous and robust quantum speed-up in supervised machine learning," Nat. Phys., vol. 17, no. 9, pp. 1013-1017, Sep. 2021, doi: 10.1038/s41567-021-01287-z.</w:t>
-      </w:r>
-    </w:p>
-    <w:p>
-      <w:pPr>
-        <w:spacing w:before="0" w:after="80" w:line="240" w:lineRule="auto"/>
-        <w:ind w:left="480" w:hanging="480"/>
-      </w:pPr>
-      <w:r>
-        <w:rPr>
-          <w:rFonts w:ascii="Times New Roman" w:hAnsi="Times New Roman" w:cs="Times New Roman" w:eastAsia="Times New Roman"/>
-          <w:b w:val="0"/>
-          <w:i w:val="0"/>
-          <w:sz w:val="20"/>
-        </w:rPr>
-        <w:t>[37] W. Shi, J. Cao, Q. Zhang, Y. Li, and L. Xu, "Edge computing: Vision and challenges," IEEE Internet Things J., vol. 3, no. 5, pp. 637-646, Oct. 2016, doi: 10.1109/JIOT.2016.2579198.</w:t>
-      </w:r>
-    </w:p>
-    <w:p>
-      <w:pPr>
-        <w:spacing w:before="0" w:after="80" w:line="240" w:lineRule="auto"/>
-        <w:ind w:left="480" w:hanging="480"/>
-      </w:pPr>
-      <w:r>
-        <w:rPr>
-          <w:rFonts w:ascii="Times New Roman" w:hAnsi="Times New Roman" w:cs="Times New Roman" w:eastAsia="Times New Roman"/>
-          <w:b w:val="0"/>
-          <w:i w:val="0"/>
-          <w:sz w:val="20"/>
-        </w:rPr>
-        <w:t>[38] P. Mach and Z. Becvar, "Mobile edge computing: A survey on architecture and computation offloading," IEEE Commun. Surv. Tutor., vol. 19, no. 3, pp. 1628-1656, 2017, doi: 10.1109/COMST.2017.2682318.</w:t>
-      </w:r>
-    </w:p>
-    <w:p>
-      <w:pPr>
-        <w:spacing w:before="0" w:after="80" w:line="240" w:lineRule="auto"/>
-        <w:ind w:left="480" w:hanging="480"/>
-      </w:pPr>
-      <w:r>
-        <w:rPr>
-          <w:rFonts w:ascii="Times New Roman" w:hAnsi="Times New Roman" w:cs="Times New Roman" w:eastAsia="Times New Roman"/>
-          <w:b w:val="0"/>
-          <w:i w:val="0"/>
-          <w:sz w:val="20"/>
-        </w:rPr>
-        <w:t>[39] M. Satyanarayanan, "The emergence of edge computing," Computer, vol. 50, no. 1, pp. 30-39, Jan. 2017, doi: 10.1109/MC.2017.9.</w:t>
-      </w:r>
-    </w:p>
-    <w:p>
-      <w:pPr>
-        <w:spacing w:before="0" w:after="80" w:line="240" w:lineRule="auto"/>
-        <w:ind w:left="480" w:hanging="480"/>
-      </w:pPr>
-      <w:r>
-        <w:rPr>
-          <w:rFonts w:ascii="Times New Roman" w:hAnsi="Times New Roman" w:cs="Times New Roman" w:eastAsia="Times New Roman"/>
-          <w:b w:val="0"/>
-          <w:i w:val="0"/>
-          <w:sz w:val="20"/>
-        </w:rPr>
-        <w:t>[40] Y. Mao, C. You, J. Zhang, K. Huang, and K. B. Letaief, "A survey on mobile edge computing: The communication perspective," IEEE Commun. Surv. Tutor., vol. 19, no. 4, pp. 2322-2358, 2017, doi: 10.1109/COMST.2017.2745201.</w:t>
-      </w:r>
-    </w:p>
-    <w:p>
-      <w:pPr>
-        <w:spacing w:before="0" w:after="80" w:line="240" w:lineRule="auto"/>
-        <w:ind w:left="480" w:hanging="480"/>
-      </w:pPr>
-      <w:r>
-        <w:rPr>
-          <w:rFonts w:ascii="Times New Roman" w:hAnsi="Times New Roman" w:cs="Times New Roman" w:eastAsia="Times New Roman"/>
-          <w:b w:val="0"/>
-          <w:i w:val="0"/>
-          <w:sz w:val="20"/>
-        </w:rPr>
-        <w:t>[41] S. I. Siam et al., "Artificial intelligence of things: A survey," ACM Trans. Sensor Netw., vol. 21, no. 1, pp. 1-75, Jan. 2025, doi: 10.1145/3690633.</w:t>
-      </w:r>
-    </w:p>
-    <w:p>
-      <w:pPr>
-        <w:spacing w:before="0" w:after="80" w:line="240" w:lineRule="auto"/>
-        <w:ind w:left="480" w:hanging="480"/>
-      </w:pPr>
-      <w:r>
-        <w:rPr>
-          <w:rFonts w:ascii="Times New Roman" w:hAnsi="Times New Roman" w:cs="Times New Roman" w:eastAsia="Times New Roman"/>
-          <w:b w:val="0"/>
-          <w:i w:val="0"/>
-          <w:sz w:val="20"/>
-        </w:rPr>
-        <w:t>[42] B. Alotaibi, "A survey on industrial Internet of Things security: Requirements, attacks, AI-based solutions, and edge computing opportunities," Sensors, vol. 23, no. 17, p. 7470, Aug. 2023, doi: 10.3390/s23177470.</w:t>
-      </w:r>
-    </w:p>
-    <w:p>
-      <w:pPr>
-        <w:spacing w:before="0" w:after="80" w:line="240" w:lineRule="auto"/>
-        <w:ind w:left="480" w:hanging="480"/>
-      </w:pPr>
-      <w:r>
-        <w:rPr>
-          <w:rFonts w:ascii="Times New Roman" w:hAnsi="Times New Roman" w:cs="Times New Roman" w:eastAsia="Times New Roman"/>
-          <w:b w:val="0"/>
-          <w:i w:val="0"/>
-          <w:sz w:val="20"/>
-        </w:rPr>
-        <w:t>[43] Y. Meidan et al., "N-BaIoT: Network-based detection of IoT botnet attacks using deep autoencoders," IEEE Pervasive Comput., vol. 17, no. 3, pp. 12-22, Jul.-Sep. 2018, doi: 10.1109/MPRV.2018.03367731.</w:t>
-      </w:r>
-    </w:p>
-    <w:p>
-      <w:pPr>
-        <w:spacing w:before="0" w:after="80" w:line="240" w:lineRule="auto"/>
-        <w:ind w:left="480" w:hanging="480"/>
-      </w:pPr>
-      <w:r>
-        <w:rPr>
-          <w:rFonts w:ascii="Times New Roman" w:hAnsi="Times New Roman" w:cs="Times New Roman" w:eastAsia="Times New Roman"/>
-          <w:b w:val="0"/>
-          <w:i w:val="0"/>
-          <w:sz w:val="20"/>
-        </w:rPr>
-        <w:t>[44] V. Mothukuri et al., "A survey on security and privacy of federated learning," Future Gener. Comput. Syst., vol. 115, pp. 619-640, Feb. 2021, doi: 10.1016/j.future.2020.10.007.</w:t>
-      </w:r>
-    </w:p>
-    <w:p>
-      <w:pPr>
-        <w:spacing w:before="0" w:after="80" w:line="240" w:lineRule="auto"/>
-        <w:ind w:left="480" w:hanging="480"/>
-      </w:pPr>
-      <w:r>
-        <w:rPr>
-          <w:rFonts w:ascii="Times New Roman" w:hAnsi="Times New Roman" w:cs="Times New Roman" w:eastAsia="Times New Roman"/>
-          <w:b w:val="0"/>
-          <w:i w:val="0"/>
-          <w:sz w:val="20"/>
-        </w:rPr>
-        <w:t>[45] Z. Zhou, X. Chen, E. Li, L. Zeng, K. Luo, and J. Zhang, "Edge intelligence: Paving the last mile of artificial intelligence with edge computing," Proc. IEEE, vol. 107, no. 8, pp. 1738-1762, Aug. 2019, doi: 10.1109/JPROC.2019.2918951.</w:t>
-      </w:r>
-    </w:p>
-    <w:p>
-      <w:pPr>
-        <w:spacing w:before="0" w:after="80" w:line="240" w:lineRule="auto"/>
-        <w:ind w:left="480" w:hanging="480"/>
-      </w:pPr>
-      <w:r>
-        <w:rPr>
-          <w:rFonts w:ascii="Times New Roman" w:hAnsi="Times New Roman" w:cs="Times New Roman" w:eastAsia="Times New Roman"/>
-          <w:b w:val="0"/>
-          <w:i w:val="0"/>
-          <w:sz w:val="20"/>
-        </w:rPr>
-        <w:t>[46] C. Chen et al., "Energy-aware scheduling for high-performance computing systems: A survey," Energies, vol. 16, no. 2, p. 890, Jan. 2023, doi: 10.3390/en16020890.</w:t>
-      </w:r>
-    </w:p>
-    <w:p>
-      <w:pPr>
-        <w:spacing w:before="0" w:after="80" w:line="240" w:lineRule="auto"/>
-        <w:ind w:left="480" w:hanging="480"/>
-      </w:pPr>
-      <w:r>
-        <w:rPr>
-          <w:rFonts w:ascii="Times New Roman" w:hAnsi="Times New Roman" w:cs="Times New Roman" w:eastAsia="Times New Roman"/>
-          <w:b w:val="0"/>
-          <w:i w:val="0"/>
-          <w:sz w:val="20"/>
-        </w:rPr>
-        <w:t>[47] M. Kalinin and V. Krundyshev, "Security intrusion detection using quantum machine learning techniques," J. Comput. Virol. Hacking Tech., vol. 19, no. 1, pp. 125-136, Mar. 2023, doi: 10.1007/s11416-022-00435-0.</w:t>
-      </w:r>
-    </w:p>
-    <w:p>
-      <w:pPr>
-        <w:spacing w:before="0" w:after="80" w:line="240" w:lineRule="auto"/>
-        <w:ind w:left="480" w:hanging="480"/>
-      </w:pPr>
-      <w:r>
-        <w:rPr>
-          <w:rFonts w:ascii="Times New Roman" w:hAnsi="Times New Roman" w:cs="Times New Roman" w:eastAsia="Times New Roman"/>
-          <w:b w:val="0"/>
-          <w:i w:val="0"/>
-          <w:sz w:val="20"/>
-        </w:rPr>
-        <w:t>[48] Qiskit Aer contributors, "Qiskit Aer: High performance simulator for quantum circuits," GitHub repository, 2024. [Online]. Available: https://github.com/Qiskit/qiskit-aer</w:t>
-      </w:r>
-    </w:p>
-    <w:p>
-      <w:pPr>
-        <w:spacing w:before="0" w:after="80" w:line="240" w:lineRule="auto"/>
-        <w:ind w:left="480" w:hanging="480"/>
-      </w:pPr>
-      <w:r>
-        <w:rPr>
-          <w:rFonts w:ascii="Times New Roman" w:hAnsi="Times New Roman" w:cs="Times New Roman" w:eastAsia="Times New Roman"/>
-          <w:b w:val="0"/>
-          <w:i w:val="0"/>
-          <w:sz w:val="20"/>
-        </w:rPr>
-        <w:t>[49] D. P. DiVincenzo, "The physical implementation of quantum computation," Fortschritte der Physik, vol. 48, no. 9-11, pp. 771-783, Sep. 2000.</w:t>
-      </w:r>
-    </w:p>
-    <w:p>
-      <w:pPr>
-        <w:spacing w:before="0" w:after="80" w:line="240" w:lineRule="auto"/>
-        <w:ind w:left="480" w:hanging="480"/>
-      </w:pPr>
-      <w:r>
-        <w:rPr>
-          <w:rFonts w:ascii="Times New Roman" w:hAnsi="Times New Roman" w:cs="Times New Roman" w:eastAsia="Times New Roman"/>
-          <w:b w:val="0"/>
-          <w:i w:val="0"/>
-          <w:sz w:val="20"/>
-        </w:rPr>
-        <w:t>[50] National Institute of Standards and Technology, "Post-quantum cryptography standardization," NIST, 2024. [Online]. Available: https://csrc.nist.gov/projects/post-quantum-cryptography</w:t>
-      </w:r>
-    </w:p>
-    <w:p>
-      <w:pPr>
         <w:pStyle w:val="Heading1"/>
         <w:pageBreakBefore/>
         <w:spacing w:before="160" w:after="40" w:line="240" w:lineRule="auto"/>
@@ -14187,7 +12953,7 @@
           <w:color w:val="141E33"/>
           <w:sz w:val="28"/>
         </w:rPr>
-        <w:t>Appendix C — Additional Plots</w:t>
+        <w:t>Appendix C — Open Source Resources, Website, and Live Simulator</w:t>
       </w:r>
     </w:p>
     <w:p>
@@ -14203,7 +12969,7 @@
           <w:color w:val="141E33"/>
           <w:sz w:val="24"/>
         </w:rPr>
-        <w:t>C.1 Per-Task Energy Breakdown by Tier</w:t>
+        <w:t>E.1 Public Code Repository</w:t>
       </w:r>
     </w:p>
     <w:p>
@@ -14217,7 +12983,23 @@
           <w:i w:val="0"/>
           <w:sz w:val="24"/>
         </w:rPr>
-        <w:t>A stacked bar chart that decomposes per-task energy into CPU, GPU, and QPU contributions for each workload measured in the thesis. Useful for spotting tier interactions that are invisible in single-tier energy totals.</w:t>
+        <w:t>All code, data, and figures referenced in this thesis are released under an open-source MIT licence. The repository contains the HERO simulator, the four classical baselines, the VQE workload, the cloud-cost calculator, the allocation rule, the Pareto-selection module, every CSV that produced the tables in Chapters 9 to 11, and every PNG that produced the figures in Chapters 7 to 11.</w:t>
+      </w:r>
+    </w:p>
+    <w:p>
+      <w:pPr>
+        <w:pStyle w:val="Heading3"/>
+        <w:spacing w:before="80" w:after="40" w:line="240" w:lineRule="auto"/>
+      </w:pPr>
+      <w:r>
+        <w:rPr>
+          <w:rFonts w:ascii="Times New Roman" w:hAnsi="Times New Roman" w:cs="Times New Roman" w:eastAsia="Times New Roman"/>
+          <w:b/>
+          <w:i w:val="0"/>
+          <w:color w:val="141E33"/>
+          <w:sz w:val="22"/>
+        </w:rPr>
+        <w:t>Repository URL</w:t>
       </w:r>
     </w:p>
     <w:p>
@@ -14232,63 +13014,125 @@
           <w:i w:val="0"/>
           <w:sz w:val="24"/>
         </w:rPr>
-        <w:t>Source: hybrid_simulation/output/plots/hybrid_energy_breakdown.png</w:t>
-      </w:r>
-    </w:p>
-    <w:p>
-      <w:pPr>
-        <w:spacing w:before="160" w:after="40"/>
-        <w:jc w:val="center"/>
-      </w:pPr>
-      <w:r>
-        <w:drawing>
-          <wp:inline xmlns:a="http://schemas.openxmlformats.org/drawingml/2006/main" xmlns:pic="http://schemas.openxmlformats.org/drawingml/2006/picture">
-            <wp:extent cx="5202650" cy="2997339"/>
-            <wp:docPr id="13" name="Picture 13"/>
-            <wp:cNvGraphicFramePr>
-              <a:graphicFrameLocks noChangeAspect="1"/>
-            </wp:cNvGraphicFramePr>
-            <a:graphic>
-              <a:graphicData uri="http://schemas.openxmlformats.org/drawingml/2006/picture">
-                <pic:pic>
-                  <pic:nvPicPr>
-                    <pic:cNvPr id="0" name="hybrid_energy_breakdown.png"/>
-                    <pic:cNvPicPr/>
-                  </pic:nvPicPr>
-                  <pic:blipFill>
-                    <a:blip r:embed="rId20"/>
-                    <a:stretch>
-                      <a:fillRect/>
-                    </a:stretch>
-                  </pic:blipFill>
-                  <pic:spPr>
-                    <a:xfrm>
-                      <a:off x="0" y="0"/>
-                      <a:ext cx="5202650" cy="2997339"/>
-                    </a:xfrm>
-                    <a:prstGeom prst="rect"/>
-                  </pic:spPr>
-                </pic:pic>
-              </a:graphicData>
-            </a:graphic>
-          </wp:inline>
-        </w:drawing>
-      </w:r>
-    </w:p>
-    <w:p>
-      <w:pPr>
-        <w:spacing w:before="40" w:after="240"/>
-        <w:jc w:val="center"/>
-      </w:pPr>
-      <w:r>
-        <w:rPr>
-          <w:rFonts w:ascii="Times New Roman" w:hAnsi="Times New Roman" w:cs="Times New Roman" w:eastAsia="Times New Roman"/>
-          <w:b w:val="0"/>
-          <w:i/>
-          <w:color w:val="404040"/>
-          <w:sz w:val="20"/>
-        </w:rPr>
-        <w:t>Figure C.1: Per-task energy breakdown by tier. The QPU tier dominates total energy at over 99 percent due to the modelled 20 kW system-wide power.</w:t>
+        <w:t>https://github.com/Nirmitdagli/quantum-thesis-demo</w:t>
+      </w:r>
+    </w:p>
+    <w:p>
+      <w:pPr>
+        <w:pStyle w:val="ListBullet"/>
+        <w:spacing w:line="360" w:lineRule="auto" w:after="80"/>
+      </w:pPr>
+      <w:r>
+        <w:rPr>
+          <w:rFonts w:ascii="Times New Roman" w:hAnsi="Times New Roman" w:cs="Times New Roman" w:eastAsia="Times New Roman"/>
+          <w:b w:val="0"/>
+          <w:i w:val="0"/>
+          <w:sz w:val="24"/>
+        </w:rPr>
+        <w:t>Branch: main (tagged v1.0 corresponding to this thesis submission).</w:t>
+      </w:r>
+    </w:p>
+    <w:p>
+      <w:pPr>
+        <w:spacing w:before="0" w:after="200" w:line="240" w:lineRule="auto"/>
+      </w:pPr>
+      <w:r>
+        <w:rPr>
+          <w:rFonts w:ascii="Times New Roman" w:hAnsi="Times New Roman" w:cs="Times New Roman" w:eastAsia="Times New Roman"/>
+          <w:b w:val="0"/>
+          <w:i w:val="0"/>
+          <w:sz w:val="24"/>
+        </w:rPr>
+        <w:t>The repository structure mirrors the local working tree:</w:t>
+      </w:r>
+    </w:p>
+    <w:p>
+      <w:pPr>
+        <w:pStyle w:val="ListBullet"/>
+        <w:spacing w:line="360" w:lineRule="auto" w:after="80"/>
+      </w:pPr>
+      <w:r>
+        <w:rPr>
+          <w:rFonts w:ascii="Times New Roman" w:hAnsi="Times New Roman" w:cs="Times New Roman" w:eastAsia="Times New Roman"/>
+          <w:b w:val="0"/>
+          <w:i w:val="0"/>
+          <w:sz w:val="24"/>
+        </w:rPr>
+        <w:t>hybrid_simulation/  - the HERO simulator and all engine modules</w:t>
+      </w:r>
+    </w:p>
+    <w:p>
+      <w:pPr>
+        <w:pStyle w:val="ListBullet"/>
+        <w:spacing w:line="360" w:lineRule="auto" w:after="80"/>
+      </w:pPr>
+      <w:r>
+        <w:rPr>
+          <w:rFonts w:ascii="Times New Roman" w:hAnsi="Times New Roman" w:cs="Times New Roman" w:eastAsia="Times New Roman"/>
+          <w:b w:val="0"/>
+          <w:i w:val="0"/>
+          <w:sz w:val="24"/>
+        </w:rPr>
+        <w:t>papers/             - IEEE conference paper (HERO-S submission to ISAIA 2026)</w:t>
+      </w:r>
+    </w:p>
+    <w:p>
+      <w:pPr>
+        <w:pStyle w:val="ListBullet"/>
+        <w:spacing w:line="360" w:lineRule="auto" w:after="80"/>
+      </w:pPr>
+      <w:r>
+        <w:rPr>
+          <w:rFonts w:ascii="Times New Roman" w:hAnsi="Times New Roman" w:cs="Times New Roman" w:eastAsia="Times New Roman"/>
+          <w:b w:val="0"/>
+          <w:i w:val="0"/>
+          <w:sz w:val="24"/>
+        </w:rPr>
+        <w:t>thesis/             - this thesis source plus the build script</w:t>
+      </w:r>
+    </w:p>
+    <w:p>
+      <w:pPr>
+        <w:pStyle w:val="ListBullet"/>
+        <w:spacing w:line="360" w:lineRule="auto" w:after="80"/>
+      </w:pPr>
+      <w:r>
+        <w:rPr>
+          <w:rFonts w:ascii="Times New Roman" w:hAnsi="Times New Roman" w:cs="Times New Roman" w:eastAsia="Times New Roman"/>
+          <w:b w:val="0"/>
+          <w:i w:val="0"/>
+          <w:sz w:val="24"/>
+        </w:rPr>
+        <w:t>website/            - static companion website and the live interactive simulator</w:t>
+      </w:r>
+    </w:p>
+    <w:p>
+      <w:pPr>
+        <w:pStyle w:val="ListBullet"/>
+        <w:spacing w:line="360" w:lineRule="auto" w:after="80"/>
+      </w:pPr>
+      <w:r>
+        <w:rPr>
+          <w:rFonts w:ascii="Times New Roman" w:hAnsi="Times New Roman" w:cs="Times New Roman" w:eastAsia="Times New Roman"/>
+          <w:b w:val="0"/>
+          <w:i w:val="0"/>
+          <w:sz w:val="24"/>
+        </w:rPr>
+        <w:t>README.md           - top-level overview and quick-start instructions</w:t>
+      </w:r>
+    </w:p>
+    <w:p>
+      <w:pPr>
+        <w:spacing w:before="0" w:after="200" w:line="240" w:lineRule="auto"/>
+      </w:pPr>
+      <w:r>
+        <w:rPr>
+          <w:rFonts w:ascii="Times New Roman" w:hAnsi="Times New Roman" w:cs="Times New Roman" w:eastAsia="Times New Roman"/>
+          <w:b w:val="0"/>
+          <w:i w:val="0"/>
+          <w:sz w:val="24"/>
+        </w:rPr>
+        <w:t>Issues and pull requests are welcome. The author commits to responding to substantive issues within two weeks for at least the twenty-four months following the thesis submission date.</w:t>
       </w:r>
     </w:p>
     <w:p>
@@ -14304,7 +13148,7 @@
           <w:color w:val="141E33"/>
           <w:sz w:val="24"/>
         </w:rPr>
-        <w:t>C.2 Multi-Run Convergence Traces</w:t>
+        <w:t>E.2 Companion Website</w:t>
       </w:r>
     </w:p>
     <w:p>
@@ -14318,7 +13162,23 @@
           <w:i w:val="0"/>
           <w:sz w:val="24"/>
         </w:rPr>
-        <w:t>QAOA approximation-ratio convergence over thirty seeds, shown as a box-and-whisker plot. The spread of the box is itself an operational metric: a high-variance QAOA is expensive to use in production because the worst-case run drives the SLA.</w:t>
+        <w:t>A static companion website provides a polished narrative summary of the thesis suitable for non-specialist readers, including thesis-committee members who may want a one-page executive view before reading the full document. The site links to the live simulator (Section E.3) and to the downloadable PDF of this thesis.</w:t>
+      </w:r>
+    </w:p>
+    <w:p>
+      <w:pPr>
+        <w:pStyle w:val="Heading3"/>
+        <w:spacing w:before="80" w:after="40" w:line="240" w:lineRule="auto"/>
+      </w:pPr>
+      <w:r>
+        <w:rPr>
+          <w:rFonts w:ascii="Times New Roman" w:hAnsi="Times New Roman" w:cs="Times New Roman" w:eastAsia="Times New Roman"/>
+          <w:b/>
+          <w:i w:val="0"/>
+          <w:color w:val="141E33"/>
+          <w:sz w:val="22"/>
+        </w:rPr>
+        <w:t>Website URL</w:t>
       </w:r>
     </w:p>
     <w:p>
@@ -14333,63 +13193,96 @@
           <w:i w:val="0"/>
           <w:sz w:val="24"/>
         </w:rPr>
-        <w:t>Source: hybrid_simulation/output/plots/qaoa_multirun_boxplot.png</w:t>
-      </w:r>
-    </w:p>
-    <w:p>
-      <w:pPr>
-        <w:spacing w:before="160" w:after="40"/>
-        <w:jc w:val="center"/>
-      </w:pPr>
-      <w:r>
-        <w:drawing>
-          <wp:inline xmlns:a="http://schemas.openxmlformats.org/drawingml/2006/main" xmlns:pic="http://schemas.openxmlformats.org/drawingml/2006/picture">
-            <wp:extent cx="5202650" cy="4018442"/>
-            <wp:docPr id="14" name="Picture 14"/>
-            <wp:cNvGraphicFramePr>
-              <a:graphicFrameLocks noChangeAspect="1"/>
-            </wp:cNvGraphicFramePr>
-            <a:graphic>
-              <a:graphicData uri="http://schemas.openxmlformats.org/drawingml/2006/picture">
-                <pic:pic>
-                  <pic:nvPicPr>
-                    <pic:cNvPr id="0" name="hybrid_simulation_dashboard.png"/>
-                    <pic:cNvPicPr/>
-                  </pic:nvPicPr>
-                  <pic:blipFill>
-                    <a:blip r:embed="rId21"/>
-                    <a:stretch>
-                      <a:fillRect/>
-                    </a:stretch>
-                  </pic:blipFill>
-                  <pic:spPr>
-                    <a:xfrm>
-                      <a:off x="0" y="0"/>
-                      <a:ext cx="5202650" cy="4018442"/>
-                    </a:xfrm>
-                    <a:prstGeom prst="rect"/>
-                  </pic:spPr>
-                </pic:pic>
-              </a:graphicData>
-            </a:graphic>
-          </wp:inline>
-        </w:drawing>
-      </w:r>
-    </w:p>
-    <w:p>
-      <w:pPr>
-        <w:spacing w:before="40" w:after="240"/>
-        <w:jc w:val="center"/>
-      </w:pPr>
-      <w:r>
-        <w:rPr>
-          <w:rFonts w:ascii="Times New Roman" w:hAnsi="Times New Roman" w:cs="Times New Roman" w:eastAsia="Times New Roman"/>
-          <w:b w:val="0"/>
-          <w:i/>
-          <w:color w:val="404040"/>
-          <w:sz w:val="20"/>
-        </w:rPr>
-        <w:t>Figure C.2: HERO simulation dashboard summarising tier utilisation, runtime, energy, and per-experiment results in one view.</w:t>
+        <w:t>https://Nirmitdagli.github.io/quantum-thesis-demo/</w:t>
+      </w:r>
+    </w:p>
+    <w:p>
+      <w:pPr>
+        <w:spacing w:before="0" w:after="200" w:line="240" w:lineRule="auto"/>
+      </w:pPr>
+      <w:r>
+        <w:rPr>
+          <w:rFonts w:ascii="Times New Roman" w:hAnsi="Times New Roman" w:cs="Times New Roman" w:eastAsia="Times New Roman"/>
+          <w:b w:val="0"/>
+          <w:i w:val="0"/>
+          <w:sz w:val="24"/>
+        </w:rPr>
+        <w:t>The website is served from the website/ directory of the code repository via GitHub Pages. It includes:</w:t>
+      </w:r>
+    </w:p>
+    <w:p>
+      <w:pPr>
+        <w:pStyle w:val="ListBullet"/>
+        <w:spacing w:line="360" w:lineRule="auto" w:after="80"/>
+      </w:pPr>
+      <w:r>
+        <w:rPr>
+          <w:rFonts w:ascii="Times New Roman" w:hAnsi="Times New Roman" w:cs="Times New Roman" w:eastAsia="Times New Roman"/>
+          <w:b w:val="0"/>
+          <w:i w:val="0"/>
+          <w:sz w:val="24"/>
+        </w:rPr>
+        <w:t>An animated hero section summarising the research question and the headline finding (classical wins by 13,000x today; molecular VQE wins at scale).</w:t>
+      </w:r>
+    </w:p>
+    <w:p>
+      <w:pPr>
+        <w:pStyle w:val="ListBullet"/>
+        <w:spacing w:line="360" w:lineRule="auto" w:after="80"/>
+      </w:pPr>
+      <w:r>
+        <w:rPr>
+          <w:rFonts w:ascii="Times New Roman" w:hAnsi="Times New Roman" w:cs="Times New Roman" w:eastAsia="Times New Roman"/>
+          <w:b w:val="0"/>
+          <w:i w:val="0"/>
+          <w:sz w:val="24"/>
+        </w:rPr>
+        <w:t>Embedded versions of the key figures from Chapters 9, 10, and 11 with interactive tooltips.</w:t>
+      </w:r>
+    </w:p>
+    <w:p>
+      <w:pPr>
+        <w:pStyle w:val="ListBullet"/>
+        <w:spacing w:line="360" w:lineRule="auto" w:after="80"/>
+      </w:pPr>
+      <w:r>
+        <w:rPr>
+          <w:rFonts w:ascii="Times New Roman" w:hAnsi="Times New Roman" w:cs="Times New Roman" w:eastAsia="Times New Roman"/>
+          <w:b w:val="0"/>
+          <w:i w:val="0"/>
+          <w:sz w:val="24"/>
+        </w:rPr>
+        <w:t>A direct link to the live interactive simulator described in Section E.3.</w:t>
+      </w:r>
+    </w:p>
+    <w:p>
+      <w:pPr>
+        <w:pStyle w:val="ListBullet"/>
+        <w:spacing w:line="360" w:lineRule="auto" w:after="80"/>
+      </w:pPr>
+      <w:r>
+        <w:rPr>
+          <w:rFonts w:ascii="Times New Roman" w:hAnsi="Times New Roman" w:cs="Times New Roman" w:eastAsia="Times New Roman"/>
+          <w:b w:val="0"/>
+          <w:i w:val="0"/>
+          <w:sz w:val="24"/>
+        </w:rPr>
+        <w:t>Full thesis PDF download.</w:t>
+      </w:r>
+    </w:p>
+    <w:p>
+      <w:pPr>
+        <w:pStyle w:val="ListBullet"/>
+        <w:spacing w:line="360" w:lineRule="auto" w:after="80"/>
+      </w:pPr>
+      <w:r>
+        <w:rPr>
+          <w:rFonts w:ascii="Times New Roman" w:hAnsi="Times New Roman" w:cs="Times New Roman" w:eastAsia="Times New Roman"/>
+          <w:b w:val="0"/>
+          <w:i w:val="0"/>
+          <w:sz w:val="24"/>
+        </w:rPr>
+        <w:t>BibTeX citation block for academic citation of the thesis and the conference paper.</w:t>
       </w:r>
     </w:p>
     <w:p>
@@ -14405,7 +13298,7 @@
           <w:color w:val="141E33"/>
           <w:sz w:val="24"/>
         </w:rPr>
-        <w:t>C.3 Pipeline Timeline (Gantt)</w:t>
+        <w:t>E.3 Live Interactive Simulator</w:t>
       </w:r>
     </w:p>
     <w:p>
@@ -14419,7 +13312,23 @@
           <w:i w:val="0"/>
           <w:sz w:val="24"/>
         </w:rPr>
-        <w:t>A Gantt chart visualising the wall-clock task scheduling across CPU, GPU, and QPU tiers for a representative end-to-end run. Highlights the periods in which the QPU tier dominates the critical path and the periods in which classical tiers overlap and absorb the latency.</w:t>
+        <w:t>The live interactive simulator lets a reader configure a workload (workload type, problem size, feature dimension), see HERO's allocation decision in real time, and inspect the predicted accuracy, latency, energy, and cloud cost across all three tiers. The simulator is implemented as a single-page application that calls a JavaScript port of the allocation_rule.py module so that the recommendations match the Python framework exactly.</w:t>
+      </w:r>
+    </w:p>
+    <w:p>
+      <w:pPr>
+        <w:pStyle w:val="Heading3"/>
+        <w:spacing w:before="80" w:after="40" w:line="240" w:lineRule="auto"/>
+      </w:pPr>
+      <w:r>
+        <w:rPr>
+          <w:rFonts w:ascii="Times New Roman" w:hAnsi="Times New Roman" w:cs="Times New Roman" w:eastAsia="Times New Roman"/>
+          <w:b/>
+          <w:i w:val="0"/>
+          <w:color w:val="141E33"/>
+          <w:sz w:val="22"/>
+        </w:rPr>
+        <w:t>Live Simulator URL</w:t>
       </w:r>
     </w:p>
     <w:p>
@@ -14434,80 +13343,66 @@
           <w:i w:val="0"/>
           <w:sz w:val="24"/>
         </w:rPr>
-        <w:t>Source: hybrid_simulation/output/plots/hybrid_pipeline_timeline.png</w:t>
-      </w:r>
-    </w:p>
-    <w:p>
-      <w:pPr>
-        <w:spacing w:before="160" w:after="40"/>
-        <w:jc w:val="center"/>
-      </w:pPr>
-      <w:r>
-        <w:drawing>
-          <wp:inline xmlns:a="http://schemas.openxmlformats.org/drawingml/2006/main" xmlns:pic="http://schemas.openxmlformats.org/drawingml/2006/picture">
-            <wp:extent cx="5202650" cy="2565058"/>
-            <wp:docPr id="15" name="Picture 15"/>
-            <wp:cNvGraphicFramePr>
-              <a:graphicFrameLocks noChangeAspect="1"/>
-            </wp:cNvGraphicFramePr>
-            <a:graphic>
-              <a:graphicData uri="http://schemas.openxmlformats.org/drawingml/2006/picture">
-                <pic:pic>
-                  <pic:nvPicPr>
-                    <pic:cNvPr id="0" name="hybrid_pipeline_timeline.png"/>
-                    <pic:cNvPicPr/>
-                  </pic:nvPicPr>
-                  <pic:blipFill>
-                    <a:blip r:embed="rId22"/>
-                    <a:stretch>
-                      <a:fillRect/>
-                    </a:stretch>
-                  </pic:blipFill>
-                  <pic:spPr>
-                    <a:xfrm>
-                      <a:off x="0" y="0"/>
-                      <a:ext cx="5202650" cy="2565058"/>
-                    </a:xfrm>
-                    <a:prstGeom prst="rect"/>
-                  </pic:spPr>
-                </pic:pic>
-              </a:graphicData>
-            </a:graphic>
-          </wp:inline>
-        </w:drawing>
-      </w:r>
-    </w:p>
-    <w:p>
-      <w:pPr>
-        <w:spacing w:before="40" w:after="240"/>
-        <w:jc w:val="center"/>
-      </w:pPr>
-      <w:r>
-        <w:rPr>
-          <w:rFonts w:ascii="Times New Roman" w:hAnsi="Times New Roman" w:cs="Times New Roman" w:eastAsia="Times New Roman"/>
-          <w:b w:val="0"/>
-          <w:i/>
-          <w:color w:val="404040"/>
-          <w:sz w:val="20"/>
-        </w:rPr>
-        <w:t>Figure C.3: Pipeline execution timeline (Gantt chart) showing tier interleaving across the 17-task pipeline.</w:t>
-      </w:r>
-    </w:p>
-    <w:p>
-      <w:pPr>
-        <w:pStyle w:val="Heading1"/>
-        <w:pageBreakBefore/>
-        <w:spacing w:before="160" w:after="40" w:line="240" w:lineRule="auto"/>
-      </w:pPr>
-      <w:r>
-        <w:rPr>
-          <w:rFonts w:ascii="Times New Roman" w:hAnsi="Times New Roman" w:cs="Times New Roman" w:eastAsia="Times New Roman"/>
-          <w:b/>
-          <w:i w:val="0"/>
-          <w:color w:val="141E33"/>
-          <w:sz w:val="28"/>
-        </w:rPr>
-        <w:t>Appendix D — Extended Results Tables</w:t>
+        <w:t>https://Nirmitdagli.github.io/quantum-thesis-demo/simulator.html</w:t>
+      </w:r>
+    </w:p>
+    <w:p>
+      <w:pPr>
+        <w:spacing w:before="0" w:after="200" w:line="240" w:lineRule="auto"/>
+      </w:pPr>
+      <w:r>
+        <w:rPr>
+          <w:rFonts w:ascii="Times New Roman" w:hAnsi="Times New Roman" w:cs="Times New Roman" w:eastAsia="Times New Roman"/>
+          <w:b w:val="0"/>
+          <w:i w:val="0"/>
+          <w:sz w:val="24"/>
+        </w:rPr>
+        <w:t>Use cases for the live simulator:</w:t>
+      </w:r>
+    </w:p>
+    <w:p>
+      <w:pPr>
+        <w:pStyle w:val="ListBullet"/>
+        <w:spacing w:line="360" w:lineRule="auto" w:after="80"/>
+      </w:pPr>
+      <w:r>
+        <w:rPr>
+          <w:rFonts w:ascii="Times New Roman" w:hAnsi="Times New Roman" w:cs="Times New Roman" w:eastAsia="Times New Roman"/>
+          <w:b w:val="0"/>
+          <w:i w:val="0"/>
+          <w:sz w:val="24"/>
+        </w:rPr>
+        <w:t>Defence demonstrations: live answer to committee questions of the form 'what would HERO recommend for a workload with X features?'</w:t>
+      </w:r>
+    </w:p>
+    <w:p>
+      <w:pPr>
+        <w:pStyle w:val="ListBullet"/>
+        <w:spacing w:line="360" w:lineRule="auto" w:after="80"/>
+      </w:pPr>
+      <w:r>
+        <w:rPr>
+          <w:rFonts w:ascii="Times New Roman" w:hAnsi="Times New Roman" w:cs="Times New Roman" w:eastAsia="Times New Roman"/>
+          <w:b w:val="0"/>
+          <w:i w:val="0"/>
+          <w:sz w:val="24"/>
+        </w:rPr>
+        <w:t>Teaching: students can experiment with the allocation thresholds and see the boundary conditions interactively.</w:t>
+      </w:r>
+    </w:p>
+    <w:p>
+      <w:pPr>
+        <w:pStyle w:val="ListBullet"/>
+        <w:spacing w:line="360" w:lineRule="auto" w:after="80"/>
+      </w:pPr>
+      <w:r>
+        <w:rPr>
+          <w:rFonts w:ascii="Times New Roman" w:hAnsi="Times New Roman" w:cs="Times New Roman" w:eastAsia="Times New Roman"/>
+          <w:b w:val="0"/>
+          <w:i w:val="0"/>
+          <w:sz w:val="24"/>
+        </w:rPr>
+        <w:t>Practitioner exploration: cloud architects can test their own workloads against HERO's allocation rule before reading the full thesis.</w:t>
       </w:r>
     </w:p>
     <w:p>
@@ -14523,7 +13418,7 @@
           <w:color w:val="141E33"/>
           <w:sz w:val="24"/>
         </w:rPr>
-        <w:t>D.1 Per-Run Cybersecurity Statistics</w:t>
+        <w:t>E.4 Reproducibility and Citation</w:t>
       </w:r>
     </w:p>
     <w:p>
@@ -14537,7 +13432,97 @@
           <w:i w:val="0"/>
           <w:sz w:val="24"/>
         </w:rPr>
-        <w:t>For each of the five classifiers reported in Section 9.4, the thirty individual seed F1 scores are recorded in multirun_stats.csv. The schema is one row per (Method, Run) pair, plus per-method mean and standard deviation rows.</w:t>
+        <w:t>Anyone can reproduce every number, table, and figure in this thesis with a single command after cloning the repository. The full pipeline takes approximately five to ten minutes on a standard developer laptop and requires no quantum hardware (Qiskit Aer is used as the noiseless QPU backend).</w:t>
+      </w:r>
+    </w:p>
+    <w:p>
+      <w:pPr>
+        <w:pStyle w:val="Heading3"/>
+        <w:spacing w:before="80" w:after="40" w:line="240" w:lineRule="auto"/>
+      </w:pPr>
+      <w:r>
+        <w:rPr>
+          <w:rFonts w:ascii="Times New Roman" w:hAnsi="Times New Roman" w:cs="Times New Roman" w:eastAsia="Times New Roman"/>
+          <w:b/>
+          <w:i w:val="0"/>
+          <w:color w:val="141E33"/>
+          <w:sz w:val="22"/>
+        </w:rPr>
+        <w:t>Reproduction Steps</w:t>
+      </w:r>
+    </w:p>
+    <w:p>
+      <w:pPr>
+        <w:spacing w:before="0" w:after="0" w:line="240" w:lineRule="auto"/>
+        <w:ind w:left="340"/>
+      </w:pPr>
+      <w:r>
+        <w:rPr>
+          <w:rFonts w:ascii="Consolas" w:hAnsi="Consolas" w:cs="Consolas" w:eastAsia="Consolas"/>
+          <w:b w:val="0"/>
+          <w:i w:val="0"/>
+          <w:sz w:val="20"/>
+        </w:rPr>
+        <w:t>git clone https://github.com/Nirmitdagli/quantum-thesis-demo.git</w:t>
+      </w:r>
+    </w:p>
+    <w:p>
+      <w:pPr>
+        <w:spacing w:before="0" w:after="0" w:line="240" w:lineRule="auto"/>
+        <w:ind w:left="340"/>
+      </w:pPr>
+      <w:r>
+        <w:rPr>
+          <w:rFonts w:ascii="Consolas" w:hAnsi="Consolas" w:cs="Consolas" w:eastAsia="Consolas"/>
+          <w:b w:val="0"/>
+          <w:i w:val="0"/>
+          <w:sz w:val="20"/>
+        </w:rPr>
+        <w:t>cd quantum-thesis-demo</w:t>
+      </w:r>
+    </w:p>
+    <w:p>
+      <w:pPr>
+        <w:spacing w:before="0" w:after="0" w:line="240" w:lineRule="auto"/>
+        <w:ind w:left="340"/>
+      </w:pPr>
+      <w:r>
+        <w:rPr>
+          <w:rFonts w:ascii="Consolas" w:hAnsi="Consolas" w:cs="Consolas" w:eastAsia="Consolas"/>
+          <w:b w:val="0"/>
+          <w:i w:val="0"/>
+          <w:sz w:val="20"/>
+        </w:rPr>
+        <w:t>pip install -r requirements.txt</w:t>
+      </w:r>
+    </w:p>
+    <w:p>
+      <w:pPr>
+        <w:spacing w:before="0" w:after="0" w:line="240" w:lineRule="auto"/>
+        <w:ind w:left="340"/>
+      </w:pPr>
+      <w:r>
+        <w:rPr>
+          <w:rFonts w:ascii="Consolas" w:hAnsi="Consolas" w:cs="Consolas" w:eastAsia="Consolas"/>
+          <w:b w:val="0"/>
+          <w:i w:val="0"/>
+          <w:sz w:val="20"/>
+        </w:rPr>
+        <w:t>python -m hybrid_simulation.run_hybrid</w:t>
+      </w:r>
+    </w:p>
+    <w:p>
+      <w:pPr>
+        <w:spacing w:before="0" w:after="200" w:line="240" w:lineRule="auto"/>
+      </w:pPr>
+      <w:r>
+        <w:rPr>
+          <w:rFonts w:ascii="Times New Roman" w:hAnsi="Times New Roman" w:cs="Times New Roman" w:eastAsia="Times New Roman"/>
+          <w:b w:val="0"/>
+          <w:i w:val="0"/>
+          <w:sz w:val="24"/>
+        </w:rPr>
+        <w:t>Outputs are written to hybrid_simulation/output/ and include:</w:t>
       </w:r>
     </w:p>
     <w:p>
@@ -14552,7 +13537,7 @@
           <w:i w:val="0"/>
           <w:sz w:val="24"/>
         </w:rPr>
-        <w:t>Column headers: Method | Run 1 | Run 2 | ... | Run 30 | Mean | Std</w:t>
+        <w:t>hybrid_pipeline_results.csv - per-step pipeline log</w:t>
       </w:r>
     </w:p>
     <w:p>
@@ -14567,51 +13552,7 @@
           <w:i w:val="0"/>
           <w:sz w:val="24"/>
         </w:rPr>
-        <w:t>Source: hybrid_simulation/output/multirun_stats.csv</w:t>
-      </w:r>
-    </w:p>
-    <w:p>
-      <w:pPr>
-        <w:spacing w:before="0" w:after="200" w:line="240" w:lineRule="auto"/>
-      </w:pPr>
-      <w:r>
-        <w:rPr>
-          <w:rFonts w:ascii="Times New Roman" w:hAnsi="Times New Roman" w:cs="Times New Roman" w:eastAsia="Times New Roman"/>
-          <w:b w:val="0"/>
-          <w:i w:val="0"/>
-          <w:sz w:val="24"/>
-        </w:rPr>
-        <w:t>Refer to multirun_stats.csv for the full per-seed data; the headline aggregates are reported in Table 9.1.</w:t>
-      </w:r>
-    </w:p>
-    <w:p>
-      <w:pPr>
-        <w:pStyle w:val="Heading2"/>
-        <w:spacing w:before="80" w:after="40" w:line="240" w:lineRule="auto"/>
-      </w:pPr>
-      <w:r>
-        <w:rPr>
-          <w:rFonts w:ascii="Times New Roman" w:hAnsi="Times New Roman" w:cs="Times New Roman" w:eastAsia="Times New Roman"/>
-          <w:b/>
-          <w:i w:val="0"/>
-          <w:color w:val="141E33"/>
-          <w:sz w:val="24"/>
-        </w:rPr>
-        <w:t>D.2 Per-Run VQE Statistics</w:t>
-      </w:r>
-    </w:p>
-    <w:p>
-      <w:pPr>
-        <w:spacing w:before="0" w:after="200" w:line="240" w:lineRule="auto"/>
-      </w:pPr>
-      <w:r>
-        <w:rPr>
-          <w:rFonts w:ascii="Times New Roman" w:hAnsi="Times New Roman" w:cs="Times New Roman" w:eastAsia="Times New Roman"/>
-          <w:b w:val="0"/>
-          <w:i w:val="0"/>
-          <w:sz w:val="24"/>
-        </w:rPr>
-        <w:t>Thirty individual seed VQE runs are recorded in vqe_multirun.csv with final energy in Hartree, runtime in seconds, and modelled per-run energy in joules. The first five rows of the CSV are reproduced below for orientation.</w:t>
+        <w:t>classifier_comparison.csv - Section 9.4 source data</w:t>
       </w:r>
     </w:p>
     <w:p>
@@ -14626,7 +13567,7 @@
           <w:i w:val="0"/>
           <w:sz w:val="24"/>
         </w:rPr>
-        <w:t>Run 1: energy = -1.852112 Ha, runtime = 0.005163 s, energy-per-run = 3.9747 J</w:t>
+        <w:t>multirun_stats.csv - 30-seed mean and standard deviation for every method</w:t>
       </w:r>
     </w:p>
     <w:p>
@@ -14641,7 +13582,7 @@
           <w:i w:val="0"/>
           <w:sz w:val="24"/>
         </w:rPr>
-        <w:t>Run 2: energy = -1.863877 Ha, runtime = 0.006602 s, energy-per-run = 4.0007 J</w:t>
+        <w:t>vqe_multirun.csv - Section 10.5 source data</w:t>
       </w:r>
     </w:p>
     <w:p>
@@ -14656,7 +13597,7 @@
           <w:i w:val="0"/>
           <w:sz w:val="24"/>
         </w:rPr>
-        <w:t>Run 3: energy = -1.853641 Ha, runtime = 0.003634 s, energy-per-run = 4.1696 J</w:t>
+        <w:t>cloud_costs.csv - Sections 7.4 and 11.4 source data</w:t>
       </w:r>
     </w:p>
     <w:p>
@@ -14671,249 +13612,7 @@
           <w:i w:val="0"/>
           <w:sz w:val="24"/>
         </w:rPr>
-        <w:t>Run 4: energy = -1.860034 Ha, runtime = 0.002759 s, energy-per-run = 3.7819 J</w:t>
-      </w:r>
-    </w:p>
-    <w:p>
-      <w:pPr>
-        <w:pStyle w:val="ListBullet"/>
-        <w:spacing w:line="360" w:lineRule="auto" w:after="80"/>
-      </w:pPr>
-      <w:r>
-        <w:rPr>
-          <w:rFonts w:ascii="Times New Roman" w:hAnsi="Times New Roman" w:cs="Times New Roman" w:eastAsia="Times New Roman"/>
-          <w:b w:val="0"/>
-          <w:i w:val="0"/>
-          <w:sz w:val="24"/>
-        </w:rPr>
-        <w:t>Run 5: energy = -1.857148 Ha, runtime = 0.000127 s, energy-per-run = 4.2035 J</w:t>
-      </w:r>
-    </w:p>
-    <w:p>
-      <w:pPr>
-        <w:pStyle w:val="ListBullet"/>
-        <w:spacing w:line="360" w:lineRule="auto" w:after="80"/>
-      </w:pPr>
-      <w:r>
-        <w:rPr>
-          <w:rFonts w:ascii="Times New Roman" w:hAnsi="Times New Roman" w:cs="Times New Roman" w:eastAsia="Times New Roman"/>
-          <w:b w:val="0"/>
-          <w:i w:val="0"/>
-          <w:sz w:val="24"/>
-        </w:rPr>
-        <w:t>Source: hybrid_simulation/output/vqe_multirun.csv</w:t>
-      </w:r>
-    </w:p>
-    <w:p>
-      <w:pPr>
-        <w:pStyle w:val="Heading2"/>
-        <w:spacing w:before="80" w:after="40" w:line="240" w:lineRule="auto"/>
-      </w:pPr>
-      <w:r>
-        <w:rPr>
-          <w:rFonts w:ascii="Times New Roman" w:hAnsi="Times New Roman" w:cs="Times New Roman" w:eastAsia="Times New Roman"/>
-          <w:b/>
-          <w:i w:val="0"/>
-          <w:color w:val="141E33"/>
-          <w:sz w:val="24"/>
-        </w:rPr>
-        <w:t>D.3 Cloud Pricing Snapshot (April 2026)</w:t>
-      </w:r>
-    </w:p>
-    <w:p>
-      <w:pPr>
-        <w:spacing w:before="0" w:after="200" w:line="240" w:lineRule="auto"/>
-      </w:pPr>
-      <w:r>
-        <w:rPr>
-          <w:rFonts w:ascii="Times New Roman" w:hAnsi="Times New Roman" w:cs="Times New Roman" w:eastAsia="Times New Roman"/>
-          <w:b w:val="0"/>
-          <w:i w:val="0"/>
-          <w:sz w:val="24"/>
-        </w:rPr>
-        <w:t>The full pricing dictionary used by cloud_costs.py as of April 2026. Each row is a vendor-tier-instance triple together with its on-demand hourly price (CPU and GPU) or per-task price (QPU).</w:t>
-      </w:r>
-    </w:p>
-    <w:p>
-      <w:pPr>
-        <w:pStyle w:val="ListBullet"/>
-        <w:spacing w:line="360" w:lineRule="auto" w:after="80"/>
-      </w:pPr>
-      <w:r>
-        <w:rPr>
-          <w:rFonts w:ascii="Times New Roman" w:hAnsi="Times New Roman" w:cs="Times New Roman" w:eastAsia="Times New Roman"/>
-          <w:b w:val="0"/>
-          <w:i w:val="0"/>
-          <w:sz w:val="24"/>
-        </w:rPr>
-        <w:t>AWS_EC2_c7i.4xlarge | Amazon EC2 c7i.4xlarge | CPU | 16 vCPU, 32 GB RAM | $0.7140 / hour</w:t>
-      </w:r>
-    </w:p>
-    <w:p>
-      <w:pPr>
-        <w:pStyle w:val="ListBullet"/>
-        <w:spacing w:line="360" w:lineRule="auto" w:after="80"/>
-      </w:pPr>
-      <w:r>
-        <w:rPr>
-          <w:rFonts w:ascii="Times New Roman" w:hAnsi="Times New Roman" w:cs="Times New Roman" w:eastAsia="Times New Roman"/>
-          <w:b w:val="0"/>
-          <w:i w:val="0"/>
-          <w:sz w:val="24"/>
-        </w:rPr>
-        <w:t>GCP_n2_standard_16 | GCP n2-standard-16 | CPU | 16 vCPU, 64 GB RAM | $0.7771 / hour</w:t>
-      </w:r>
-    </w:p>
-    <w:p>
-      <w:pPr>
-        <w:pStyle w:val="ListBullet"/>
-        <w:spacing w:line="360" w:lineRule="auto" w:after="80"/>
-      </w:pPr>
-      <w:r>
-        <w:rPr>
-          <w:rFonts w:ascii="Times New Roman" w:hAnsi="Times New Roman" w:cs="Times New Roman" w:eastAsia="Times New Roman"/>
-          <w:b w:val="0"/>
-          <w:i w:val="0"/>
-          <w:sz w:val="24"/>
-        </w:rPr>
-        <w:t>AWS_g5.xlarge | Amazon EC2 g5.xlarge | GPU | 1x NVIDIA A10G | $1.006 / hour</w:t>
-      </w:r>
-    </w:p>
-    <w:p>
-      <w:pPr>
-        <w:pStyle w:val="ListBullet"/>
-        <w:spacing w:line="360" w:lineRule="auto" w:after="80"/>
-      </w:pPr>
-      <w:r>
-        <w:rPr>
-          <w:rFonts w:ascii="Times New Roman" w:hAnsi="Times New Roman" w:cs="Times New Roman" w:eastAsia="Times New Roman"/>
-          <w:b w:val="0"/>
-          <w:i w:val="0"/>
-          <w:sz w:val="24"/>
-        </w:rPr>
-        <w:t>AWS_p5.48xlarge | Amazon EC2 p5.48xlarge | GPU | 8x NVIDIA H100 | $98.32 / hour</w:t>
-      </w:r>
-    </w:p>
-    <w:p>
-      <w:pPr>
-        <w:pStyle w:val="ListBullet"/>
-        <w:spacing w:line="360" w:lineRule="auto" w:after="80"/>
-      </w:pPr>
-      <w:r>
-        <w:rPr>
-          <w:rFonts w:ascii="Times New Roman" w:hAnsi="Times New Roman" w:cs="Times New Roman" w:eastAsia="Times New Roman"/>
-          <w:b w:val="0"/>
-          <w:i w:val="0"/>
-          <w:sz w:val="24"/>
-        </w:rPr>
-        <w:t>IBM_Quantum_Eagle | IBM Quantum Eagle r3 | QPU | 127 qubits, superconducting | $1.60 / second</w:t>
-      </w:r>
-    </w:p>
-    <w:p>
-      <w:pPr>
-        <w:pStyle w:val="ListBullet"/>
-        <w:spacing w:line="360" w:lineRule="auto" w:after="80"/>
-      </w:pPr>
-      <w:r>
-        <w:rPr>
-          <w:rFonts w:ascii="Times New Roman" w:hAnsi="Times New Roman" w:cs="Times New Roman" w:eastAsia="Times New Roman"/>
-          <w:b w:val="0"/>
-          <w:i w:val="0"/>
-          <w:sz w:val="24"/>
-        </w:rPr>
-        <w:t>AWS_Braket_IonQ | AWS Braket IonQ Aria | QPU | 25 qubits, trapped-ion | $0.03 / shot + $0.30 / task</w:t>
-      </w:r>
-    </w:p>
-    <w:p>
-      <w:pPr>
-        <w:pStyle w:val="ListBullet"/>
-        <w:spacing w:line="360" w:lineRule="auto" w:after="80"/>
-      </w:pPr>
-      <w:r>
-        <w:rPr>
-          <w:rFonts w:ascii="Times New Roman" w:hAnsi="Times New Roman" w:cs="Times New Roman" w:eastAsia="Times New Roman"/>
-          <w:b w:val="0"/>
-          <w:i w:val="0"/>
-          <w:sz w:val="24"/>
-        </w:rPr>
-        <w:t>AWS_Braket_Rigetti | AWS Braket Rigetti Ankaa-2 | QPU | 84 qubits, superconducting | $0.00035 / shot + $0.30 / task</w:t>
-      </w:r>
-    </w:p>
-    <w:p>
-      <w:pPr>
-        <w:pStyle w:val="ListBullet"/>
-        <w:spacing w:line="360" w:lineRule="auto" w:after="80"/>
-      </w:pPr>
-      <w:r>
-        <w:rPr>
-          <w:rFonts w:ascii="Times New Roman" w:hAnsi="Times New Roman" w:cs="Times New Roman" w:eastAsia="Times New Roman"/>
-          <w:b w:val="0"/>
-          <w:i w:val="0"/>
-          <w:sz w:val="24"/>
-        </w:rPr>
-        <w:t>Azure_Quantum_Quantinuum | Azure Quantum Quantinuum H2 | QPU | 32 qubits, trapped-ion | $12.50 / HQC</w:t>
-      </w:r>
-    </w:p>
-    <w:p>
-      <w:pPr>
-        <w:pStyle w:val="ListBullet"/>
-        <w:spacing w:line="360" w:lineRule="auto" w:after="80"/>
-      </w:pPr>
-      <w:r>
-        <w:rPr>
-          <w:rFonts w:ascii="Times New Roman" w:hAnsi="Times New Roman" w:cs="Times New Roman" w:eastAsia="Times New Roman"/>
-          <w:b w:val="0"/>
-          <w:i w:val="0"/>
-          <w:sz w:val="24"/>
-        </w:rPr>
-        <w:t>Source: hybrid_simulation/cloud_costs.py (CLOUD_PRICING dict)</w:t>
-      </w:r>
-    </w:p>
-    <w:p>
-      <w:pPr>
-        <w:pStyle w:val="Heading1"/>
-        <w:pageBreakBefore/>
-        <w:spacing w:before="160" w:after="40" w:line="240" w:lineRule="auto"/>
-      </w:pPr>
-      <w:r>
-        <w:rPr>
-          <w:rFonts w:ascii="Times New Roman" w:hAnsi="Times New Roman" w:cs="Times New Roman" w:eastAsia="Times New Roman"/>
-          <w:b/>
-          <w:i w:val="0"/>
-          <w:color w:val="141E33"/>
-          <w:sz w:val="28"/>
-        </w:rPr>
-        <w:t>Appendix E — Open Source Resources, Website, and Live Simulator</w:t>
-      </w:r>
-    </w:p>
-    <w:p>
-      <w:pPr>
-        <w:pStyle w:val="Heading2"/>
-        <w:spacing w:before="80" w:after="40" w:line="240" w:lineRule="auto"/>
-      </w:pPr>
-      <w:r>
-        <w:rPr>
-          <w:rFonts w:ascii="Times New Roman" w:hAnsi="Times New Roman" w:cs="Times New Roman" w:eastAsia="Times New Roman"/>
-          <w:b/>
-          <w:i w:val="0"/>
-          <w:color w:val="141E33"/>
-          <w:sz w:val="24"/>
-        </w:rPr>
-        <w:t>E.1 Public Code Repository</w:t>
-      </w:r>
-    </w:p>
-    <w:p>
-      <w:pPr>
-        <w:spacing w:before="0" w:after="200" w:line="240" w:lineRule="auto"/>
-      </w:pPr>
-      <w:r>
-        <w:rPr>
-          <w:rFonts w:ascii="Times New Roman" w:hAnsi="Times New Roman" w:cs="Times New Roman" w:eastAsia="Times New Roman"/>
-          <w:b w:val="0"/>
-          <w:i w:val="0"/>
-          <w:sz w:val="24"/>
-        </w:rPr>
-        <w:t>All code, data, and figures referenced in this thesis are released under an open-source MIT licence. The repository contains the HERO simulator, the four classical baselines, the VQE workload, the cloud-cost calculator, the allocation rule, the Pareto-selection module, every CSV that produced the tables in Chapters 9 to 11, and every PNG that produced the figures in Chapters 7 to 11.</w:t>
+        <w:t>plots/ - all 15 PNG figures used in this thesis</w:t>
       </w:r>
     </w:p>
     <w:p>
@@ -14929,37 +13628,7 @@
           <w:color w:val="141E33"/>
           <w:sz w:val="22"/>
         </w:rPr>
-        <w:t>Repository URL</w:t>
-      </w:r>
-    </w:p>
-    <w:p>
-      <w:pPr>
-        <w:pStyle w:val="ListBullet"/>
-        <w:spacing w:line="360" w:lineRule="auto" w:after="80"/>
-      </w:pPr>
-      <w:r>
-        <w:rPr>
-          <w:rFonts w:ascii="Times New Roman" w:hAnsi="Times New Roman" w:cs="Times New Roman" w:eastAsia="Times New Roman"/>
-          <w:b w:val="0"/>
-          <w:i w:val="0"/>
-          <w:sz w:val="24"/>
-        </w:rPr>
-        <w:t>https://github.com/Nirmitdagli/quantum-thesis-demo</w:t>
-      </w:r>
-    </w:p>
-    <w:p>
-      <w:pPr>
-        <w:pStyle w:val="ListBullet"/>
-        <w:spacing w:line="360" w:lineRule="auto" w:after="80"/>
-      </w:pPr>
-      <w:r>
-        <w:rPr>
-          <w:rFonts w:ascii="Times New Roman" w:hAnsi="Times New Roman" w:cs="Times New Roman" w:eastAsia="Times New Roman"/>
-          <w:b w:val="0"/>
-          <w:i w:val="0"/>
-          <w:sz w:val="24"/>
-        </w:rPr>
-        <w:t>Branch: main (tagged v1.0 corresponding to this thesis submission).</w:t>
+        <w:t>Citation</w:t>
       </w:r>
     </w:p>
     <w:p>
@@ -14973,754 +13642,155 @@
           <w:i w:val="0"/>
           <w:sz w:val="24"/>
         </w:rPr>
-        <w:t>The repository structure mirrors the local working tree:</w:t>
-      </w:r>
-    </w:p>
-    <w:p>
-      <w:pPr>
-        <w:pStyle w:val="ListBullet"/>
-        <w:spacing w:line="360" w:lineRule="auto" w:after="80"/>
-      </w:pPr>
-      <w:r>
-        <w:rPr>
-          <w:rFonts w:ascii="Times New Roman" w:hAnsi="Times New Roman" w:cs="Times New Roman" w:eastAsia="Times New Roman"/>
-          <w:b w:val="0"/>
-          <w:i w:val="0"/>
-          <w:sz w:val="24"/>
-        </w:rPr>
-        <w:t>hybrid_simulation/  - the HERO simulator and all engine modules</w:t>
-      </w:r>
-    </w:p>
-    <w:p>
-      <w:pPr>
-        <w:pStyle w:val="ListBullet"/>
-        <w:spacing w:line="360" w:lineRule="auto" w:after="80"/>
-      </w:pPr>
-      <w:r>
-        <w:rPr>
-          <w:rFonts w:ascii="Times New Roman" w:hAnsi="Times New Roman" w:cs="Times New Roman" w:eastAsia="Times New Roman"/>
-          <w:b w:val="0"/>
-          <w:i w:val="0"/>
-          <w:sz w:val="24"/>
-        </w:rPr>
-        <w:t>papers/             - IEEE conference paper (HERO-S submission to ISAIA 2026)</w:t>
-      </w:r>
-    </w:p>
-    <w:p>
-      <w:pPr>
-        <w:pStyle w:val="ListBullet"/>
-        <w:spacing w:line="360" w:lineRule="auto" w:after="80"/>
-      </w:pPr>
-      <w:r>
-        <w:rPr>
-          <w:rFonts w:ascii="Times New Roman" w:hAnsi="Times New Roman" w:cs="Times New Roman" w:eastAsia="Times New Roman"/>
-          <w:b w:val="0"/>
-          <w:i w:val="0"/>
-          <w:sz w:val="24"/>
-        </w:rPr>
-        <w:t>thesis/             - this thesis source plus the build script</w:t>
-      </w:r>
-    </w:p>
-    <w:p>
-      <w:pPr>
-        <w:pStyle w:val="ListBullet"/>
-        <w:spacing w:line="360" w:lineRule="auto" w:after="80"/>
-      </w:pPr>
-      <w:r>
-        <w:rPr>
-          <w:rFonts w:ascii="Times New Roman" w:hAnsi="Times New Roman" w:cs="Times New Roman" w:eastAsia="Times New Roman"/>
-          <w:b w:val="0"/>
-          <w:i w:val="0"/>
-          <w:sz w:val="24"/>
-        </w:rPr>
-        <w:t>website/            - static companion website and the live interactive simulator</w:t>
-      </w:r>
-    </w:p>
-    <w:p>
-      <w:pPr>
-        <w:pStyle w:val="ListBullet"/>
-        <w:spacing w:line="360" w:lineRule="auto" w:after="80"/>
-      </w:pPr>
-      <w:r>
-        <w:rPr>
-          <w:rFonts w:ascii="Times New Roman" w:hAnsi="Times New Roman" w:cs="Times New Roman" w:eastAsia="Times New Roman"/>
-          <w:b w:val="0"/>
-          <w:i w:val="0"/>
-          <w:sz w:val="24"/>
-        </w:rPr>
-        <w:t>README.md           - top-level overview and quick-start instructions</w:t>
-      </w:r>
-    </w:p>
-    <w:p>
-      <w:pPr>
-        <w:spacing w:before="0" w:after="200" w:line="240" w:lineRule="auto"/>
-      </w:pPr>
-      <w:r>
-        <w:rPr>
-          <w:rFonts w:ascii="Times New Roman" w:hAnsi="Times New Roman" w:cs="Times New Roman" w:eastAsia="Times New Roman"/>
-          <w:b w:val="0"/>
-          <w:i w:val="0"/>
-          <w:sz w:val="24"/>
-        </w:rPr>
-        <w:t>Issues and pull requests are welcome. The author commits to responding to substantive issues within two weeks for at least the twenty-four months following the thesis submission date.</w:t>
-      </w:r>
-    </w:p>
-    <w:p>
-      <w:pPr>
-        <w:pStyle w:val="Heading2"/>
-        <w:spacing w:before="80" w:after="40" w:line="240" w:lineRule="auto"/>
-      </w:pPr>
-      <w:r>
-        <w:rPr>
-          <w:rFonts w:ascii="Times New Roman" w:hAnsi="Times New Roman" w:cs="Times New Roman" w:eastAsia="Times New Roman"/>
-          <w:b/>
-          <w:i w:val="0"/>
-          <w:color w:val="141E33"/>
-          <w:sz w:val="24"/>
-        </w:rPr>
-        <w:t>E.2 Companion Website</w:t>
-      </w:r>
-    </w:p>
-    <w:p>
-      <w:pPr>
-        <w:spacing w:before="0" w:after="200" w:line="240" w:lineRule="auto"/>
-      </w:pPr>
-      <w:r>
-        <w:rPr>
-          <w:rFonts w:ascii="Times New Roman" w:hAnsi="Times New Roman" w:cs="Times New Roman" w:eastAsia="Times New Roman"/>
-          <w:b w:val="0"/>
-          <w:i w:val="0"/>
-          <w:sz w:val="24"/>
-        </w:rPr>
-        <w:t>A static companion website provides a polished narrative summary of the thesis suitable for non-specialist readers, including thesis-committee members who may want a one-page executive view before reading the full document. The site links to the live simulator (Section E.3) and to the downloadable PDF of this thesis.</w:t>
-      </w:r>
-    </w:p>
-    <w:p>
-      <w:pPr>
-        <w:pStyle w:val="Heading3"/>
-        <w:spacing w:before="80" w:after="40" w:line="240" w:lineRule="auto"/>
-      </w:pPr>
-      <w:r>
-        <w:rPr>
-          <w:rFonts w:ascii="Times New Roman" w:hAnsi="Times New Roman" w:cs="Times New Roman" w:eastAsia="Times New Roman"/>
-          <w:b/>
-          <w:i w:val="0"/>
-          <w:color w:val="141E33"/>
-          <w:sz w:val="22"/>
-        </w:rPr>
-        <w:t>Website URL</w:t>
-      </w:r>
-    </w:p>
-    <w:p>
-      <w:pPr>
-        <w:pStyle w:val="ListBullet"/>
-        <w:spacing w:line="360" w:lineRule="auto" w:after="80"/>
-      </w:pPr>
-      <w:r>
-        <w:rPr>
-          <w:rFonts w:ascii="Times New Roman" w:hAnsi="Times New Roman" w:cs="Times New Roman" w:eastAsia="Times New Roman"/>
-          <w:b w:val="0"/>
-          <w:i w:val="0"/>
-          <w:sz w:val="24"/>
-        </w:rPr>
-        <w:t>https://Nirmitdagli.github.io/quantum-thesis-demo/</w:t>
-      </w:r>
-    </w:p>
-    <w:p>
-      <w:pPr>
-        <w:spacing w:before="0" w:after="200" w:line="240" w:lineRule="auto"/>
-      </w:pPr>
-      <w:r>
-        <w:rPr>
-          <w:rFonts w:ascii="Times New Roman" w:hAnsi="Times New Roman" w:cs="Times New Roman" w:eastAsia="Times New Roman"/>
-          <w:b w:val="0"/>
-          <w:i w:val="0"/>
-          <w:sz w:val="24"/>
-        </w:rPr>
-        <w:t>The website is served from the website/ directory of the code repository via GitHub Pages. It includes:</w:t>
-      </w:r>
-    </w:p>
-    <w:p>
-      <w:pPr>
-        <w:pStyle w:val="ListBullet"/>
-        <w:spacing w:line="360" w:lineRule="auto" w:after="80"/>
-      </w:pPr>
-      <w:r>
-        <w:rPr>
-          <w:rFonts w:ascii="Times New Roman" w:hAnsi="Times New Roman" w:cs="Times New Roman" w:eastAsia="Times New Roman"/>
-          <w:b w:val="0"/>
-          <w:i w:val="0"/>
-          <w:sz w:val="24"/>
-        </w:rPr>
-        <w:t>An animated hero section summarising the research question and the headline finding (classical wins by 13,000x today; molecular VQE wins at scale).</w:t>
-      </w:r>
-    </w:p>
-    <w:p>
-      <w:pPr>
-        <w:pStyle w:val="ListBullet"/>
-        <w:spacing w:line="360" w:lineRule="auto" w:after="80"/>
-      </w:pPr>
-      <w:r>
-        <w:rPr>
-          <w:rFonts w:ascii="Times New Roman" w:hAnsi="Times New Roman" w:cs="Times New Roman" w:eastAsia="Times New Roman"/>
-          <w:b w:val="0"/>
-          <w:i w:val="0"/>
-          <w:sz w:val="24"/>
-        </w:rPr>
-        <w:t>Embedded versions of the key figures from Chapters 9, 10, and 11 with interactive tooltips.</w:t>
-      </w:r>
-    </w:p>
-    <w:p>
-      <w:pPr>
-        <w:pStyle w:val="ListBullet"/>
-        <w:spacing w:line="360" w:lineRule="auto" w:after="80"/>
-      </w:pPr>
-      <w:r>
-        <w:rPr>
-          <w:rFonts w:ascii="Times New Roman" w:hAnsi="Times New Roman" w:cs="Times New Roman" w:eastAsia="Times New Roman"/>
-          <w:b w:val="0"/>
-          <w:i w:val="0"/>
-          <w:sz w:val="24"/>
-        </w:rPr>
-        <w:t>A direct link to the live interactive simulator described in Section E.3.</w:t>
-      </w:r>
-    </w:p>
-    <w:p>
-      <w:pPr>
-        <w:pStyle w:val="ListBullet"/>
-        <w:spacing w:line="360" w:lineRule="auto" w:after="80"/>
-      </w:pPr>
-      <w:r>
-        <w:rPr>
-          <w:rFonts w:ascii="Times New Roman" w:hAnsi="Times New Roman" w:cs="Times New Roman" w:eastAsia="Times New Roman"/>
-          <w:b w:val="0"/>
-          <w:i w:val="0"/>
-          <w:sz w:val="24"/>
-        </w:rPr>
-        <w:t>Full thesis PDF download.</w:t>
-      </w:r>
-    </w:p>
-    <w:p>
-      <w:pPr>
-        <w:pStyle w:val="ListBullet"/>
-        <w:spacing w:line="360" w:lineRule="auto" w:after="80"/>
-      </w:pPr>
-      <w:r>
-        <w:rPr>
-          <w:rFonts w:ascii="Times New Roman" w:hAnsi="Times New Roman" w:cs="Times New Roman" w:eastAsia="Times New Roman"/>
-          <w:b w:val="0"/>
-          <w:i w:val="0"/>
-          <w:sz w:val="24"/>
-        </w:rPr>
-        <w:t>BibTeX citation block for academic citation of the thesis and the conference paper.</w:t>
-      </w:r>
-    </w:p>
-    <w:p>
-      <w:pPr>
-        <w:pStyle w:val="Heading2"/>
-        <w:spacing w:before="80" w:after="40" w:line="240" w:lineRule="auto"/>
-      </w:pPr>
-      <w:r>
-        <w:rPr>
-          <w:rFonts w:ascii="Times New Roman" w:hAnsi="Times New Roman" w:cs="Times New Roman" w:eastAsia="Times New Roman"/>
-          <w:b/>
-          <w:i w:val="0"/>
-          <w:color w:val="141E33"/>
-          <w:sz w:val="24"/>
-        </w:rPr>
-        <w:t>E.3 Live Interactive Simulator</w:t>
-      </w:r>
-    </w:p>
-    <w:p>
-      <w:pPr>
-        <w:spacing w:before="0" w:after="200" w:line="240" w:lineRule="auto"/>
-      </w:pPr>
-      <w:r>
-        <w:rPr>
-          <w:rFonts w:ascii="Times New Roman" w:hAnsi="Times New Roman" w:cs="Times New Roman" w:eastAsia="Times New Roman"/>
-          <w:b w:val="0"/>
-          <w:i w:val="0"/>
-          <w:sz w:val="24"/>
-        </w:rPr>
-        <w:t>The live interactive simulator lets a reader configure a workload (workload type, problem size, feature dimension), see HERO's allocation decision in real time, and inspect the predicted accuracy, latency, energy, and cloud cost across all three tiers. The simulator is implemented as a single-page application that calls a JavaScript port of the allocation_rule.py module so that the recommendations match the Python framework exactly.</w:t>
-      </w:r>
-    </w:p>
-    <w:p>
-      <w:pPr>
-        <w:pStyle w:val="Heading3"/>
-        <w:spacing w:before="80" w:after="40" w:line="240" w:lineRule="auto"/>
-      </w:pPr>
-      <w:r>
-        <w:rPr>
-          <w:rFonts w:ascii="Times New Roman" w:hAnsi="Times New Roman" w:cs="Times New Roman" w:eastAsia="Times New Roman"/>
-          <w:b/>
-          <w:i w:val="0"/>
-          <w:color w:val="141E33"/>
-          <w:sz w:val="22"/>
-        </w:rPr>
-        <w:t>Live Simulator URL</w:t>
-      </w:r>
-    </w:p>
-    <w:p>
-      <w:pPr>
-        <w:pStyle w:val="ListBullet"/>
-        <w:spacing w:line="360" w:lineRule="auto" w:after="80"/>
-      </w:pPr>
-      <w:r>
-        <w:rPr>
-          <w:rFonts w:ascii="Times New Roman" w:hAnsi="Times New Roman" w:cs="Times New Roman" w:eastAsia="Times New Roman"/>
-          <w:b w:val="0"/>
-          <w:i w:val="0"/>
-          <w:sz w:val="24"/>
-        </w:rPr>
-        <w:t>https://Nirmitdagli.github.io/quantum-thesis-demo/simulator.html</w:t>
-      </w:r>
-    </w:p>
-    <w:p>
-      <w:pPr>
-        <w:spacing w:before="0" w:after="200" w:line="240" w:lineRule="auto"/>
-      </w:pPr>
-      <w:r>
-        <w:rPr>
-          <w:rFonts w:ascii="Times New Roman" w:hAnsi="Times New Roman" w:cs="Times New Roman" w:eastAsia="Times New Roman"/>
-          <w:b w:val="0"/>
-          <w:i w:val="0"/>
-          <w:sz w:val="24"/>
-        </w:rPr>
-        <w:t>Use cases for the live simulator:</w:t>
-      </w:r>
-    </w:p>
-    <w:p>
-      <w:pPr>
-        <w:pStyle w:val="ListBullet"/>
-        <w:spacing w:line="360" w:lineRule="auto" w:after="80"/>
-      </w:pPr>
-      <w:r>
-        <w:rPr>
-          <w:rFonts w:ascii="Times New Roman" w:hAnsi="Times New Roman" w:cs="Times New Roman" w:eastAsia="Times New Roman"/>
-          <w:b w:val="0"/>
-          <w:i w:val="0"/>
-          <w:sz w:val="24"/>
-        </w:rPr>
-        <w:t>Defence demonstrations: live answer to committee questions of the form 'what would HERO recommend for a workload with X features?'</w:t>
-      </w:r>
-    </w:p>
-    <w:p>
-      <w:pPr>
-        <w:pStyle w:val="ListBullet"/>
-        <w:spacing w:line="360" w:lineRule="auto" w:after="80"/>
-      </w:pPr>
-      <w:r>
-        <w:rPr>
-          <w:rFonts w:ascii="Times New Roman" w:hAnsi="Times New Roman" w:cs="Times New Roman" w:eastAsia="Times New Roman"/>
-          <w:b w:val="0"/>
-          <w:i w:val="0"/>
-          <w:sz w:val="24"/>
-        </w:rPr>
-        <w:t>Teaching: students can experiment with the allocation thresholds and see the boundary conditions interactively.</w:t>
-      </w:r>
-    </w:p>
-    <w:p>
-      <w:pPr>
-        <w:pStyle w:val="ListBullet"/>
-        <w:spacing w:line="360" w:lineRule="auto" w:after="80"/>
-      </w:pPr>
-      <w:r>
-        <w:rPr>
-          <w:rFonts w:ascii="Times New Roman" w:hAnsi="Times New Roman" w:cs="Times New Roman" w:eastAsia="Times New Roman"/>
-          <w:b w:val="0"/>
-          <w:i w:val="0"/>
-          <w:sz w:val="24"/>
-        </w:rPr>
-        <w:t>Practitioner exploration: cloud architects can test their own workloads against HERO's allocation rule before reading the full thesis.</w:t>
-      </w:r>
-    </w:p>
-    <w:p>
-      <w:pPr>
-        <w:pStyle w:val="Heading2"/>
-        <w:spacing w:before="80" w:after="40" w:line="240" w:lineRule="auto"/>
-      </w:pPr>
-      <w:r>
-        <w:rPr>
-          <w:rFonts w:ascii="Times New Roman" w:hAnsi="Times New Roman" w:cs="Times New Roman" w:eastAsia="Times New Roman"/>
-          <w:b/>
-          <w:i w:val="0"/>
-          <w:color w:val="141E33"/>
-          <w:sz w:val="24"/>
-        </w:rPr>
-        <w:t>E.4 Reproducibility and Citation</w:t>
-      </w:r>
-    </w:p>
-    <w:p>
-      <w:pPr>
-        <w:spacing w:before="0" w:after="200" w:line="240" w:lineRule="auto"/>
-      </w:pPr>
-      <w:r>
-        <w:rPr>
-          <w:rFonts w:ascii="Times New Roman" w:hAnsi="Times New Roman" w:cs="Times New Roman" w:eastAsia="Times New Roman"/>
-          <w:b w:val="0"/>
-          <w:i w:val="0"/>
-          <w:sz w:val="24"/>
-        </w:rPr>
-        <w:t>Anyone can reproduce every number, table, and figure in this thesis with a single command after cloning the repository. The full pipeline takes approximately five to ten minutes on a standard developer laptop and requires no quantum hardware (Qiskit Aer is used as the noiseless QPU backend).</w:t>
-      </w:r>
-    </w:p>
-    <w:p>
-      <w:pPr>
-        <w:pStyle w:val="Heading3"/>
-        <w:spacing w:before="80" w:after="40" w:line="240" w:lineRule="auto"/>
-      </w:pPr>
-      <w:r>
-        <w:rPr>
-          <w:rFonts w:ascii="Times New Roman" w:hAnsi="Times New Roman" w:cs="Times New Roman" w:eastAsia="Times New Roman"/>
-          <w:b/>
-          <w:i w:val="0"/>
-          <w:color w:val="141E33"/>
-          <w:sz w:val="22"/>
-        </w:rPr>
-        <w:t>Reproduction Steps</w:t>
-      </w:r>
-    </w:p>
-    <w:p>
-      <w:pPr>
-        <w:spacing w:before="120" w:after="200" w:line="240" w:lineRule="auto"/>
-        <w:jc w:val="center"/>
-      </w:pPr>
-      <w:r>
-        <w:rPr>
-          <w:rFonts w:ascii="Times New Roman" w:hAnsi="Times New Roman" w:cs="Times New Roman" w:eastAsia="Times New Roman"/>
-          <w:b w:val="0"/>
-          <w:i/>
-          <w:sz w:val="24"/>
-        </w:rPr>
-        <w:t>git clone https://github.com/Nirmitdagli/quantum-thesis-demo.git</w:t>
-      </w:r>
-    </w:p>
-    <w:p>
-      <w:pPr>
-        <w:spacing w:before="120" w:after="200" w:line="240" w:lineRule="auto"/>
-        <w:jc w:val="center"/>
-      </w:pPr>
-      <w:r>
-        <w:rPr>
-          <w:rFonts w:ascii="Times New Roman" w:hAnsi="Times New Roman" w:cs="Times New Roman" w:eastAsia="Times New Roman"/>
-          <w:b w:val="0"/>
-          <w:i/>
-          <w:sz w:val="24"/>
-        </w:rPr>
-        <w:t>cd quantum-thesis-demo</w:t>
-      </w:r>
-    </w:p>
-    <w:p>
-      <w:pPr>
-        <w:spacing w:before="120" w:after="200" w:line="240" w:lineRule="auto"/>
-        <w:jc w:val="center"/>
-      </w:pPr>
-      <w:r>
-        <w:rPr>
-          <w:rFonts w:ascii="Times New Roman" w:hAnsi="Times New Roman" w:cs="Times New Roman" w:eastAsia="Times New Roman"/>
-          <w:b w:val="0"/>
-          <w:i/>
-          <w:sz w:val="24"/>
-        </w:rPr>
-        <w:t>pip install -r requirements.txt</w:t>
-      </w:r>
-    </w:p>
-    <w:p>
-      <w:pPr>
-        <w:spacing w:before="120" w:after="200" w:line="240" w:lineRule="auto"/>
-        <w:jc w:val="center"/>
-      </w:pPr>
-      <w:r>
-        <w:rPr>
-          <w:rFonts w:ascii="Times New Roman" w:hAnsi="Times New Roman" w:cs="Times New Roman" w:eastAsia="Times New Roman"/>
-          <w:b w:val="0"/>
-          <w:i/>
-          <w:sz w:val="24"/>
-        </w:rPr>
-        <w:t>python -m hybrid_simulation.run_hybrid</w:t>
-      </w:r>
-    </w:p>
-    <w:p>
-      <w:pPr>
-        <w:spacing w:before="0" w:after="200" w:line="240" w:lineRule="auto"/>
-      </w:pPr>
-      <w:r>
-        <w:rPr>
-          <w:rFonts w:ascii="Times New Roman" w:hAnsi="Times New Roman" w:cs="Times New Roman" w:eastAsia="Times New Roman"/>
-          <w:b w:val="0"/>
-          <w:i w:val="0"/>
-          <w:sz w:val="24"/>
-        </w:rPr>
-        <w:t>Outputs are written to hybrid_simulation/output/ and include:</w:t>
-      </w:r>
-    </w:p>
-    <w:p>
-      <w:pPr>
-        <w:pStyle w:val="ListBullet"/>
-        <w:spacing w:line="360" w:lineRule="auto" w:after="80"/>
-      </w:pPr>
-      <w:r>
-        <w:rPr>
-          <w:rFonts w:ascii="Times New Roman" w:hAnsi="Times New Roman" w:cs="Times New Roman" w:eastAsia="Times New Roman"/>
-          <w:b w:val="0"/>
-          <w:i w:val="0"/>
-          <w:sz w:val="24"/>
-        </w:rPr>
-        <w:t>hybrid_pipeline_results.csv - per-step pipeline log</w:t>
-      </w:r>
-    </w:p>
-    <w:p>
-      <w:pPr>
-        <w:pStyle w:val="ListBullet"/>
-        <w:spacing w:line="360" w:lineRule="auto" w:after="80"/>
-      </w:pPr>
-      <w:r>
-        <w:rPr>
-          <w:rFonts w:ascii="Times New Roman" w:hAnsi="Times New Roman" w:cs="Times New Roman" w:eastAsia="Times New Roman"/>
-          <w:b w:val="0"/>
-          <w:i w:val="0"/>
-          <w:sz w:val="24"/>
-        </w:rPr>
-        <w:t>classifier_comparison.csv - Section 9.4 source data</w:t>
-      </w:r>
-    </w:p>
-    <w:p>
-      <w:pPr>
-        <w:pStyle w:val="ListBullet"/>
-        <w:spacing w:line="360" w:lineRule="auto" w:after="80"/>
-      </w:pPr>
-      <w:r>
-        <w:rPr>
-          <w:rFonts w:ascii="Times New Roman" w:hAnsi="Times New Roman" w:cs="Times New Roman" w:eastAsia="Times New Roman"/>
-          <w:b w:val="0"/>
-          <w:i w:val="0"/>
-          <w:sz w:val="24"/>
-        </w:rPr>
-        <w:t>multirun_stats.csv - 30-seed mean and standard deviation for every method</w:t>
-      </w:r>
-    </w:p>
-    <w:p>
-      <w:pPr>
-        <w:pStyle w:val="ListBullet"/>
-        <w:spacing w:line="360" w:lineRule="auto" w:after="80"/>
-      </w:pPr>
-      <w:r>
-        <w:rPr>
-          <w:rFonts w:ascii="Times New Roman" w:hAnsi="Times New Roman" w:cs="Times New Roman" w:eastAsia="Times New Roman"/>
-          <w:b w:val="0"/>
-          <w:i w:val="0"/>
-          <w:sz w:val="24"/>
-        </w:rPr>
-        <w:t>vqe_multirun.csv - Section 10.5 source data</w:t>
-      </w:r>
-    </w:p>
-    <w:p>
-      <w:pPr>
-        <w:pStyle w:val="ListBullet"/>
-        <w:spacing w:line="360" w:lineRule="auto" w:after="80"/>
-      </w:pPr>
-      <w:r>
-        <w:rPr>
-          <w:rFonts w:ascii="Times New Roman" w:hAnsi="Times New Roman" w:cs="Times New Roman" w:eastAsia="Times New Roman"/>
-          <w:b w:val="0"/>
-          <w:i w:val="0"/>
-          <w:sz w:val="24"/>
-        </w:rPr>
-        <w:t>cloud_costs.csv - Sections 7.4 and 11.4 source data</w:t>
-      </w:r>
-    </w:p>
-    <w:p>
-      <w:pPr>
-        <w:pStyle w:val="ListBullet"/>
-        <w:spacing w:line="360" w:lineRule="auto" w:after="80"/>
-      </w:pPr>
-      <w:r>
-        <w:rPr>
-          <w:rFonts w:ascii="Times New Roman" w:hAnsi="Times New Roman" w:cs="Times New Roman" w:eastAsia="Times New Roman"/>
-          <w:b w:val="0"/>
-          <w:i w:val="0"/>
-          <w:sz w:val="24"/>
-        </w:rPr>
-        <w:t>plots/ - all 15 PNG figures used in this thesis</w:t>
-      </w:r>
-    </w:p>
-    <w:p>
-      <w:pPr>
-        <w:pStyle w:val="Heading3"/>
-        <w:spacing w:before="80" w:after="40" w:line="240" w:lineRule="auto"/>
-      </w:pPr>
-      <w:r>
-        <w:rPr>
-          <w:rFonts w:ascii="Times New Roman" w:hAnsi="Times New Roman" w:cs="Times New Roman" w:eastAsia="Times New Roman"/>
-          <w:b/>
-          <w:i w:val="0"/>
-          <w:color w:val="141E33"/>
-          <w:sz w:val="22"/>
-        </w:rPr>
-        <w:t>Citation</w:t>
-      </w:r>
-    </w:p>
-    <w:p>
-      <w:pPr>
-        <w:spacing w:before="0" w:after="200" w:line="240" w:lineRule="auto"/>
-      </w:pPr>
-      <w:r>
-        <w:rPr>
-          <w:rFonts w:ascii="Times New Roman" w:hAnsi="Times New Roman" w:cs="Times New Roman" w:eastAsia="Times New Roman"/>
-          <w:b w:val="0"/>
-          <w:i w:val="0"/>
-          <w:sz w:val="24"/>
-        </w:rPr>
         <w:t>If you use HERO in your own work, please cite both the thesis and the companion conference paper:</w:t>
       </w:r>
     </w:p>
     <w:p>
       <w:pPr>
-        <w:spacing w:before="120" w:after="200" w:line="240" w:lineRule="auto"/>
-        <w:jc w:val="center"/>
-      </w:pPr>
-      <w:r>
-        <w:rPr>
-          <w:rFonts w:ascii="Times New Roman" w:hAnsi="Times New Roman" w:cs="Times New Roman" w:eastAsia="Times New Roman"/>
-          <w:b w:val="0"/>
-          <w:i/>
-          <w:sz w:val="24"/>
+        <w:spacing w:before="0" w:after="0" w:line="240" w:lineRule="auto"/>
+        <w:ind w:left="340"/>
+      </w:pPr>
+      <w:r>
+        <w:rPr>
+          <w:rFonts w:ascii="Consolas" w:hAnsi="Consolas" w:cs="Consolas" w:eastAsia="Consolas"/>
+          <w:b w:val="0"/>
+          <w:i w:val="0"/>
+          <w:sz w:val="20"/>
         </w:rPr>
         <w:t>@mastersthesis{dagli2026hero,</w:t>
       </w:r>
     </w:p>
     <w:p>
       <w:pPr>
-        <w:spacing w:before="120" w:after="200" w:line="240" w:lineRule="auto"/>
-        <w:jc w:val="center"/>
-      </w:pPr>
-      <w:r>
-        <w:rPr>
-          <w:rFonts w:ascii="Times New Roman" w:hAnsi="Times New Roman" w:cs="Times New Roman" w:eastAsia="Times New Roman"/>
-          <w:b w:val="0"/>
-          <w:i/>
-          <w:sz w:val="24"/>
+        <w:spacing w:before="0" w:after="0" w:line="240" w:lineRule="auto"/>
+        <w:ind w:left="340"/>
+      </w:pPr>
+      <w:r>
+        <w:rPr>
+          <w:rFonts w:ascii="Consolas" w:hAnsi="Consolas" w:cs="Consolas" w:eastAsia="Consolas"/>
+          <w:b w:val="0"/>
+          <w:i w:val="0"/>
+          <w:sz w:val="20"/>
         </w:rPr>
         <w:t xml:space="preserve">  author  = {Dagli, Nirmit},</w:t>
       </w:r>
     </w:p>
     <w:p>
       <w:pPr>
-        <w:spacing w:before="120" w:after="200" w:line="240" w:lineRule="auto"/>
-        <w:jc w:val="center"/>
-      </w:pPr>
-      <w:r>
-        <w:rPr>
-          <w:rFonts w:ascii="Times New Roman" w:hAnsi="Times New Roman" w:cs="Times New Roman" w:eastAsia="Times New Roman"/>
-          <w:b w:val="0"/>
-          <w:i/>
-          <w:sz w:val="24"/>
+        <w:spacing w:before="0" w:after="0" w:line="240" w:lineRule="auto"/>
+        <w:ind w:left="340"/>
+      </w:pPr>
+      <w:r>
+        <w:rPr>
+          <w:rFonts w:ascii="Consolas" w:hAnsi="Consolas" w:cs="Consolas" w:eastAsia="Consolas"/>
+          <w:b w:val="0"/>
+          <w:i w:val="0"/>
+          <w:sz w:val="20"/>
         </w:rPr>
         <w:t xml:space="preserve">  title   = {Hybrid Quantum-AI Models for Cybersecurity</w:t>
       </w:r>
     </w:p>
     <w:p>
       <w:pPr>
-        <w:spacing w:before="120" w:after="200" w:line="240" w:lineRule="auto"/>
-        <w:jc w:val="center"/>
-      </w:pPr>
-      <w:r>
-        <w:rPr>
-          <w:rFonts w:ascii="Times New Roman" w:hAnsi="Times New Roman" w:cs="Times New Roman" w:eastAsia="Times New Roman"/>
-          <w:b w:val="0"/>
-          <w:i/>
-          <w:sz w:val="24"/>
+        <w:spacing w:before="0" w:after="0" w:line="240" w:lineRule="auto"/>
+        <w:ind w:left="340"/>
+      </w:pPr>
+      <w:r>
+        <w:rPr>
+          <w:rFonts w:ascii="Consolas" w:hAnsi="Consolas" w:cs="Consolas" w:eastAsia="Consolas"/>
+          <w:b w:val="0"/>
+          <w:i w:val="0"/>
+          <w:sz w:val="20"/>
         </w:rPr>
         <w:t xml:space="preserve">             on Cloud Platforms: Accuracy, Latency,</w:t>
       </w:r>
     </w:p>
     <w:p>
       <w:pPr>
-        <w:spacing w:before="120" w:after="200" w:line="240" w:lineRule="auto"/>
-        <w:jc w:val="center"/>
-      </w:pPr>
-      <w:r>
-        <w:rPr>
-          <w:rFonts w:ascii="Times New Roman" w:hAnsi="Times New Roman" w:cs="Times New Roman" w:eastAsia="Times New Roman"/>
-          <w:b w:val="0"/>
-          <w:i/>
-          <w:sz w:val="24"/>
+        <w:spacing w:before="0" w:after="0" w:line="240" w:lineRule="auto"/>
+        <w:ind w:left="340"/>
+      </w:pPr>
+      <w:r>
+        <w:rPr>
+          <w:rFonts w:ascii="Consolas" w:hAnsi="Consolas" w:cs="Consolas" w:eastAsia="Consolas"/>
+          <w:b w:val="0"/>
+          <w:i w:val="0"/>
+          <w:sz w:val="20"/>
         </w:rPr>
         <w:t xml:space="preserve">             and Energy},</w:t>
       </w:r>
     </w:p>
     <w:p>
       <w:pPr>
-        <w:spacing w:before="120" w:after="200" w:line="240" w:lineRule="auto"/>
-        <w:jc w:val="center"/>
-      </w:pPr>
-      <w:r>
-        <w:rPr>
-          <w:rFonts w:ascii="Times New Roman" w:hAnsi="Times New Roman" w:cs="Times New Roman" w:eastAsia="Times New Roman"/>
-          <w:b w:val="0"/>
-          <w:i/>
-          <w:sz w:val="24"/>
+        <w:spacing w:before="0" w:after="0" w:line="240" w:lineRule="auto"/>
+        <w:ind w:left="340"/>
+      </w:pPr>
+      <w:r>
+        <w:rPr>
+          <w:rFonts w:ascii="Consolas" w:hAnsi="Consolas" w:cs="Consolas" w:eastAsia="Consolas"/>
+          <w:b w:val="0"/>
+          <w:i w:val="0"/>
+          <w:sz w:val="20"/>
         </w:rPr>
         <w:t xml:space="preserve">  school  = {Quinnipiac University},</w:t>
       </w:r>
     </w:p>
     <w:p>
       <w:pPr>
-        <w:spacing w:before="120" w:after="200" w:line="240" w:lineRule="auto"/>
-        <w:jc w:val="center"/>
-      </w:pPr>
-      <w:r>
-        <w:rPr>
-          <w:rFonts w:ascii="Times New Roman" w:hAnsi="Times New Roman" w:cs="Times New Roman" w:eastAsia="Times New Roman"/>
-          <w:b w:val="0"/>
-          <w:i/>
-          <w:sz w:val="24"/>
+        <w:spacing w:before="0" w:after="0" w:line="240" w:lineRule="auto"/>
+        <w:ind w:left="340"/>
+      </w:pPr>
+      <w:r>
+        <w:rPr>
+          <w:rFonts w:ascii="Consolas" w:hAnsi="Consolas" w:cs="Consolas" w:eastAsia="Consolas"/>
+          <w:b w:val="0"/>
+          <w:i w:val="0"/>
+          <w:sz w:val="20"/>
         </w:rPr>
         <w:t xml:space="preserve">  year    = {2026},</w:t>
       </w:r>
     </w:p>
     <w:p>
       <w:pPr>
-        <w:spacing w:before="120" w:after="200" w:line="240" w:lineRule="auto"/>
-        <w:jc w:val="center"/>
-      </w:pPr>
-      <w:r>
-        <w:rPr>
-          <w:rFonts w:ascii="Times New Roman" w:hAnsi="Times New Roman" w:cs="Times New Roman" w:eastAsia="Times New Roman"/>
-          <w:b w:val="0"/>
-          <w:i/>
-          <w:sz w:val="24"/>
+        <w:spacing w:before="0" w:after="0" w:line="240" w:lineRule="auto"/>
+        <w:ind w:left="340"/>
+      </w:pPr>
+      <w:r>
+        <w:rPr>
+          <w:rFonts w:ascii="Consolas" w:hAnsi="Consolas" w:cs="Consolas" w:eastAsia="Consolas"/>
+          <w:b w:val="0"/>
+          <w:i w:val="0"/>
+          <w:sz w:val="20"/>
         </w:rPr>
         <w:t xml:space="preserve">  month   = {May},</w:t>
       </w:r>
     </w:p>
     <w:p>
       <w:pPr>
-        <w:spacing w:before="120" w:after="200" w:line="240" w:lineRule="auto"/>
-        <w:jc w:val="center"/>
-      </w:pPr>
-      <w:r>
-        <w:rPr>
-          <w:rFonts w:ascii="Times New Roman" w:hAnsi="Times New Roman" w:cs="Times New Roman" w:eastAsia="Times New Roman"/>
-          <w:b w:val="0"/>
-          <w:i/>
-          <w:sz w:val="24"/>
+        <w:spacing w:before="0" w:after="0" w:line="240" w:lineRule="auto"/>
+        <w:ind w:left="340"/>
+      </w:pPr>
+      <w:r>
+        <w:rPr>
+          <w:rFonts w:ascii="Consolas" w:hAnsi="Consolas" w:cs="Consolas" w:eastAsia="Consolas"/>
+          <w:b w:val="0"/>
+          <w:i w:val="0"/>
+          <w:sz w:val="20"/>
         </w:rPr>
         <w:t xml:space="preserve">  url     = {https://github.com/Nirmitdagli/quantum-thesis-demo}</w:t>
       </w:r>
     </w:p>
     <w:p>
       <w:pPr>
-        <w:spacing w:before="120" w:after="200" w:line="240" w:lineRule="auto"/>
-        <w:jc w:val="center"/>
-      </w:pPr>
-      <w:r>
-        <w:rPr>
-          <w:rFonts w:ascii="Times New Roman" w:hAnsi="Times New Roman" w:cs="Times New Roman" w:eastAsia="Times New Roman"/>
-          <w:b w:val="0"/>
-          <w:i/>
-          <w:sz w:val="24"/>
+        <w:spacing w:before="0" w:after="0" w:line="240" w:lineRule="auto"/>
+        <w:ind w:left="340"/>
+      </w:pPr>
+      <w:r>
+        <w:rPr>
+          <w:rFonts w:ascii="Consolas" w:hAnsi="Consolas" w:cs="Consolas" w:eastAsia="Consolas"/>
+          <w:b w:val="0"/>
+          <w:i w:val="0"/>
+          <w:sz w:val="20"/>
         </w:rPr>
         <w:t>}</w:t>
       </w:r>

</xml_diff>